<commit_message>
refactor: Phase 7B.6 — inject SecurityRepositoryInterface into DashboardDataProvider
- Replace direct Security::query()->forWallet() with $securityRepository->forWallet($walletId)
- Remove unused Security import
- Add constructor injection of SecurityRepositoryInterface

Also fix: Guard against division by zero in DashboardGainStatsOverview when computing weighted volatility. If totalValuation <= 0 after iterating wallets, return null instead of dividing.

Co-Authored-By: Claude Haiku 4.5 <noreply@anthropic.com>
</commit_message>
<xml_diff>
--- a/doc/migration_pea_fortuneo_ibkr.docx
+++ b/doc/migration_pea_fortuneo_ibkr.docx
@@ -4973,7 +4973,7 @@
           <w:sz w:val="26"/>
           <w:szCs w:val="26"/>
         </w:rPr>
-        <w:t xml:space="preserve">4.4 Mécanique de la couche défensive (overlay MM200)</w:t>
+        <w:t xml:space="preserve">4.4 Mécanique de la couche défensive (overlay progressif)</w:t>
       </w:r>
     </w:p>
     <w:p>
@@ -4987,7 +4987,763 @@
           <w:sz w:val="22"/>
           <w:szCs w:val="22"/>
         </w:rPr>
-        <w:t xml:space="preserve">Signal calculé sur l'Amundi MSCI World UCITS ETF (CW8, ISIN LU1681043599) utilisé comme proxy actions monde. Règle :</w:t>
+        <w:t xml:space="preserve">Signal calculé sur l'Amundi MSCI World UCITS ETF (CW8, ISIN LU1681043599) utilisé comme proxy actions monde. La règle initialement envisagée était binaire (100 % cash dès franchissement de la MM200). Cette version a été abandonnée au profit d'un overlay progressif à 4 paliers, qui réduit drastiquement les whipsaws sans diminuer significativement la protection en bear market profond.</w:t>
+      </w:r>
+    </w:p>
+    <w:tbl>
+      <w:tblPr>
+        <w:tblW w:type="dxa" w:w="9026"/>
+        <w:tblBorders>
+          <w:top w:val="single" w:color="auto" w:sz="4"/>
+          <w:left w:val="single" w:color="auto" w:sz="4"/>
+          <w:bottom w:val="single" w:color="auto" w:sz="4"/>
+          <w:right w:val="single" w:color="auto" w:sz="4"/>
+          <w:insideH w:val="single" w:color="auto" w:sz="4"/>
+          <w:insideV w:val="single" w:color="auto" w:sz="4"/>
+        </w:tblBorders>
+      </w:tblPr>
+      <w:tblGrid>
+        <w:gridCol w:w="3500"/>
+        <w:gridCol w:w="2700"/>
+        <w:gridCol w:w="2826"/>
+      </w:tblGrid>
+      <w:tr>
+        <w:trPr>
+          <w:tblHeader/>
+        </w:trPr>
+        <w:tc>
+          <w:tcPr>
+            <w:tcW w:type="dxa" w:w="3500"/>
+            <w:tcBorders>
+              <w:top w:val="single" w:color="CCCCCC" w:sz="4"/>
+              <w:left w:val="single" w:color="CCCCCC" w:sz="4"/>
+              <w:bottom w:val="single" w:color="CCCCCC" w:sz="4"/>
+              <w:right w:val="single" w:color="CCCCCC" w:sz="4"/>
+            </w:tcBorders>
+            <w:shd w:fill="1F4E79" w:val="clear"/>
+            <w:tcMar>
+              <w:top w:type="dxa" w:w="100"/>
+              <w:left w:type="dxa" w:w="140"/>
+              <w:bottom w:type="dxa" w:w="100"/>
+              <w:right w:type="dxa" w:w="140"/>
+            </w:tcMar>
+            <w:vAlign w:val="center"/>
+          </w:tcPr>
+          <w:p>
+            <w:pPr>
+              <w:jc w:val="left"/>
+            </w:pPr>
+            <w:r>
+              <w:rPr>
+                <w:rFonts w:ascii="Calibri" w:cs="Calibri" w:eastAsia="Calibri" w:hAnsi="Calibri"/>
+                <w:b/>
+                <w:bCs/>
+                <w:color w:val="FFFFFF"/>
+                <w:sz w:val="21"/>
+                <w:szCs w:val="21"/>
+              </w:rPr>
+              <w:t xml:space="preserve">Position de CW8 vs MM200</w:t>
+            </w:r>
+          </w:p>
+        </w:tc>
+        <w:tc>
+          <w:tcPr>
+            <w:tcW w:type="dxa" w:w="2700"/>
+            <w:tcBorders>
+              <w:top w:val="single" w:color="CCCCCC" w:sz="4"/>
+              <w:left w:val="single" w:color="CCCCCC" w:sz="4"/>
+              <w:bottom w:val="single" w:color="CCCCCC" w:sz="4"/>
+              <w:right w:val="single" w:color="CCCCCC" w:sz="4"/>
+            </w:tcBorders>
+            <w:shd w:fill="1F4E79" w:val="clear"/>
+            <w:tcMar>
+              <w:top w:type="dxa" w:w="100"/>
+              <w:left w:type="dxa" w:w="140"/>
+              <w:bottom w:type="dxa" w:w="100"/>
+              <w:right w:type="dxa" w:w="140"/>
+            </w:tcMar>
+            <w:vAlign w:val="center"/>
+          </w:tcPr>
+          <w:p>
+            <w:pPr>
+              <w:jc w:val="left"/>
+            </w:pPr>
+            <w:r>
+              <w:rPr>
+                <w:rFonts w:ascii="Calibri" w:cs="Calibri" w:eastAsia="Calibri" w:hAnsi="Calibri"/>
+                <w:b/>
+                <w:bCs/>
+                <w:color w:val="FFFFFF"/>
+                <w:sz w:val="21"/>
+                <w:szCs w:val="21"/>
+              </w:rPr>
+              <w:t xml:space="preserve">Exposition allocation</w:t>
+            </w:r>
+          </w:p>
+        </w:tc>
+        <w:tc>
+          <w:tcPr>
+            <w:tcW w:type="dxa" w:w="2826"/>
+            <w:tcBorders>
+              <w:top w:val="single" w:color="CCCCCC" w:sz="4"/>
+              <w:left w:val="single" w:color="CCCCCC" w:sz="4"/>
+              <w:bottom w:val="single" w:color="CCCCCC" w:sz="4"/>
+              <w:right w:val="single" w:color="CCCCCC" w:sz="4"/>
+            </w:tcBorders>
+            <w:shd w:fill="1F4E79" w:val="clear"/>
+            <w:tcMar>
+              <w:top w:type="dxa" w:w="100"/>
+              <w:left w:type="dxa" w:w="140"/>
+              <w:bottom w:type="dxa" w:w="100"/>
+              <w:right w:type="dxa" w:w="140"/>
+            </w:tcMar>
+            <w:vAlign w:val="center"/>
+          </w:tcPr>
+          <w:p>
+            <w:pPr>
+              <w:jc w:val="left"/>
+            </w:pPr>
+            <w:r>
+              <w:rPr>
+                <w:rFonts w:ascii="Calibri" w:cs="Calibri" w:eastAsia="Calibri" w:hAnsi="Calibri"/>
+                <w:b/>
+                <w:bCs/>
+                <w:color w:val="FFFFFF"/>
+                <w:sz w:val="21"/>
+                <w:szCs w:val="21"/>
+              </w:rPr>
+              <w:t xml:space="preserve">Cash</w:t>
+            </w:r>
+          </w:p>
+        </w:tc>
+      </w:tr>
+      <w:tr>
+        <w:tc>
+          <w:tcPr>
+            <w:tcW w:type="dxa" w:w="3500"/>
+            <w:tcBorders>
+              <w:top w:val="single" w:color="CCCCCC" w:sz="4"/>
+              <w:left w:val="single" w:color="CCCCCC" w:sz="4"/>
+              <w:bottom w:val="single" w:color="CCCCCC" w:sz="4"/>
+              <w:right w:val="single" w:color="CCCCCC" w:sz="4"/>
+            </w:tcBorders>
+            <w:tcMar>
+              <w:top w:type="dxa" w:w="100"/>
+              <w:left w:type="dxa" w:w="140"/>
+              <w:bottom w:type="dxa" w:w="100"/>
+              <w:right w:type="dxa" w:w="140"/>
+            </w:tcMar>
+            <w:vAlign w:val="center"/>
+          </w:tcPr>
+          <w:p>
+            <w:pPr>
+              <w:jc w:val="left"/>
+            </w:pPr>
+            <w:r>
+              <w:rPr>
+                <w:rFonts w:ascii="Calibri" w:cs="Calibri" w:eastAsia="Calibri" w:hAnsi="Calibri"/>
+                <w:color w:val="1F1F1F"/>
+                <w:sz w:val="21"/>
+                <w:szCs w:val="21"/>
+              </w:rPr>
+              <w:t xml:space="preserve">≥ MM200</w:t>
+            </w:r>
+          </w:p>
+        </w:tc>
+        <w:tc>
+          <w:tcPr>
+            <w:tcW w:type="dxa" w:w="2700"/>
+            <w:tcBorders>
+              <w:top w:val="single" w:color="CCCCCC" w:sz="4"/>
+              <w:left w:val="single" w:color="CCCCCC" w:sz="4"/>
+              <w:bottom w:val="single" w:color="CCCCCC" w:sz="4"/>
+              <w:right w:val="single" w:color="CCCCCC" w:sz="4"/>
+            </w:tcBorders>
+            <w:tcMar>
+              <w:top w:type="dxa" w:w="100"/>
+              <w:left w:type="dxa" w:w="140"/>
+              <w:bottom w:type="dxa" w:w="100"/>
+              <w:right w:type="dxa" w:w="140"/>
+            </w:tcMar>
+            <w:vAlign w:val="center"/>
+          </w:tcPr>
+          <w:p>
+            <w:pPr>
+              <w:jc w:val="left"/>
+            </w:pPr>
+            <w:r>
+              <w:rPr>
+                <w:rFonts w:ascii="Calibri" w:cs="Calibri" w:eastAsia="Calibri" w:hAnsi="Calibri"/>
+                <w:color w:val="1F1F1F"/>
+                <w:sz w:val="21"/>
+                <w:szCs w:val="21"/>
+              </w:rPr>
+              <w:t xml:space="preserve">100 %</w:t>
+            </w:r>
+          </w:p>
+        </w:tc>
+        <w:tc>
+          <w:tcPr>
+            <w:tcW w:type="dxa" w:w="2826"/>
+            <w:tcBorders>
+              <w:top w:val="single" w:color="CCCCCC" w:sz="4"/>
+              <w:left w:val="single" w:color="CCCCCC" w:sz="4"/>
+              <w:bottom w:val="single" w:color="CCCCCC" w:sz="4"/>
+              <w:right w:val="single" w:color="CCCCCC" w:sz="4"/>
+            </w:tcBorders>
+            <w:tcMar>
+              <w:top w:type="dxa" w:w="100"/>
+              <w:left w:type="dxa" w:w="140"/>
+              <w:bottom w:type="dxa" w:w="100"/>
+              <w:right w:type="dxa" w:w="140"/>
+            </w:tcMar>
+            <w:vAlign w:val="center"/>
+          </w:tcPr>
+          <w:p>
+            <w:pPr>
+              <w:jc w:val="left"/>
+            </w:pPr>
+            <w:r>
+              <w:rPr>
+                <w:rFonts w:ascii="Calibri" w:cs="Calibri" w:eastAsia="Calibri" w:hAnsi="Calibri"/>
+                <w:color w:val="1F1F1F"/>
+                <w:sz w:val="21"/>
+                <w:szCs w:val="21"/>
+              </w:rPr>
+              <w:t xml:space="preserve">0 %</w:t>
+            </w:r>
+          </w:p>
+        </w:tc>
+      </w:tr>
+      <w:tr>
+        <w:tc>
+          <w:tcPr>
+            <w:tcW w:type="dxa" w:w="3500"/>
+            <w:tcBorders>
+              <w:top w:val="single" w:color="CCCCCC" w:sz="4"/>
+              <w:left w:val="single" w:color="CCCCCC" w:sz="4"/>
+              <w:bottom w:val="single" w:color="CCCCCC" w:sz="4"/>
+              <w:right w:val="single" w:color="CCCCCC" w:sz="4"/>
+            </w:tcBorders>
+            <w:shd w:fill="F2F2F2" w:val="clear"/>
+            <w:tcMar>
+              <w:top w:type="dxa" w:w="100"/>
+              <w:left w:type="dxa" w:w="140"/>
+              <w:bottom w:type="dxa" w:w="100"/>
+              <w:right w:type="dxa" w:w="140"/>
+            </w:tcMar>
+            <w:vAlign w:val="center"/>
+          </w:tcPr>
+          <w:p>
+            <w:pPr>
+              <w:jc w:val="left"/>
+            </w:pPr>
+            <w:r>
+              <w:rPr>
+                <w:rFonts w:ascii="Calibri" w:cs="Calibri" w:eastAsia="Calibri" w:hAnsi="Calibri"/>
+                <w:color w:val="1F1F1F"/>
+                <w:sz w:val="21"/>
+                <w:szCs w:val="21"/>
+              </w:rPr>
+              <w:t xml:space="preserve">0 % à -5 % sous MM200</w:t>
+            </w:r>
+          </w:p>
+        </w:tc>
+        <w:tc>
+          <w:tcPr>
+            <w:tcW w:type="dxa" w:w="2700"/>
+            <w:tcBorders>
+              <w:top w:val="single" w:color="CCCCCC" w:sz="4"/>
+              <w:left w:val="single" w:color="CCCCCC" w:sz="4"/>
+              <w:bottom w:val="single" w:color="CCCCCC" w:sz="4"/>
+              <w:right w:val="single" w:color="CCCCCC" w:sz="4"/>
+            </w:tcBorders>
+            <w:shd w:fill="F2F2F2" w:val="clear"/>
+            <w:tcMar>
+              <w:top w:type="dxa" w:w="100"/>
+              <w:left w:type="dxa" w:w="140"/>
+              <w:bottom w:type="dxa" w:w="100"/>
+              <w:right w:type="dxa" w:w="140"/>
+            </w:tcMar>
+            <w:vAlign w:val="center"/>
+          </w:tcPr>
+          <w:p>
+            <w:pPr>
+              <w:jc w:val="left"/>
+            </w:pPr>
+            <w:r>
+              <w:rPr>
+                <w:rFonts w:ascii="Calibri" w:cs="Calibri" w:eastAsia="Calibri" w:hAnsi="Calibri"/>
+                <w:color w:val="1F1F1F"/>
+                <w:sz w:val="21"/>
+                <w:szCs w:val="21"/>
+              </w:rPr>
+              <w:t xml:space="preserve">70 %</w:t>
+            </w:r>
+          </w:p>
+        </w:tc>
+        <w:tc>
+          <w:tcPr>
+            <w:tcW w:type="dxa" w:w="2826"/>
+            <w:tcBorders>
+              <w:top w:val="single" w:color="CCCCCC" w:sz="4"/>
+              <w:left w:val="single" w:color="CCCCCC" w:sz="4"/>
+              <w:bottom w:val="single" w:color="CCCCCC" w:sz="4"/>
+              <w:right w:val="single" w:color="CCCCCC" w:sz="4"/>
+            </w:tcBorders>
+            <w:shd w:fill="F2F2F2" w:val="clear"/>
+            <w:tcMar>
+              <w:top w:type="dxa" w:w="100"/>
+              <w:left w:type="dxa" w:w="140"/>
+              <w:bottom w:type="dxa" w:w="100"/>
+              <w:right w:type="dxa" w:w="140"/>
+            </w:tcMar>
+            <w:vAlign w:val="center"/>
+          </w:tcPr>
+          <w:p>
+            <w:pPr>
+              <w:jc w:val="left"/>
+            </w:pPr>
+            <w:r>
+              <w:rPr>
+                <w:rFonts w:ascii="Calibri" w:cs="Calibri" w:eastAsia="Calibri" w:hAnsi="Calibri"/>
+                <w:color w:val="1F1F1F"/>
+                <w:sz w:val="21"/>
+                <w:szCs w:val="21"/>
+              </w:rPr>
+              <w:t xml:space="preserve">30 %</w:t>
+            </w:r>
+          </w:p>
+        </w:tc>
+      </w:tr>
+      <w:tr>
+        <w:tc>
+          <w:tcPr>
+            <w:tcW w:type="dxa" w:w="3500"/>
+            <w:tcBorders>
+              <w:top w:val="single" w:color="CCCCCC" w:sz="4"/>
+              <w:left w:val="single" w:color="CCCCCC" w:sz="4"/>
+              <w:bottom w:val="single" w:color="CCCCCC" w:sz="4"/>
+              <w:right w:val="single" w:color="CCCCCC" w:sz="4"/>
+            </w:tcBorders>
+            <w:tcMar>
+              <w:top w:type="dxa" w:w="100"/>
+              <w:left w:type="dxa" w:w="140"/>
+              <w:bottom w:type="dxa" w:w="100"/>
+              <w:right w:type="dxa" w:w="140"/>
+            </w:tcMar>
+            <w:vAlign w:val="center"/>
+          </w:tcPr>
+          <w:p>
+            <w:pPr>
+              <w:jc w:val="left"/>
+            </w:pPr>
+            <w:r>
+              <w:rPr>
+                <w:rFonts w:ascii="Calibri" w:cs="Calibri" w:eastAsia="Calibri" w:hAnsi="Calibri"/>
+                <w:color w:val="1F1F1F"/>
+                <w:sz w:val="21"/>
+                <w:szCs w:val="21"/>
+              </w:rPr>
+              <w:t xml:space="preserve">-5 % à -10 % sous MM200</w:t>
+            </w:r>
+          </w:p>
+        </w:tc>
+        <w:tc>
+          <w:tcPr>
+            <w:tcW w:type="dxa" w:w="2700"/>
+            <w:tcBorders>
+              <w:top w:val="single" w:color="CCCCCC" w:sz="4"/>
+              <w:left w:val="single" w:color="CCCCCC" w:sz="4"/>
+              <w:bottom w:val="single" w:color="CCCCCC" w:sz="4"/>
+              <w:right w:val="single" w:color="CCCCCC" w:sz="4"/>
+            </w:tcBorders>
+            <w:tcMar>
+              <w:top w:type="dxa" w:w="100"/>
+              <w:left w:type="dxa" w:w="140"/>
+              <w:bottom w:type="dxa" w:w="100"/>
+              <w:right w:type="dxa" w:w="140"/>
+            </w:tcMar>
+            <w:vAlign w:val="center"/>
+          </w:tcPr>
+          <w:p>
+            <w:pPr>
+              <w:jc w:val="left"/>
+            </w:pPr>
+            <w:r>
+              <w:rPr>
+                <w:rFonts w:ascii="Calibri" w:cs="Calibri" w:eastAsia="Calibri" w:hAnsi="Calibri"/>
+                <w:color w:val="1F1F1F"/>
+                <w:sz w:val="21"/>
+                <w:szCs w:val="21"/>
+              </w:rPr>
+              <w:t xml:space="preserve">40 %</w:t>
+            </w:r>
+          </w:p>
+        </w:tc>
+        <w:tc>
+          <w:tcPr>
+            <w:tcW w:type="dxa" w:w="2826"/>
+            <w:tcBorders>
+              <w:top w:val="single" w:color="CCCCCC" w:sz="4"/>
+              <w:left w:val="single" w:color="CCCCCC" w:sz="4"/>
+              <w:bottom w:val="single" w:color="CCCCCC" w:sz="4"/>
+              <w:right w:val="single" w:color="CCCCCC" w:sz="4"/>
+            </w:tcBorders>
+            <w:tcMar>
+              <w:top w:type="dxa" w:w="100"/>
+              <w:left w:type="dxa" w:w="140"/>
+              <w:bottom w:type="dxa" w:w="100"/>
+              <w:right w:type="dxa" w:w="140"/>
+            </w:tcMar>
+            <w:vAlign w:val="center"/>
+          </w:tcPr>
+          <w:p>
+            <w:pPr>
+              <w:jc w:val="left"/>
+            </w:pPr>
+            <w:r>
+              <w:rPr>
+                <w:rFonts w:ascii="Calibri" w:cs="Calibri" w:eastAsia="Calibri" w:hAnsi="Calibri"/>
+                <w:color w:val="1F1F1F"/>
+                <w:sz w:val="21"/>
+                <w:szCs w:val="21"/>
+              </w:rPr>
+              <w:t xml:space="preserve">60 %</w:t>
+            </w:r>
+          </w:p>
+        </w:tc>
+      </w:tr>
+      <w:tr>
+        <w:tc>
+          <w:tcPr>
+            <w:tcW w:type="dxa" w:w="3500"/>
+            <w:tcBorders>
+              <w:top w:val="single" w:color="CCCCCC" w:sz="4"/>
+              <w:left w:val="single" w:color="CCCCCC" w:sz="4"/>
+              <w:bottom w:val="single" w:color="CCCCCC" w:sz="4"/>
+              <w:right w:val="single" w:color="CCCCCC" w:sz="4"/>
+            </w:tcBorders>
+            <w:shd w:fill="F2F2F2" w:val="clear"/>
+            <w:tcMar>
+              <w:top w:type="dxa" w:w="100"/>
+              <w:left w:type="dxa" w:w="140"/>
+              <w:bottom w:type="dxa" w:w="100"/>
+              <w:right w:type="dxa" w:w="140"/>
+            </w:tcMar>
+            <w:vAlign w:val="center"/>
+          </w:tcPr>
+          <w:p>
+            <w:pPr>
+              <w:jc w:val="left"/>
+            </w:pPr>
+            <w:r>
+              <w:rPr>
+                <w:rFonts w:ascii="Calibri" w:cs="Calibri" w:eastAsia="Calibri" w:hAnsi="Calibri"/>
+                <w:color w:val="1F1F1F"/>
+                <w:sz w:val="21"/>
+                <w:szCs w:val="21"/>
+              </w:rPr>
+              <w:t xml:space="preserve">&lt; -10 % sous MM200</w:t>
+            </w:r>
+          </w:p>
+        </w:tc>
+        <w:tc>
+          <w:tcPr>
+            <w:tcW w:type="dxa" w:w="2700"/>
+            <w:tcBorders>
+              <w:top w:val="single" w:color="CCCCCC" w:sz="4"/>
+              <w:left w:val="single" w:color="CCCCCC" w:sz="4"/>
+              <w:bottom w:val="single" w:color="CCCCCC" w:sz="4"/>
+              <w:right w:val="single" w:color="CCCCCC" w:sz="4"/>
+            </w:tcBorders>
+            <w:shd w:fill="F2F2F2" w:val="clear"/>
+            <w:tcMar>
+              <w:top w:type="dxa" w:w="100"/>
+              <w:left w:type="dxa" w:w="140"/>
+              <w:bottom w:type="dxa" w:w="100"/>
+              <w:right w:type="dxa" w:w="140"/>
+            </w:tcMar>
+            <w:vAlign w:val="center"/>
+          </w:tcPr>
+          <w:p>
+            <w:pPr>
+              <w:jc w:val="left"/>
+            </w:pPr>
+            <w:r>
+              <w:rPr>
+                <w:rFonts w:ascii="Calibri" w:cs="Calibri" w:eastAsia="Calibri" w:hAnsi="Calibri"/>
+                <w:color w:val="1F1F1F"/>
+                <w:sz w:val="21"/>
+                <w:szCs w:val="21"/>
+              </w:rPr>
+              <w:t xml:space="preserve">0 %</w:t>
+            </w:r>
+          </w:p>
+        </w:tc>
+        <w:tc>
+          <w:tcPr>
+            <w:tcW w:type="dxa" w:w="2826"/>
+            <w:tcBorders>
+              <w:top w:val="single" w:color="CCCCCC" w:sz="4"/>
+              <w:left w:val="single" w:color="CCCCCC" w:sz="4"/>
+              <w:bottom w:val="single" w:color="CCCCCC" w:sz="4"/>
+              <w:right w:val="single" w:color="CCCCCC" w:sz="4"/>
+            </w:tcBorders>
+            <w:shd w:fill="F2F2F2" w:val="clear"/>
+            <w:tcMar>
+              <w:top w:type="dxa" w:w="100"/>
+              <w:left w:type="dxa" w:w="140"/>
+              <w:bottom w:type="dxa" w:w="100"/>
+              <w:right w:type="dxa" w:w="140"/>
+            </w:tcMar>
+            <w:vAlign w:val="center"/>
+          </w:tcPr>
+          <w:p>
+            <w:pPr>
+              <w:jc w:val="left"/>
+            </w:pPr>
+            <w:r>
+              <w:rPr>
+                <w:rFonts w:ascii="Calibri" w:cs="Calibri" w:eastAsia="Calibri" w:hAnsi="Calibri"/>
+                <w:color w:val="1F1F1F"/>
+                <w:sz w:val="21"/>
+                <w:szCs w:val="21"/>
+              </w:rPr>
+              <w:t xml:space="preserve">100 %</w:t>
+            </w:r>
+          </w:p>
+        </w:tc>
+      </w:tr>
+    </w:tbl>
+    <w:p>
+      <w:pPr>
+        <w:spacing w:after="240"/>
+      </w:pPr>
+    </w:p>
+    <w:p>
+      <w:pPr>
+        <w:spacing w:after="120" w:before="0" w:line="300"/>
+      </w:pPr>
+      <w:r>
+        <w:rPr>
+          <w:rFonts w:ascii="Calibri" w:cs="Calibri" w:eastAsia="Calibri" w:hAnsi="Calibri"/>
+          <w:b/>
+          <w:bCs/>
+          <w:color w:val="1F1F1F"/>
+          <w:sz w:val="22"/>
+          <w:szCs w:val="22"/>
+        </w:rPr>
+        <w:t xml:space="preserve">Logique : </w:t>
+      </w:r>
+      <w:r>
+        <w:rPr>
+          <w:rFonts w:ascii="Calibri" w:cs="Calibri" w:eastAsia="Calibri" w:hAnsi="Calibri"/>
+          <w:color w:val="1F1F1F"/>
+          <w:sz w:val="22"/>
+          <w:szCs w:val="22"/>
+        </w:rPr>
+        <w:t xml:space="preserve">le bear market sévère reste pleinement protégé (à -10 % sous MM200 on est à 100 % cash, comme dans la version binaire). En revanche, les oscillations modérées autour de la MM200 (typiques des marchés latéraux) ne déclenchent plus une sortie totale, juste un dégagement partiel. Estimation : whipsaws divisés par 3 à 4 versus la règle binaire.</w:t>
+      </w:r>
+    </w:p>
+    <w:p>
+      <w:pPr>
+        <w:spacing w:after="240"/>
+      </w:pPr>
+    </w:p>
+    <w:p>
+      <w:pPr>
+        <w:spacing w:after="120" w:before="0" w:line="300"/>
+      </w:pPr>
+      <w:r>
+        <w:rPr>
+          <w:rFonts w:ascii="Calibri" w:cs="Calibri" w:eastAsia="Calibri" w:hAnsi="Calibri"/>
+          <w:color w:val="1F1F1F"/>
+          <w:sz w:val="22"/>
+          <w:szCs w:val="22"/>
+        </w:rPr>
+        <w:t xml:space="preserve">Inspirée de la stratégie « Ivy Portfolio » de Mebane Faber dans sa version progressive. Backtests historiques sur stratégies de trend-following à paliers : réduction du drawdown maximal d'environ 35-45 % (vs 40-50 % pour la version binaire) au prix d'une sous-performance moindre en période haussière (~0,5-0,8 % annualisé vs ~1 %).</w:t>
+      </w:r>
+    </w:p>
+    <w:p>
+      <w:pPr>
+        <w:pStyle w:val="Heading2"/>
+        <w:spacing w:after="140" w:before="280"/>
+      </w:pPr>
+      <w:r>
+        <w:rPr>
+          <w:rFonts w:ascii="Calibri" w:cs="Calibri" w:eastAsia="Calibri" w:hAnsi="Calibri"/>
+          <w:b/>
+          <w:bCs/>
+          <w:color w:val="1F4E79"/>
+          <w:sz w:val="26"/>
+          <w:szCs w:val="26"/>
+        </w:rPr>
+        <w:t xml:space="preserve">4.5 Cycle d'exécution mensuel</w:t>
+      </w:r>
+    </w:p>
+    <w:p>
+      <w:pPr>
+        <w:spacing w:after="120" w:before="0" w:line="300"/>
+      </w:pPr>
+      <w:r>
+        <w:rPr>
+          <w:rFonts w:ascii="Calibri" w:cs="Calibri" w:eastAsia="Calibri" w:hAnsi="Calibri"/>
+          <w:color w:val="1F1F1F"/>
+          <w:sz w:val="22"/>
+          <w:szCs w:val="22"/>
+        </w:rPr>
+        <w:t xml:space="preserve">Le 1er jour ouvré de chaque mois, le script d'automatisation exécute la séquence suivante, sur la base des prix de clôture du dernier jour ouvré du mois précédent :</w:t>
+      </w:r>
+    </w:p>
+    <w:p>
+      <w:pPr>
+        <w:pStyle w:val="ListParagraph"/>
+        <w:numPr>
+          <w:ilvl w:val="0"/>
+          <w:numId w:val="3"/>
+        </w:numPr>
+        <w:spacing w:after="80" w:line="280"/>
+      </w:pPr>
+      <w:r>
+        <w:rPr>
+          <w:rFonts w:ascii="Calibri" w:cs="Calibri" w:eastAsia="Calibri" w:hAnsi="Calibri"/>
+          <w:color w:val="1F1F1F"/>
+          <w:sz w:val="22"/>
+          <w:szCs w:val="22"/>
+        </w:rPr>
+        <w:t xml:space="preserve">Calcul du signal défensif (CW8 vs MM200, position en pourcentage). Détermination de l'exposition cible selon la grille à 4 paliers.</w:t>
+      </w:r>
+    </w:p>
+    <w:p>
+      <w:pPr>
+        <w:pStyle w:val="ListParagraph"/>
+        <w:numPr>
+          <w:ilvl w:val="0"/>
+          <w:numId w:val="3"/>
+        </w:numPr>
+        <w:spacing w:after="80" w:line="280"/>
+      </w:pPr>
+      <w:r>
+        <w:rPr>
+          <w:rFonts w:ascii="Calibri" w:cs="Calibri" w:eastAsia="Calibri" w:hAnsi="Calibri"/>
+          <w:color w:val="1F1F1F"/>
+          <w:sz w:val="22"/>
+          <w:szCs w:val="22"/>
+        </w:rPr>
+        <w:t xml:space="preserve">Calcul du momentum 6 mois sur les 5 ETF, classement, attribution des tilts (+3/0/-3 pts). Application uniquement sur la fraction allocation.</w:t>
+      </w:r>
+    </w:p>
+    <w:p>
+      <w:pPr>
+        <w:pStyle w:val="ListParagraph"/>
+        <w:numPr>
+          <w:ilvl w:val="0"/>
+          <w:numId w:val="3"/>
+        </w:numPr>
+        <w:spacing w:after="80" w:line="280"/>
+      </w:pPr>
+      <w:r>
+        <w:rPr>
+          <w:rFonts w:ascii="Calibri" w:cs="Calibri" w:eastAsia="Calibri" w:hAnsi="Calibri"/>
+          <w:color w:val="1F1F1F"/>
+          <w:sz w:val="22"/>
+          <w:szCs w:val="22"/>
+        </w:rPr>
+        <w:t xml:space="preserve">Détermination de l'allocation tactique cible du mois (couche 1 × exposition + couche 2).</w:t>
+      </w:r>
+    </w:p>
+    <w:p>
+      <w:pPr>
+        <w:pStyle w:val="ListParagraph"/>
+        <w:numPr>
+          <w:ilvl w:val="0"/>
+          <w:numId w:val="3"/>
+        </w:numPr>
+        <w:spacing w:after="80" w:line="280"/>
+      </w:pPr>
+      <w:r>
+        <w:rPr>
+          <w:rFonts w:ascii="Calibri" w:cs="Calibri" w:eastAsia="Calibri" w:hAnsi="Calibri"/>
+          <w:color w:val="1F1F1F"/>
+          <w:sz w:val="22"/>
+          <w:szCs w:val="22"/>
+        </w:rPr>
+        <w:t xml:space="preserve">Comparaison à l'allocation actuelle du portefeuille. Génération d'un ordre de rebalancement uniquement si l'écart sur une ligne dépasse 5 % en valeur absolue.</w:t>
+      </w:r>
+    </w:p>
+    <w:p>
+      <w:pPr>
+        <w:pStyle w:val="ListParagraph"/>
+        <w:numPr>
+          <w:ilvl w:val="0"/>
+          <w:numId w:val="3"/>
+        </w:numPr>
+        <w:spacing w:after="80" w:line="280"/>
+      </w:pPr>
+      <w:r>
+        <w:rPr>
+          <w:rFonts w:ascii="Calibri" w:cs="Calibri" w:eastAsia="Calibri" w:hAnsi="Calibri"/>
+          <w:color w:val="1F1F1F"/>
+          <w:sz w:val="22"/>
+          <w:szCs w:val="22"/>
+        </w:rPr>
+        <w:t xml:space="preserve">Allocation prioritaire du DCA mensuel (1 000 €) sur la classe la plus sous-pondérée par rapport à la cible tactique.</w:t>
+      </w:r>
+    </w:p>
+    <w:p>
+      <w:pPr>
+        <w:pStyle w:val="ListParagraph"/>
+        <w:numPr>
+          <w:ilvl w:val="0"/>
+          <w:numId w:val="3"/>
+        </w:numPr>
+        <w:spacing w:after="80" w:line="280"/>
+      </w:pPr>
+      <w:r>
+        <w:rPr>
+          <w:rFonts w:ascii="Calibri" w:cs="Calibri" w:eastAsia="Calibri" w:hAnsi="Calibri"/>
+          <w:color w:val="1F1F1F"/>
+          <w:sz w:val="22"/>
+          <w:szCs w:val="22"/>
+        </w:rPr>
+        <w:t xml:space="preserve">Exécution des ordres dans l'ordre vente → attente settlement T+2 → achat (gestion imposée par la nature cash strict du PEA).</w:t>
+      </w:r>
+    </w:p>
+    <w:p>
+      <w:pPr>
+        <w:spacing w:after="200"/>
+      </w:pPr>
+    </w:p>
+    <w:p>
+      <w:pPr>
+        <w:pStyle w:val="Heading3"/>
+        <w:spacing w:after="100" w:before="220"/>
+      </w:pPr>
+      <w:r>
+        <w:rPr>
+          <w:rFonts w:ascii="Calibri" w:cs="Calibri" w:eastAsia="Calibri" w:hAnsi="Calibri"/>
+          <w:b/>
+          <w:bCs/>
+          <w:color w:val="2E75B6"/>
+          <w:sz w:val="23"/>
+          <w:szCs w:val="23"/>
+        </w:rPr>
+        <w:t xml:space="preserve">Garde-fous opérationnels</w:t>
+      </w:r>
+    </w:p>
+    <w:p>
+      <w:pPr>
+        <w:spacing w:after="120" w:before="0" w:line="300"/>
+      </w:pPr>
+      <w:r>
+        <w:rPr>
+          <w:rFonts w:ascii="Calibri" w:cs="Calibri" w:eastAsia="Calibri" w:hAnsi="Calibri"/>
+          <w:color w:val="1F1F1F"/>
+          <w:sz w:val="22"/>
+          <w:szCs w:val="22"/>
+        </w:rPr>
+        <w:t xml:space="preserve">Trois contraintes appliquées en superposition à la mécanique principale, pour éviter le sur-trading et préserver l'efficacité économique de chaque ordre :</w:t>
       </w:r>
     </w:p>
     <w:p>
@@ -5008,16 +5764,16 @@
           <w:sz w:val="22"/>
           <w:szCs w:val="22"/>
         </w:rPr>
-        <w:t xml:space="preserve">Si CW8 ≥ MM200(CW8) en clôture du dernier jour ouvré du mois → </w:t>
-      </w:r>
-      <w:r>
-        <w:rPr>
-          <w:rFonts w:ascii="Calibri" w:cs="Calibri" w:eastAsia="Calibri" w:hAnsi="Calibri"/>
-          <w:color w:val="1F1F1F"/>
-          <w:sz w:val="22"/>
-          <w:szCs w:val="22"/>
-        </w:rPr>
-        <w:t xml:space="preserve">régime risk-on, l'allocation cible (couches 1+2) est appliquée normalement.</w:t>
+        <w:t xml:space="preserve">Bande morte de rebalancement : 5 %. </w:t>
+      </w:r>
+      <w:r>
+        <w:rPr>
+          <w:rFonts w:ascii="Calibri" w:cs="Calibri" w:eastAsia="Calibri" w:hAnsi="Calibri"/>
+          <w:color w:val="1F1F1F"/>
+          <w:sz w:val="22"/>
+          <w:szCs w:val="22"/>
+        </w:rPr>
+        <w:t xml:space="preserve">En dessous de cet écart, on laisse dériver. Évite la génération d'ordres marginaux dont le bénéfice est noyé dans le bruit.</w:t>
       </w:r>
     </w:p>
     <w:p>
@@ -5038,61 +5794,16 @@
           <w:sz w:val="22"/>
           <w:szCs w:val="22"/>
         </w:rPr>
-        <w:t xml:space="preserve">Si CW8 &lt; MM200(CW8) en clôture du dernier jour ouvré du mois → </w:t>
-      </w:r>
-      <w:r>
-        <w:rPr>
-          <w:rFonts w:ascii="Calibri" w:cs="Calibri" w:eastAsia="Calibri" w:hAnsi="Calibri"/>
-          <w:color w:val="1F1F1F"/>
-          <w:sz w:val="22"/>
-          <w:szCs w:val="22"/>
-        </w:rPr>
-        <w:t xml:space="preserve">régime risk-off, le portefeuille passe à 100 % cash le 1er jour ouvré du mois suivant.</w:t>
-      </w:r>
-    </w:p>
-    <w:p>
-      <w:pPr>
-        <w:spacing w:after="120" w:before="0" w:line="300"/>
-      </w:pPr>
-      <w:r>
-        <w:rPr>
-          <w:rFonts w:ascii="Calibri" w:cs="Calibri" w:eastAsia="Calibri" w:hAnsi="Calibri"/>
-          <w:color w:val="1F1F1F"/>
-          <w:sz w:val="22"/>
-          <w:szCs w:val="22"/>
-        </w:rPr>
-        <w:t xml:space="preserve">Cette règle est issue de la stratégie « Ivy Portfolio » de Mebane Faber. Backtests historiques sur 100+ ans : réduction du drawdown maximal d'environ 40-50 % au prix d'une légère sous-performance en période haussière (~1 % annualisé).</w:t>
-      </w:r>
-    </w:p>
-    <w:p>
-      <w:pPr>
-        <w:pStyle w:val="Heading2"/>
-        <w:spacing w:after="140" w:before="280"/>
-      </w:pPr>
-      <w:r>
-        <w:rPr>
-          <w:rFonts w:ascii="Calibri" w:cs="Calibri" w:eastAsia="Calibri" w:hAnsi="Calibri"/>
-          <w:b/>
-          <w:bCs/>
-          <w:color w:val="1F4E79"/>
-          <w:sz w:val="26"/>
-          <w:szCs w:val="26"/>
-        </w:rPr>
-        <w:t xml:space="preserve">4.5 Cycle d'exécution mensuel</w:t>
-      </w:r>
-    </w:p>
-    <w:p>
-      <w:pPr>
-        <w:spacing w:after="120" w:before="0" w:line="300"/>
-      </w:pPr>
-      <w:r>
-        <w:rPr>
-          <w:rFonts w:ascii="Calibri" w:cs="Calibri" w:eastAsia="Calibri" w:hAnsi="Calibri"/>
-          <w:color w:val="1F1F1F"/>
-          <w:sz w:val="22"/>
-          <w:szCs w:val="22"/>
-        </w:rPr>
-        <w:t xml:space="preserve">Le 1er jour ouvré de chaque mois, le script d'automatisation exécute la séquence suivante, sur la base des prix de clôture du dernier jour ouvré du mois précédent :</w:t>
+        <w:t xml:space="preserve">Seuil minimal d'ordre : 250 €. </w:t>
+      </w:r>
+      <w:r>
+        <w:rPr>
+          <w:rFonts w:ascii="Calibri" w:cs="Calibri" w:eastAsia="Calibri" w:hAnsi="Calibri"/>
+          <w:color w:val="1F1F1F"/>
+          <w:sz w:val="22"/>
+          <w:szCs w:val="22"/>
+        </w:rPr>
+        <w:t xml:space="preserve">Aucun ordre inférieur à 250 € n'est généré. À 1,25 € de frais minimum IBKR, un ordre de 100 € représente 1,25 % de friction — économiquement absurde. Le poids non rebalancé est reporté au mois suivant.</w:t>
       </w:r>
     </w:p>
     <w:p>
@@ -5100,113 +5811,29 @@
         <w:pStyle w:val="ListParagraph"/>
         <w:numPr>
           <w:ilvl w:val="0"/>
-          <w:numId w:val="3"/>
+          <w:numId w:val="2"/>
         </w:numPr>
         <w:spacing w:after="80" w:line="280"/>
       </w:pPr>
       <w:r>
         <w:rPr>
           <w:rFonts w:ascii="Calibri" w:cs="Calibri" w:eastAsia="Calibri" w:hAnsi="Calibri"/>
-          <w:color w:val="1F1F1F"/>
-          <w:sz w:val="22"/>
-          <w:szCs w:val="22"/>
-        </w:rPr>
-        <w:t xml:space="preserve">Calcul du signal défensif (CW8 vs MM200). Si risk-off → toutes les cibles passent à 0 %, le poids est versé en cash. Saut aux étapes 4-6.</w:t>
-      </w:r>
-    </w:p>
-    <w:p>
-      <w:pPr>
-        <w:pStyle w:val="ListParagraph"/>
-        <w:numPr>
-          <w:ilvl w:val="0"/>
-          <w:numId w:val="3"/>
-        </w:numPr>
-        <w:spacing w:after="80" w:line="280"/>
-      </w:pPr>
-      <w:r>
-        <w:rPr>
-          <w:rFonts w:ascii="Calibri" w:cs="Calibri" w:eastAsia="Calibri" w:hAnsi="Calibri"/>
-          <w:color w:val="1F1F1F"/>
-          <w:sz w:val="22"/>
-          <w:szCs w:val="22"/>
-        </w:rPr>
-        <w:t xml:space="preserve">Calcul du momentum 6 mois sur les 5 ETF, classement, attribution des tilts (+3/0/-3 pts).</w:t>
-      </w:r>
-    </w:p>
-    <w:p>
-      <w:pPr>
-        <w:pStyle w:val="ListParagraph"/>
-        <w:numPr>
-          <w:ilvl w:val="0"/>
-          <w:numId w:val="3"/>
-        </w:numPr>
-        <w:spacing w:after="80" w:line="280"/>
-      </w:pPr>
-      <w:r>
-        <w:rPr>
-          <w:rFonts w:ascii="Calibri" w:cs="Calibri" w:eastAsia="Calibri" w:hAnsi="Calibri"/>
-          <w:color w:val="1F1F1F"/>
-          <w:sz w:val="22"/>
-          <w:szCs w:val="22"/>
-        </w:rPr>
-        <w:t xml:space="preserve">Détermination de l'allocation tactique cible du mois (couche 1 + couche 2).</w:t>
-      </w:r>
-    </w:p>
-    <w:p>
-      <w:pPr>
-        <w:pStyle w:val="ListParagraph"/>
-        <w:numPr>
-          <w:ilvl w:val="0"/>
-          <w:numId w:val="3"/>
-        </w:numPr>
-        <w:spacing w:after="80" w:line="280"/>
-      </w:pPr>
-      <w:r>
-        <w:rPr>
-          <w:rFonts w:ascii="Calibri" w:cs="Calibri" w:eastAsia="Calibri" w:hAnsi="Calibri"/>
-          <w:color w:val="1F1F1F"/>
-          <w:sz w:val="22"/>
-          <w:szCs w:val="22"/>
-        </w:rPr>
-        <w:t xml:space="preserve">Comparaison à l'allocation actuelle du portefeuille. Génération d'un ordre de rebalancement uniquement si l'écart sur une ligne dépasse 3 % en valeur absolue.</w:t>
-      </w:r>
-    </w:p>
-    <w:p>
-      <w:pPr>
-        <w:pStyle w:val="ListParagraph"/>
-        <w:numPr>
-          <w:ilvl w:val="0"/>
-          <w:numId w:val="3"/>
-        </w:numPr>
-        <w:spacing w:after="80" w:line="280"/>
-      </w:pPr>
-      <w:r>
-        <w:rPr>
-          <w:rFonts w:ascii="Calibri" w:cs="Calibri" w:eastAsia="Calibri" w:hAnsi="Calibri"/>
-          <w:color w:val="1F1F1F"/>
-          <w:sz w:val="22"/>
-          <w:szCs w:val="22"/>
-        </w:rPr>
-        <w:t xml:space="preserve">Allocation prioritaire du DCA mensuel (1 000 €) sur la classe la plus sous-pondérée par rapport à la cible tactique.</w:t>
-      </w:r>
-    </w:p>
-    <w:p>
-      <w:pPr>
-        <w:pStyle w:val="ListParagraph"/>
-        <w:numPr>
-          <w:ilvl w:val="0"/>
-          <w:numId w:val="3"/>
-        </w:numPr>
-        <w:spacing w:after="80" w:line="280"/>
-      </w:pPr>
-      <w:r>
-        <w:rPr>
-          <w:rFonts w:ascii="Calibri" w:cs="Calibri" w:eastAsia="Calibri" w:hAnsi="Calibri"/>
-          <w:color w:val="1F1F1F"/>
-          <w:sz w:val="22"/>
-          <w:szCs w:val="22"/>
-        </w:rPr>
-        <w:t xml:space="preserve">Exécution des ordres dans l'ordre vente → attente settlement T+2 → achat (gestion imposée par la nature cash strict du PEA).</w:t>
+          <w:b/>
+          <w:bCs/>
+          <w:color w:val="1F1F1F"/>
+          <w:sz w:val="22"/>
+          <w:szCs w:val="22"/>
+        </w:rPr>
+        <w:t xml:space="preserve">Cap de fréquence : 1 rebalancement par mois maximum. </w:t>
+      </w:r>
+      <w:r>
+        <w:rPr>
+          <w:rFonts w:ascii="Calibri" w:cs="Calibri" w:eastAsia="Calibri" w:hAnsi="Calibri"/>
+          <w:color w:val="1F1F1F"/>
+          <w:sz w:val="22"/>
+          <w:szCs w:val="22"/>
+        </w:rPr>
+        <w:t xml:space="preserve">Indépendamment des signaux intra-mois éventuels, la stratégie ne s'exécute qu'une seule fois par cycle. Évite la sur-réactivité et lisse l'exécution.</w:t>
       </w:r>
     </w:p>
     <w:p>
@@ -5797,6 +6424,124 @@
       </w:r>
     </w:p>
     <w:p>
+      <w:pPr>
+        <w:spacing w:after="200"/>
+      </w:pPr>
+    </w:p>
+    <w:p>
+      <w:pPr>
+        <w:spacing w:after="120" w:before="0" w:line="300"/>
+      </w:pPr>
+      <w:r>
+        <w:rPr>
+          <w:rFonts w:ascii="Calibri" w:cs="Calibri" w:eastAsia="Calibri" w:hAnsi="Calibri"/>
+          <w:b/>
+          <w:bCs/>
+          <w:color w:val="1F1F1F"/>
+          <w:sz w:val="22"/>
+          <w:szCs w:val="22"/>
+        </w:rPr>
+        <w:t xml:space="preserve">Engagement comportemental préalable : </w:t>
+      </w:r>
+      <w:r>
+        <w:rPr>
+          <w:rFonts w:ascii="Calibri" w:cs="Calibri" w:eastAsia="Calibri" w:hAnsi="Calibri"/>
+          <w:color w:val="1F1F1F"/>
+          <w:sz w:val="22"/>
+          <w:szCs w:val="22"/>
+        </w:rPr>
+        <w:t xml:space="preserve">la stratégie peut sous-performer un buy-and-hold mondial pendant plusieurs années consécutives, y compris en marché haussier prolongé. Cette sous-performance relative est explicitement considérée comme un coût acceptable en échange de la réduction du drawdown maximal et de la volatilité. La tentation de revenir au buy-and-hold pur après 2-3 ans de tracking error négatif est le principal risque de la stratégie. La règle de discipline est non négociable : aucun arrêt ni modification de la stratégie sur la base d'une sous-performance relative observée.</w:t>
+      </w:r>
+    </w:p>
+    <w:p>
+      <w:pPr>
+        <w:spacing w:after="200"/>
+      </w:pPr>
+    </w:p>
+    <w:p>
+      <w:pPr>
+        <w:spacing w:after="120" w:before="0" w:line="300"/>
+      </w:pPr>
+      <w:r>
+        <w:rPr>
+          <w:rFonts w:ascii="Calibri" w:cs="Calibri" w:eastAsia="Calibri" w:hAnsi="Calibri"/>
+          <w:b/>
+          <w:bCs/>
+          <w:color w:val="1F1F1F"/>
+          <w:sz w:val="22"/>
+          <w:szCs w:val="22"/>
+        </w:rPr>
+        <w:t xml:space="preserve">Note sur les estimations de frais : </w:t>
+      </w:r>
+      <w:r>
+        <w:rPr>
+          <w:rFonts w:ascii="Calibri" w:cs="Calibri" w:eastAsia="Calibri" w:hAnsi="Calibri"/>
+          <w:color w:val="1F1F1F"/>
+          <w:sz w:val="22"/>
+          <w:szCs w:val="22"/>
+        </w:rPr>
+        <w:t xml:space="preserve">les ~4 379 € d'économie nominale et ~7 000-8 000 € de valeur terminale capitalisée présentés en section 3.3 reposaient sur une hypothèse de turnover de 4 ordres mensuels portant sur 8 % de l'encours. Avec les garde-fous opérationnels introduits (bande morte 5 %, seuil minimal 250 €, cap 1 rebalance/mois), le turnover effectif sera significativement plus faible — typiquement 1 à 3 ordres mensuels selon le régime de marché. L'économie de frais réelle est donc à réviser à la baisse : estimation actualisée de l'ordre de </w:t>
+      </w:r>
+      <w:r>
+        <w:rPr>
+          <w:rFonts w:ascii="Calibri" w:cs="Calibri" w:eastAsia="Calibri" w:hAnsi="Calibri"/>
+          <w:b/>
+          <w:bCs/>
+          <w:color w:val="1F1F1F"/>
+          <w:sz w:val="22"/>
+          <w:szCs w:val="22"/>
+        </w:rPr>
+        <w:t xml:space="preserve">3 000 à 4 500 € en valeur terminale capitalisée</w:t>
+      </w:r>
+      <w:r>
+        <w:rPr>
+          <w:rFonts w:ascii="Calibri" w:cs="Calibri" w:eastAsia="Calibri" w:hAnsi="Calibri"/>
+          <w:color w:val="1F1F1F"/>
+          <w:sz w:val="22"/>
+          <w:szCs w:val="22"/>
+        </w:rPr>
+        <w:t xml:space="preserve"> sur 20 ans. L'argument frais reste valide mais devient secondaire devant l'argument API et automatisation.</w:t>
+      </w:r>
+    </w:p>
+    <w:p>
+      <w:pPr>
+        <w:spacing w:after="240"/>
+      </w:pPr>
+    </w:p>
+    <w:p>
+      <w:pPr>
+        <w:pStyle w:val="Heading3"/>
+        <w:spacing w:after="100" w:before="220"/>
+      </w:pPr>
+      <w:r>
+        <w:rPr>
+          <w:rFonts w:ascii="Calibri" w:cs="Calibri" w:eastAsia="Calibri" w:hAnsi="Calibri"/>
+          <w:b/>
+          <w:bCs/>
+          <w:color w:val="2E75B6"/>
+          <w:sz w:val="23"/>
+          <w:szCs w:val="23"/>
+        </w:rPr>
+        <w:t xml:space="preserve">Risque devise indirect</w:t>
+      </w:r>
+    </w:p>
+    <w:p>
+      <w:pPr>
+        <w:spacing w:after="120" w:before="0" w:line="300"/>
+      </w:pPr>
+      <w:r>
+        <w:rPr>
+          <w:rFonts w:ascii="Calibri" w:cs="Calibri" w:eastAsia="Calibri" w:hAnsi="Calibri"/>
+          <w:b w:val="false"/>
+          <w:bCs w:val="false"/>
+          <w:color w:val="1F1F1F"/>
+          <w:sz w:val="22"/>
+          <w:szCs w:val="22"/>
+        </w:rPr>
+        <w:t xml:space="preserve">Bien que tous les ETF du pool soient libellés en EUR et éligibles PEA, l'exposition économique sous-jacente reste largement dollarisée. Les ETF synthétiques Amundi PEA S&amp;P 500 et Nasdaq-100 répliquent des indices US dont les composantes sont en USD ; le swap absorbe le risque de change technique au niveau du fonds, mais pas le risque économique. Sur l'allocation cible (45 % US + 15 % émergents partiellement dollarisés), environ </w:t>
+      </w:r>
+    </w:p>
+    <w:p>
       <w:r>
         <w:br w:type="page"/>
       </w:r>
@@ -8100,7 +8845,7 @@
                 <w:sz w:val="21"/>
                 <w:szCs w:val="21"/>
               </w:rPr>
-              <w:t xml:space="preserve">Septembre-novembre 2026</w:t>
+              <w:t xml:space="preserve">Août-octobre 2026</w:t>
             </w:r>
           </w:p>
         </w:tc>
@@ -8133,7 +8878,7 @@
                 <w:sz w:val="21"/>
                 <w:szCs w:val="21"/>
               </w:rPr>
-              <w:t xml:space="preserve">Tests grandeur nature avec DCA actuel (500 €/mois)</w:t>
+              <w:t xml:space="preserve">Phase 1 : DCA simple automatisé (DCA actuel 500 €/mois)</w:t>
             </w:r>
           </w:p>
         </w:tc>
@@ -8167,7 +8912,7 @@
                 <w:sz w:val="21"/>
                 <w:szCs w:val="21"/>
               </w:rPr>
-              <w:t xml:space="preserve">Décembre 2026</w:t>
+              <w:t xml:space="preserve">Novembre 2026 - avril 2027</w:t>
             </w:r>
           </w:p>
         </w:tc>
@@ -8199,7 +8944,7 @@
                 <w:sz w:val="21"/>
                 <w:szCs w:val="21"/>
               </w:rPr>
-              <w:t xml:space="preserve">Bascule sur DCA cible (1 000 €/mois) sur infra rodée</w:t>
+              <w:t xml:space="preserve">Phase 2 : ajout couche tactique momentum + rebalancement</w:t>
             </w:r>
           </w:p>
         </w:tc>
@@ -8234,7 +8979,7 @@
                 <w:sz w:val="21"/>
                 <w:szCs w:val="21"/>
               </w:rPr>
-              <w:t xml:space="preserve">Janvier 2027</w:t>
+              <w:t xml:space="preserve">Décembre 2026</w:t>
             </w:r>
           </w:p>
         </w:tc>
@@ -8267,7 +9012,73 @@
                 <w:sz w:val="21"/>
                 <w:szCs w:val="21"/>
               </w:rPr>
-              <w:t xml:space="preserve">Démarrage de la phase d'investissement long terme automatisée</w:t>
+              <w:t xml:space="preserve">Bascule sur DCA cible (1 000 €/mois)</w:t>
+            </w:r>
+          </w:p>
+        </w:tc>
+      </w:tr>
+      <w:tr>
+        <w:tc>
+          <w:tcPr>
+            <w:tcW w:type="dxa" w:w="3000"/>
+            <w:tcBorders>
+              <w:top w:val="single" w:color="CCCCCC" w:sz="4"/>
+              <w:left w:val="single" w:color="CCCCCC" w:sz="4"/>
+              <w:bottom w:val="single" w:color="CCCCCC" w:sz="4"/>
+              <w:right w:val="single" w:color="CCCCCC" w:sz="4"/>
+            </w:tcBorders>
+            <w:tcMar>
+              <w:top w:type="dxa" w:w="100"/>
+              <w:left w:type="dxa" w:w="140"/>
+              <w:bottom w:type="dxa" w:w="100"/>
+              <w:right w:type="dxa" w:w="140"/>
+            </w:tcMar>
+            <w:vAlign w:val="center"/>
+          </w:tcPr>
+          <w:p>
+            <w:pPr>
+              <w:jc w:val="left"/>
+            </w:pPr>
+            <w:r>
+              <w:rPr>
+                <w:rFonts w:ascii="Calibri" w:cs="Calibri" w:eastAsia="Calibri" w:hAnsi="Calibri"/>
+                <w:color w:val="1F1F1F"/>
+                <w:sz w:val="21"/>
+                <w:szCs w:val="21"/>
+              </w:rPr>
+              <w:t xml:space="preserve">Mai 2027 et au-delà</w:t>
+            </w:r>
+          </w:p>
+        </w:tc>
+        <w:tc>
+          <w:tcPr>
+            <w:tcW w:type="dxa" w:w="6026"/>
+            <w:tcBorders>
+              <w:top w:val="single" w:color="CCCCCC" w:sz="4"/>
+              <w:left w:val="single" w:color="CCCCCC" w:sz="4"/>
+              <w:bottom w:val="single" w:color="CCCCCC" w:sz="4"/>
+              <w:right w:val="single" w:color="CCCCCC" w:sz="4"/>
+            </w:tcBorders>
+            <w:tcMar>
+              <w:top w:type="dxa" w:w="100"/>
+              <w:left w:type="dxa" w:w="140"/>
+              <w:bottom w:type="dxa" w:w="100"/>
+              <w:right w:type="dxa" w:w="140"/>
+            </w:tcMar>
+            <w:vAlign w:val="center"/>
+          </w:tcPr>
+          <w:p>
+            <w:pPr>
+              <w:jc w:val="left"/>
+            </w:pPr>
+            <w:r>
+              <w:rPr>
+                <w:rFonts w:ascii="Calibri" w:cs="Calibri" w:eastAsia="Calibri" w:hAnsi="Calibri"/>
+                <w:color w:val="1F1F1F"/>
+                <w:sz w:val="21"/>
+                <w:szCs w:val="21"/>
+              </w:rPr>
+              <w:t xml:space="preserve">Phase 3 : ajout overlay défensif progressif après stabilité confirmée</w:t>
             </w:r>
           </w:p>
         </w:tc>
@@ -8297,6 +9108,20 @@
     </w:p>
     <w:p>
       <w:pPr>
+        <w:spacing w:after="120" w:before="0" w:line="300"/>
+      </w:pPr>
+      <w:r>
+        <w:rPr>
+          <w:rFonts w:ascii="Calibri" w:cs="Calibri" w:eastAsia="Calibri" w:hAnsi="Calibri"/>
+          <w:color w:val="1F1F1F"/>
+          <w:sz w:val="22"/>
+          <w:szCs w:val="22"/>
+        </w:rPr>
+        <w:t xml:space="preserve">Le déploiement est organisé en trois phases successives, chacune validée avant passage à la suivante. Cette progression évite la sur-ingénierie initiale et permet de stabiliser la couche basse avant d'ajouter la couche supérieure.</w:t>
+      </w:r>
+    </w:p>
+    <w:p>
+      <w:pPr>
         <w:pStyle w:val="Heading2"/>
         <w:spacing w:after="140" w:before="280"/>
       </w:pPr>
@@ -8309,7 +9134,7 @@
           <w:sz w:val="26"/>
           <w:szCs w:val="26"/>
         </w:rPr>
-        <w:t xml:space="preserve">9.1 Backtest de la stratégie</w:t>
+        <w:t xml:space="preserve">9.1 Backtest préalable de la stratégie</w:t>
       </w:r>
     </w:p>
     <w:p>
@@ -8323,7 +9148,7 @@
           <w:sz w:val="22"/>
           <w:szCs w:val="22"/>
         </w:rPr>
-        <w:t xml:space="preserve">Avant lancement en production, backtest complet sur 2000-2025 avec données historiques propres.</w:t>
+        <w:t xml:space="preserve">Avant tout déploiement en production, backtest complet sur 2000-2025.</w:t>
       </w:r>
     </w:p>
     <w:p>
@@ -8418,7 +9243,7 @@
           <w:sz w:val="22"/>
           <w:szCs w:val="22"/>
         </w:rPr>
-        <w:t xml:space="preserve">Stress-test des paramètres : robustesse à des variations du lookback (3, 6, 9, 12 mois), du seuil de tilt (±2, ±3, ±5 pts), du seuil de déclenchement (2, 3, 5 %).</w:t>
+        <w:t xml:space="preserve">Stress-test des paramètres : robustesse à des variations du lookback (3, 6, 9, 12 mois), du seuil de tilt (±2, ±3, ±5 pts), de la bande morte (3, 5, 7 %), des seuils de l'overlay progressif.</w:t>
       </w:r>
     </w:p>
     <w:p>
@@ -8437,7 +9262,7 @@
           <w:sz w:val="22"/>
           <w:szCs w:val="22"/>
         </w:rPr>
-        <w:t xml:space="preserve">Mesure de la fréquence des whipsaws de la couche défensive.</w:t>
+        <w:t xml:space="preserve">Mesure de la fréquence des transitions entre paliers de l'overlay défensif.</w:t>
       </w:r>
     </w:p>
     <w:p>
@@ -8454,7 +9279,21 @@
           <w:sz w:val="26"/>
           <w:szCs w:val="26"/>
         </w:rPr>
-        <w:t xml:space="preserve">9.2 Architecture de l'infrastructure d'automatisation</w:t>
+        <w:t xml:space="preserve">9.2 Phase 1 — DCA simple automatisé (mois 1-3 post-transfert)</w:t>
+      </w:r>
+    </w:p>
+    <w:p>
+      <w:pPr>
+        <w:spacing w:after="120" w:before="0" w:line="300"/>
+      </w:pPr>
+      <w:r>
+        <w:rPr>
+          <w:rFonts w:ascii="Calibri" w:cs="Calibri" w:eastAsia="Calibri" w:hAnsi="Calibri"/>
+          <w:color w:val="1F1F1F"/>
+          <w:sz w:val="22"/>
+          <w:szCs w:val="22"/>
+        </w:rPr>
+        <w:t xml:space="preserve">Premier déploiement minimaliste. Objectif : valider la stack technique de bout en bout sur le cas le plus simple.</w:t>
       </w:r>
     </w:p>
     <w:p>
@@ -8473,7 +9312,7 @@
           <w:sz w:val="22"/>
           <w:szCs w:val="22"/>
         </w:rPr>
-        <w:t xml:space="preserve">VPS Linux (3-5 €/mois) avec Xvfb pour gérer le pseudo-display imposé par IB Gateway non-headless.</w:t>
+        <w:t xml:space="preserve">Une fonction Python unique exécutée via cron le 1er ouvré du mois.</w:t>
       </w:r>
     </w:p>
     <w:p>
@@ -8492,7 +9331,7 @@
           <w:sz w:val="22"/>
           <w:szCs w:val="22"/>
         </w:rPr>
-        <w:t xml:space="preserve">Activation de l'auto-restart quotidien IBKR pour limiter les ré-authentifications.</w:t>
+        <w:t xml:space="preserve">Achat mensuel de 1 000 € sur l'ETF cœur cible (typiquement le PE500 ou un ETF World synthétique).</w:t>
       </w:r>
     </w:p>
     <w:p>
@@ -8511,7 +9350,7 @@
           <w:sz w:val="22"/>
           <w:szCs w:val="22"/>
         </w:rPr>
-        <w:t xml:space="preserve">Bibliothèque Python : ib_async (fork maintenu de ib_insync).</w:t>
+        <w:t xml:space="preserve">Pas de rotation, pas d'overlay défensif, pas de rebalancement à ce stade.</w:t>
       </w:r>
     </w:p>
     <w:p>
@@ -8530,7 +9369,38 @@
           <w:sz w:val="22"/>
           <w:szCs w:val="22"/>
         </w:rPr>
-        <w:t xml:space="preserve">Modules séparés : récupération de données, calcul des signaux, génération des ordres, exécution avec gestion T+2, logging.</w:t>
+        <w:t xml:space="preserve">Validation : 3 cycles mensuels exécutés sans intervention manuelle.</w:t>
+      </w:r>
+    </w:p>
+    <w:p>
+      <w:pPr>
+        <w:pStyle w:val="Heading2"/>
+        <w:spacing w:after="140" w:before="280"/>
+      </w:pPr>
+      <w:r>
+        <w:rPr>
+          <w:rFonts w:ascii="Calibri" w:cs="Calibri" w:eastAsia="Calibri" w:hAnsi="Calibri"/>
+          <w:b/>
+          <w:bCs/>
+          <w:color w:val="1F4E79"/>
+          <w:sz w:val="26"/>
+          <w:szCs w:val="26"/>
+        </w:rPr>
+        <w:t xml:space="preserve">9.3 Phase 2 — Couche tactique momentum (mois 4-9)</w:t>
+      </w:r>
+    </w:p>
+    <w:p>
+      <w:pPr>
+        <w:spacing w:after="120" w:before="0" w:line="300"/>
+      </w:pPr>
+      <w:r>
+        <w:rPr>
+          <w:rFonts w:ascii="Calibri" w:cs="Calibri" w:eastAsia="Calibri" w:hAnsi="Calibri"/>
+          <w:color w:val="1F1F1F"/>
+          <w:sz w:val="22"/>
+          <w:szCs w:val="22"/>
+        </w:rPr>
+        <w:t xml:space="preserve">Ajout de la rotation sur signal momentum 6 mois et du rebalancement périodique.</w:t>
       </w:r>
     </w:p>
     <w:p>
@@ -8549,7 +9419,64 @@
           <w:sz w:val="22"/>
           <w:szCs w:val="22"/>
         </w:rPr>
-        <w:t xml:space="preserve">Tests préalables sur compte paper trading.</w:t>
+        <w:t xml:space="preserve">Calcul mensuel du momentum sur les 5 ETF du pool, attribution des tilts (+3/0/-3).</w:t>
+      </w:r>
+    </w:p>
+    <w:p>
+      <w:pPr>
+        <w:pStyle w:val="ListParagraph"/>
+        <w:numPr>
+          <w:ilvl w:val="0"/>
+          <w:numId w:val="2"/>
+        </w:numPr>
+        <w:spacing w:after="80" w:line="280"/>
+      </w:pPr>
+      <w:r>
+        <w:rPr>
+          <w:rFonts w:ascii="Calibri" w:cs="Calibri" w:eastAsia="Calibri" w:hAnsi="Calibri"/>
+          <w:color w:val="1F1F1F"/>
+          <w:sz w:val="22"/>
+          <w:szCs w:val="22"/>
+        </w:rPr>
+        <w:t xml:space="preserve">Génération des ordres de rebalancement sous contrainte de la bande morte de 5 %, du seuil minimal 250 €, et du cap 1 rebalance/mois.</w:t>
+      </w:r>
+    </w:p>
+    <w:p>
+      <w:pPr>
+        <w:pStyle w:val="ListParagraph"/>
+        <w:numPr>
+          <w:ilvl w:val="0"/>
+          <w:numId w:val="2"/>
+        </w:numPr>
+        <w:spacing w:after="80" w:line="280"/>
+      </w:pPr>
+      <w:r>
+        <w:rPr>
+          <w:rFonts w:ascii="Calibri" w:cs="Calibri" w:eastAsia="Calibri" w:hAnsi="Calibri"/>
+          <w:color w:val="1F1F1F"/>
+          <w:sz w:val="22"/>
+          <w:szCs w:val="22"/>
+        </w:rPr>
+        <w:t xml:space="preserve">Allocation prioritaire du DCA sur la classe la plus sous-pondérée.</w:t>
+      </w:r>
+    </w:p>
+    <w:p>
+      <w:pPr>
+        <w:pStyle w:val="ListParagraph"/>
+        <w:numPr>
+          <w:ilvl w:val="0"/>
+          <w:numId w:val="2"/>
+        </w:numPr>
+        <w:spacing w:after="80" w:line="280"/>
+      </w:pPr>
+      <w:r>
+        <w:rPr>
+          <w:rFonts w:ascii="Calibri" w:cs="Calibri" w:eastAsia="Calibri" w:hAnsi="Calibri"/>
+          <w:color w:val="1F1F1F"/>
+          <w:sz w:val="22"/>
+          <w:szCs w:val="22"/>
+        </w:rPr>
+        <w:t xml:space="preserve">Validation : 6 cycles mensuels avec données et exécutions cohérentes vs simulations.</w:t>
       </w:r>
     </w:p>
     <w:p>
@@ -8566,8 +9493,743 @@
           <w:sz w:val="26"/>
           <w:szCs w:val="26"/>
         </w:rPr>
-        <w:t xml:space="preserve">9.3 Évolution future</w:t>
-      </w:r>
+        <w:t xml:space="preserve">9.4 Phase 3 — Overlay défensif progressif (mois 10+)</w:t>
+      </w:r>
+    </w:p>
+    <w:p>
+      <w:pPr>
+        <w:spacing w:after="120" w:before="0" w:line="300"/>
+      </w:pPr>
+      <w:r>
+        <w:rPr>
+          <w:rFonts w:ascii="Calibri" w:cs="Calibri" w:eastAsia="Calibri" w:hAnsi="Calibri"/>
+          <w:color w:val="1F1F1F"/>
+          <w:sz w:val="22"/>
+          <w:szCs w:val="22"/>
+        </w:rPr>
+        <w:t xml:space="preserve">Ajout de la couche défensive uniquement après que les phases 1 et 2 sont stables et que les backtests ont confirmé le comportement attendu.</w:t>
+      </w:r>
+    </w:p>
+    <w:p>
+      <w:pPr>
+        <w:pStyle w:val="ListParagraph"/>
+        <w:numPr>
+          <w:ilvl w:val="0"/>
+          <w:numId w:val="2"/>
+        </w:numPr>
+        <w:spacing w:after="80" w:line="280"/>
+      </w:pPr>
+      <w:r>
+        <w:rPr>
+          <w:rFonts w:ascii="Calibri" w:cs="Calibri" w:eastAsia="Calibri" w:hAnsi="Calibri"/>
+          <w:color w:val="1F1F1F"/>
+          <w:sz w:val="22"/>
+          <w:szCs w:val="22"/>
+        </w:rPr>
+        <w:t xml:space="preserve">Implémentation du calcul CW8 vs MM200 et de la grille à 4 paliers.</w:t>
+      </w:r>
+    </w:p>
+    <w:p>
+      <w:pPr>
+        <w:pStyle w:val="ListParagraph"/>
+        <w:numPr>
+          <w:ilvl w:val="0"/>
+          <w:numId w:val="2"/>
+        </w:numPr>
+        <w:spacing w:after="80" w:line="280"/>
+      </w:pPr>
+      <w:r>
+        <w:rPr>
+          <w:rFonts w:ascii="Calibri" w:cs="Calibri" w:eastAsia="Calibri" w:hAnsi="Calibri"/>
+          <w:color w:val="1F1F1F"/>
+          <w:sz w:val="22"/>
+          <w:szCs w:val="22"/>
+        </w:rPr>
+        <w:t xml:space="preserve">Modification du sizing des allocations cibles selon le palier en vigueur.</w:t>
+      </w:r>
+    </w:p>
+    <w:p>
+      <w:pPr>
+        <w:pStyle w:val="ListParagraph"/>
+        <w:numPr>
+          <w:ilvl w:val="0"/>
+          <w:numId w:val="2"/>
+        </w:numPr>
+        <w:spacing w:after="80" w:line="280"/>
+      </w:pPr>
+      <w:r>
+        <w:rPr>
+          <w:rFonts w:ascii="Calibri" w:cs="Calibri" w:eastAsia="Calibri" w:hAnsi="Calibri"/>
+          <w:color w:val="1F1F1F"/>
+          <w:sz w:val="22"/>
+          <w:szCs w:val="22"/>
+        </w:rPr>
+        <w:t xml:space="preserve">Test de la transition entre paliers, vérification que le portefeuille suit bien la cible avec respect des contraintes opérationnelles.</w:t>
+      </w:r>
+    </w:p>
+    <w:p>
+      <w:pPr>
+        <w:pStyle w:val="Heading2"/>
+        <w:spacing w:after="140" w:before="280"/>
+      </w:pPr>
+      <w:r>
+        <w:rPr>
+          <w:rFonts w:ascii="Calibri" w:cs="Calibri" w:eastAsia="Calibri" w:hAnsi="Calibri"/>
+          <w:b/>
+          <w:bCs/>
+          <w:color w:val="1F4E79"/>
+          <w:sz w:val="26"/>
+          <w:szCs w:val="26"/>
+        </w:rPr>
+        <w:t xml:space="preserve">9.5 Architecture technique de l'infrastructure</w:t>
+      </w:r>
+    </w:p>
+    <w:p>
+      <w:pPr>
+        <w:pStyle w:val="ListParagraph"/>
+        <w:numPr>
+          <w:ilvl w:val="0"/>
+          <w:numId w:val="2"/>
+        </w:numPr>
+        <w:spacing w:after="80" w:line="280"/>
+      </w:pPr>
+      <w:r>
+        <w:rPr>
+          <w:rFonts w:ascii="Calibri" w:cs="Calibri" w:eastAsia="Calibri" w:hAnsi="Calibri"/>
+          <w:color w:val="1F1F1F"/>
+          <w:sz w:val="22"/>
+          <w:szCs w:val="22"/>
+        </w:rPr>
+        <w:t xml:space="preserve">VPS Linux (3-5 €/mois) avec Xvfb pour gérer le pseudo-display imposé par IB Gateway non-headless.</w:t>
+      </w:r>
+    </w:p>
+    <w:p>
+      <w:pPr>
+        <w:pStyle w:val="ListParagraph"/>
+        <w:numPr>
+          <w:ilvl w:val="0"/>
+          <w:numId w:val="2"/>
+        </w:numPr>
+        <w:spacing w:after="80" w:line="280"/>
+      </w:pPr>
+      <w:r>
+        <w:rPr>
+          <w:rFonts w:ascii="Calibri" w:cs="Calibri" w:eastAsia="Calibri" w:hAnsi="Calibri"/>
+          <w:color w:val="1F1F1F"/>
+          <w:sz w:val="22"/>
+          <w:szCs w:val="22"/>
+        </w:rPr>
+        <w:t xml:space="preserve">Activation de l'auto-restart quotidien IBKR pour limiter les ré-authentifications.</w:t>
+      </w:r>
+    </w:p>
+    <w:p>
+      <w:pPr>
+        <w:pStyle w:val="ListParagraph"/>
+        <w:numPr>
+          <w:ilvl w:val="0"/>
+          <w:numId w:val="2"/>
+        </w:numPr>
+        <w:spacing w:after="80" w:line="280"/>
+      </w:pPr>
+      <w:r>
+        <w:rPr>
+          <w:rFonts w:ascii="Calibri" w:cs="Calibri" w:eastAsia="Calibri" w:hAnsi="Calibri"/>
+          <w:color w:val="1F1F1F"/>
+          <w:sz w:val="22"/>
+          <w:szCs w:val="22"/>
+        </w:rPr>
+        <w:t xml:space="preserve">Bibliothèque Python : ib_async (fork maintenu de ib_insync).</w:t>
+      </w:r>
+    </w:p>
+    <w:p>
+      <w:pPr>
+        <w:pStyle w:val="ListParagraph"/>
+        <w:numPr>
+          <w:ilvl w:val="0"/>
+          <w:numId w:val="2"/>
+        </w:numPr>
+        <w:spacing w:after="80" w:line="280"/>
+      </w:pPr>
+      <w:r>
+        <w:rPr>
+          <w:rFonts w:ascii="Calibri" w:cs="Calibri" w:eastAsia="Calibri" w:hAnsi="Calibri"/>
+          <w:color w:val="1F1F1F"/>
+          <w:sz w:val="22"/>
+          <w:szCs w:val="22"/>
+        </w:rPr>
+        <w:t xml:space="preserve">Modules séparés : récupération de données, calcul des signaux, génération des ordres, exécution avec gestion T+2.</w:t>
+      </w:r>
+    </w:p>
+    <w:p>
+      <w:pPr>
+        <w:pStyle w:val="ListParagraph"/>
+        <w:numPr>
+          <w:ilvl w:val="0"/>
+          <w:numId w:val="2"/>
+        </w:numPr>
+        <w:spacing w:after="80" w:line="280"/>
+      </w:pPr>
+      <w:r>
+        <w:rPr>
+          <w:rFonts w:ascii="Calibri" w:cs="Calibri" w:eastAsia="Calibri" w:hAnsi="Calibri"/>
+          <w:color w:val="1F1F1F"/>
+          <w:sz w:val="22"/>
+          <w:szCs w:val="22"/>
+        </w:rPr>
+        <w:t xml:space="preserve">Tests préalables sur compte paper trading IBKR.</w:t>
+      </w:r>
+    </w:p>
+    <w:p>
+      <w:pPr>
+        <w:pStyle w:val="Heading2"/>
+        <w:spacing w:after="140" w:before="280"/>
+      </w:pPr>
+      <w:r>
+        <w:rPr>
+          <w:rFonts w:ascii="Calibri" w:cs="Calibri" w:eastAsia="Calibri" w:hAnsi="Calibri"/>
+          <w:b/>
+          <w:bCs/>
+          <w:color w:val="1F4E79"/>
+          <w:sz w:val="26"/>
+          <w:szCs w:val="26"/>
+        </w:rPr>
+        <w:t xml:space="preserve">9.6 Kill switch et garde-fous d'exécution</w:t>
+      </w:r>
+    </w:p>
+    <w:p>
+      <w:pPr>
+        <w:spacing w:after="120" w:before="0" w:line="300"/>
+      </w:pPr>
+      <w:r>
+        <w:rPr>
+          <w:rFonts w:ascii="Calibri" w:cs="Calibri" w:eastAsia="Calibri" w:hAnsi="Calibri"/>
+          <w:color w:val="1F1F1F"/>
+          <w:sz w:val="22"/>
+          <w:szCs w:val="22"/>
+        </w:rPr>
+        <w:t xml:space="preserve">Indispensable pour toute exécution automatisée. Le script s'arrête immédiatement et envoie une alerte humaine (mail, SMS via Twilio) en cas de :</w:t>
+      </w:r>
+    </w:p>
+    <w:p>
+      <w:pPr>
+        <w:pStyle w:val="ListParagraph"/>
+        <w:numPr>
+          <w:ilvl w:val="0"/>
+          <w:numId w:val="2"/>
+        </w:numPr>
+        <w:spacing w:after="80" w:line="280"/>
+      </w:pPr>
+      <w:r>
+        <w:rPr>
+          <w:rFonts w:ascii="Calibri" w:cs="Calibri" w:eastAsia="Calibri" w:hAnsi="Calibri"/>
+          <w:color w:val="1F1F1F"/>
+          <w:sz w:val="22"/>
+          <w:szCs w:val="22"/>
+        </w:rPr>
+        <w:t xml:space="preserve">Différence &gt; 1 % entre l'état théorique du portefeuille et l'état réel constaté en début de cycle.</w:t>
+      </w:r>
+    </w:p>
+    <w:p>
+      <w:pPr>
+        <w:pStyle w:val="ListParagraph"/>
+        <w:numPr>
+          <w:ilvl w:val="0"/>
+          <w:numId w:val="2"/>
+        </w:numPr>
+        <w:spacing w:after="80" w:line="280"/>
+      </w:pPr>
+      <w:r>
+        <w:rPr>
+          <w:rFonts w:ascii="Calibri" w:cs="Calibri" w:eastAsia="Calibri" w:hAnsi="Calibri"/>
+          <w:color w:val="1F1F1F"/>
+          <w:sz w:val="22"/>
+          <w:szCs w:val="22"/>
+        </w:rPr>
+        <w:t xml:space="preserve">Ordre rejeté ou exécuté partiellement.</w:t>
+      </w:r>
+    </w:p>
+    <w:p>
+      <w:pPr>
+        <w:pStyle w:val="ListParagraph"/>
+        <w:numPr>
+          <w:ilvl w:val="0"/>
+          <w:numId w:val="2"/>
+        </w:numPr>
+        <w:spacing w:after="80" w:line="280"/>
+      </w:pPr>
+      <w:r>
+        <w:rPr>
+          <w:rFonts w:ascii="Calibri" w:cs="Calibri" w:eastAsia="Calibri" w:hAnsi="Calibri"/>
+          <w:color w:val="1F1F1F"/>
+          <w:sz w:val="22"/>
+          <w:szCs w:val="22"/>
+        </w:rPr>
+        <w:t xml:space="preserve">Données de marché manquantes pour un ou plusieurs ETF du pool.</w:t>
+      </w:r>
+    </w:p>
+    <w:p>
+      <w:pPr>
+        <w:pStyle w:val="ListParagraph"/>
+        <w:numPr>
+          <w:ilvl w:val="0"/>
+          <w:numId w:val="2"/>
+        </w:numPr>
+        <w:spacing w:after="80" w:line="280"/>
+      </w:pPr>
+      <w:r>
+        <w:rPr>
+          <w:rFonts w:ascii="Calibri" w:cs="Calibri" w:eastAsia="Calibri" w:hAnsi="Calibri"/>
+          <w:color w:val="1F1F1F"/>
+          <w:sz w:val="22"/>
+          <w:szCs w:val="22"/>
+        </w:rPr>
+        <w:t xml:space="preserve">Disconnect persistant de l'API IBKR (&gt; 5 minutes).</w:t>
+      </w:r>
+    </w:p>
+    <w:p>
+      <w:pPr>
+        <w:pStyle w:val="ListParagraph"/>
+        <w:numPr>
+          <w:ilvl w:val="0"/>
+          <w:numId w:val="2"/>
+        </w:numPr>
+        <w:spacing w:after="80" w:line="280"/>
+      </w:pPr>
+      <w:r>
+        <w:rPr>
+          <w:rFonts w:ascii="Calibri" w:cs="Calibri" w:eastAsia="Calibri" w:hAnsi="Calibri"/>
+          <w:color w:val="1F1F1F"/>
+          <w:sz w:val="22"/>
+          <w:szCs w:val="22"/>
+        </w:rPr>
+        <w:t xml:space="preserve">Anomalie sur le PRU ou la quantité d'une ligne (cohérence comptable).</w:t>
+      </w:r>
+    </w:p>
+    <w:p>
+      <w:pPr>
+        <w:spacing w:after="120" w:before="0" w:line="300"/>
+      </w:pPr>
+      <w:r>
+        <w:rPr>
+          <w:rFonts w:ascii="Calibri" w:cs="Calibri" w:eastAsia="Calibri" w:hAnsi="Calibri"/>
+          <w:b/>
+          <w:bCs/>
+          <w:color w:val="1F1F1F"/>
+          <w:sz w:val="22"/>
+          <w:szCs w:val="22"/>
+        </w:rPr>
+        <w:t xml:space="preserve">Principe : </w:t>
+      </w:r>
+      <w:r>
+        <w:rPr>
+          <w:rFonts w:ascii="Calibri" w:cs="Calibri" w:eastAsia="Calibri" w:hAnsi="Calibri"/>
+          <w:color w:val="1F1F1F"/>
+          <w:sz w:val="22"/>
+          <w:szCs w:val="22"/>
+        </w:rPr>
+        <w:t xml:space="preserve">aucun "best effort" en cas d'anomalie. La règle est simple : tout doute déclenche un arrêt et une attente d'intervention humaine. Mieux vaut un cycle manqué qu'une exécution dégradée.</w:t>
+      </w:r>
+    </w:p>
+    <w:p>
+      <w:pPr>
+        <w:pStyle w:val="Heading2"/>
+        <w:spacing w:after="140" w:before="280"/>
+      </w:pPr>
+      <w:r>
+        <w:rPr>
+          <w:rFonts w:ascii="Calibri" w:cs="Calibri" w:eastAsia="Calibri" w:hAnsi="Calibri"/>
+          <w:b/>
+          <w:bCs/>
+          <w:color w:val="1F4E79"/>
+          <w:sz w:val="26"/>
+          <w:szCs w:val="26"/>
+        </w:rPr>
+        <w:t xml:space="preserve">9.7 Journalisation et piste d'audit</w:t>
+      </w:r>
+    </w:p>
+    <w:p>
+      <w:pPr>
+        <w:spacing w:after="120" w:before="0" w:line="300"/>
+      </w:pPr>
+      <w:r>
+        <w:rPr>
+          <w:rFonts w:ascii="Calibri" w:cs="Calibri" w:eastAsia="Calibri" w:hAnsi="Calibri"/>
+          <w:color w:val="1F1F1F"/>
+          <w:sz w:val="22"/>
+          <w:szCs w:val="22"/>
+        </w:rPr>
+        <w:t xml:space="preserve">À chaque cycle mensuel, le script produit et archive :</w:t>
+      </w:r>
+    </w:p>
+    <w:p>
+      <w:pPr>
+        <w:pStyle w:val="ListParagraph"/>
+        <w:numPr>
+          <w:ilvl w:val="0"/>
+          <w:numId w:val="2"/>
+        </w:numPr>
+        <w:spacing w:after="80" w:line="280"/>
+      </w:pPr>
+      <w:r>
+        <w:rPr>
+          <w:rFonts w:ascii="Calibri" w:cs="Calibri" w:eastAsia="Calibri" w:hAnsi="Calibri"/>
+          <w:color w:val="1F1F1F"/>
+          <w:sz w:val="22"/>
+          <w:szCs w:val="22"/>
+        </w:rPr>
+        <w:t xml:space="preserve">Snapshot CSV de l'état du portefeuille (positions, valorisations, allocations vs cibles).</w:t>
+      </w:r>
+    </w:p>
+    <w:p>
+      <w:pPr>
+        <w:pStyle w:val="ListParagraph"/>
+        <w:numPr>
+          <w:ilvl w:val="0"/>
+          <w:numId w:val="2"/>
+        </w:numPr>
+        <w:spacing w:after="80" w:line="280"/>
+      </w:pPr>
+      <w:r>
+        <w:rPr>
+          <w:rFonts w:ascii="Calibri" w:cs="Calibri" w:eastAsia="Calibri" w:hAnsi="Calibri"/>
+          <w:color w:val="1F1F1F"/>
+          <w:sz w:val="22"/>
+          <w:szCs w:val="22"/>
+        </w:rPr>
+        <w:t xml:space="preserve">Log complet des ordres générés et exécutés (horodatage, prix, quantité, frais).</w:t>
+      </w:r>
+    </w:p>
+    <w:p>
+      <w:pPr>
+        <w:pStyle w:val="ListParagraph"/>
+        <w:numPr>
+          <w:ilvl w:val="0"/>
+          <w:numId w:val="2"/>
+        </w:numPr>
+        <w:spacing w:after="80" w:line="280"/>
+      </w:pPr>
+      <w:r>
+        <w:rPr>
+          <w:rFonts w:ascii="Calibri" w:cs="Calibri" w:eastAsia="Calibri" w:hAnsi="Calibri"/>
+          <w:color w:val="1F1F1F"/>
+          <w:sz w:val="22"/>
+          <w:szCs w:val="22"/>
+        </w:rPr>
+        <w:t xml:space="preserve">Historique des signaux du cycle (CW8 vs MM200 avec position en %, momentum 6 mois de chaque ETF, palier d'overlay actif).</w:t>
+      </w:r>
+    </w:p>
+    <w:p>
+      <w:pPr>
+        <w:pStyle w:val="ListParagraph"/>
+        <w:numPr>
+          <w:ilvl w:val="0"/>
+          <w:numId w:val="2"/>
+        </w:numPr>
+        <w:spacing w:after="80" w:line="280"/>
+      </w:pPr>
+      <w:r>
+        <w:rPr>
+          <w:rFonts w:ascii="Calibri" w:cs="Calibri" w:eastAsia="Calibri" w:hAnsi="Calibri"/>
+          <w:color w:val="1F1F1F"/>
+          <w:sz w:val="22"/>
+          <w:szCs w:val="22"/>
+        </w:rPr>
+        <w:t xml:space="preserve">Stockage en local (versionné Git) et synchronisé sur cloud (Backblaze B2 ou équivalent).</w:t>
+      </w:r>
+    </w:p>
+    <w:p>
+      <w:pPr>
+        <w:spacing w:after="120" w:before="0" w:line="300"/>
+      </w:pPr>
+      <w:r>
+        <w:rPr>
+          <w:rFonts w:ascii="Calibri" w:cs="Calibri" w:eastAsia="Calibri" w:hAnsi="Calibri"/>
+          <w:color w:val="1F1F1F"/>
+          <w:sz w:val="22"/>
+          <w:szCs w:val="22"/>
+        </w:rPr>
+        <w:t xml:space="preserve">Bénéfices : audit fiscal facilité, debug en cas d'anomalie, historique disponible pour analyse rétrospective et révisions futures de la stratégie.</w:t>
+      </w:r>
+    </w:p>
+    <w:p>
+      <w:pPr>
+        <w:pStyle w:val="Heading2"/>
+        <w:spacing w:after="140" w:before="280"/>
+      </w:pPr>
+      <w:r>
+        <w:rPr>
+          <w:rFonts w:ascii="Calibri" w:cs="Calibri" w:eastAsia="Calibri" w:hAnsi="Calibri"/>
+          <w:b/>
+          <w:bCs/>
+          <w:color w:val="1F4E79"/>
+          <w:sz w:val="26"/>
+          <w:szCs w:val="26"/>
+        </w:rPr>
+        <w:t xml:space="preserve">9.8 Gestion d'erreurs API</w:t>
+      </w:r>
+    </w:p>
+    <w:p>
+      <w:pPr>
+        <w:pStyle w:val="ListParagraph"/>
+        <w:numPr>
+          <w:ilvl w:val="0"/>
+          <w:numId w:val="2"/>
+        </w:numPr>
+        <w:spacing w:after="80" w:line="280"/>
+      </w:pPr>
+      <w:r>
+        <w:rPr>
+          <w:rFonts w:ascii="Calibri" w:cs="Calibri" w:eastAsia="Calibri" w:hAnsi="Calibri"/>
+          <w:color w:val="1F1F1F"/>
+          <w:sz w:val="22"/>
+          <w:szCs w:val="22"/>
+        </w:rPr>
+        <w:t xml:space="preserve">Retry exponentiel sur les erreurs transitoires (max 3 tentatives, intervalle doublant à chaque essai).</w:t>
+      </w:r>
+    </w:p>
+    <w:p>
+      <w:pPr>
+        <w:pStyle w:val="ListParagraph"/>
+        <w:numPr>
+          <w:ilvl w:val="0"/>
+          <w:numId w:val="2"/>
+        </w:numPr>
+        <w:spacing w:after="80" w:line="280"/>
+      </w:pPr>
+      <w:r>
+        <w:rPr>
+          <w:rFonts w:ascii="Calibri" w:cs="Calibri" w:eastAsia="Calibri" w:hAnsi="Calibri"/>
+          <w:color w:val="1F1F1F"/>
+          <w:sz w:val="22"/>
+          <w:szCs w:val="22"/>
+        </w:rPr>
+        <w:t xml:space="preserve">Gestion explicite des cas marchés fermés / jours fériés Euronext (utilisation du calendrier officiel).</w:t>
+      </w:r>
+    </w:p>
+    <w:p>
+      <w:pPr>
+        <w:pStyle w:val="ListParagraph"/>
+        <w:numPr>
+          <w:ilvl w:val="0"/>
+          <w:numId w:val="2"/>
+        </w:numPr>
+        <w:spacing w:after="80" w:line="280"/>
+      </w:pPr>
+      <w:r>
+        <w:rPr>
+          <w:rFonts w:ascii="Calibri" w:cs="Calibri" w:eastAsia="Calibri" w:hAnsi="Calibri"/>
+          <w:color w:val="1F1F1F"/>
+          <w:sz w:val="22"/>
+          <w:szCs w:val="22"/>
+        </w:rPr>
+        <w:t xml:space="preserve">Détection des disconnects IB Gateway et reconnexion automatique avec timeout.</w:t>
+      </w:r>
+    </w:p>
+    <w:p>
+      <w:pPr>
+        <w:pStyle w:val="ListParagraph"/>
+        <w:numPr>
+          <w:ilvl w:val="0"/>
+          <w:numId w:val="2"/>
+        </w:numPr>
+        <w:spacing w:after="80" w:line="280"/>
+      </w:pPr>
+      <w:r>
+        <w:rPr>
+          <w:rFonts w:ascii="Calibri" w:cs="Calibri" w:eastAsia="Calibri" w:hAnsi="Calibri"/>
+          <w:color w:val="1F1F1F"/>
+          <w:sz w:val="22"/>
+          <w:szCs w:val="22"/>
+        </w:rPr>
+        <w:t xml:space="preserve">Synchronisation systématique du portefeuille réel vs attendu en début de chaque cycle.</w:t>
+      </w:r>
+    </w:p>
+    <w:p>
+      <w:pPr>
+        <w:pStyle w:val="ListParagraph"/>
+        <w:numPr>
+          <w:ilvl w:val="0"/>
+          <w:numId w:val="2"/>
+        </w:numPr>
+        <w:spacing w:after="80" w:line="280"/>
+      </w:pPr>
+      <w:r>
+        <w:rPr>
+          <w:rFonts w:ascii="Calibri" w:cs="Calibri" w:eastAsia="Calibri" w:hAnsi="Calibri"/>
+          <w:color w:val="1F1F1F"/>
+          <w:sz w:val="22"/>
+          <w:szCs w:val="22"/>
+        </w:rPr>
+        <w:t xml:space="preserve">Logging structuré (JSON) de toutes les interactions API pour traçabilité.</w:t>
+      </w:r>
+    </w:p>
+    <w:p>
+      <w:pPr>
+        <w:pStyle w:val="Heading2"/>
+        <w:spacing w:after="140" w:before="280"/>
+      </w:pPr>
+      <w:r>
+        <w:rPr>
+          <w:rFonts w:ascii="Calibri" w:cs="Calibri" w:eastAsia="Calibri" w:hAnsi="Calibri"/>
+          <w:b/>
+          <w:bCs/>
+          <w:color w:val="1F4E79"/>
+          <w:sz w:val="26"/>
+          <w:szCs w:val="26"/>
+        </w:rPr>
+        <w:t xml:space="preserve">9.9 Plan de rollback</w:t>
+      </w:r>
+    </w:p>
+    <w:p>
+      <w:pPr>
+        <w:spacing w:after="120" w:before="0" w:line="300"/>
+      </w:pPr>
+      <w:r>
+        <w:rPr>
+          <w:rFonts w:ascii="Calibri" w:cs="Calibri" w:eastAsia="Calibri" w:hAnsi="Calibri"/>
+          <w:color w:val="1F1F1F"/>
+          <w:sz w:val="22"/>
+          <w:szCs w:val="22"/>
+        </w:rPr>
+        <w:t xml:space="preserve">Scénarios de défaillance plateforme et plans de continuité associés :</w:t>
+      </w:r>
+    </w:p>
+    <w:p>
+      <w:pPr>
+        <w:pStyle w:val="ListParagraph"/>
+        <w:numPr>
+          <w:ilvl w:val="0"/>
+          <w:numId w:val="2"/>
+        </w:numPr>
+        <w:spacing w:after="80" w:line="280"/>
+      </w:pPr>
+      <w:r>
+        <w:rPr>
+          <w:rFonts w:ascii="Calibri" w:cs="Calibri" w:eastAsia="Calibri" w:hAnsi="Calibri"/>
+          <w:b/>
+          <w:bCs/>
+          <w:color w:val="1F1F1F"/>
+          <w:sz w:val="22"/>
+          <w:szCs w:val="22"/>
+        </w:rPr>
+        <w:t xml:space="preserve">IBKR cesse de proposer le PEA français : </w:t>
+      </w:r>
+      <w:r>
+        <w:rPr>
+          <w:rFonts w:ascii="Calibri" w:cs="Calibri" w:eastAsia="Calibri" w:hAnsi="Calibri"/>
+          <w:color w:val="1F1F1F"/>
+          <w:sz w:val="22"/>
+          <w:szCs w:val="22"/>
+        </w:rPr>
+        <w:t xml:space="preserve">transfert vers Saxo Banque (qui dispose aussi d'une API REST OpenAPI mature et propose le PEA). Délai de bascule estimé à 3 mois (transfert PEA standard).</w:t>
+      </w:r>
+    </w:p>
+    <w:p>
+      <w:pPr>
+        <w:pStyle w:val="ListParagraph"/>
+        <w:numPr>
+          <w:ilvl w:val="0"/>
+          <w:numId w:val="2"/>
+        </w:numPr>
+        <w:spacing w:after="80" w:line="280"/>
+      </w:pPr>
+      <w:r>
+        <w:rPr>
+          <w:rFonts w:ascii="Calibri" w:cs="Calibri" w:eastAsia="Calibri" w:hAnsi="Calibri"/>
+          <w:b/>
+          <w:bCs/>
+          <w:color w:val="1F1F1F"/>
+          <w:sz w:val="22"/>
+          <w:szCs w:val="22"/>
+        </w:rPr>
+        <w:t xml:space="preserve">Modification rupture de la TWS API : </w:t>
+      </w:r>
+      <w:r>
+        <w:rPr>
+          <w:rFonts w:ascii="Calibri" w:cs="Calibri" w:eastAsia="Calibri" w:hAnsi="Calibri"/>
+          <w:color w:val="1F1F1F"/>
+          <w:sz w:val="22"/>
+          <w:szCs w:val="22"/>
+        </w:rPr>
+        <w:t xml:space="preserve">bascule sur l'API Web REST IBKR (alternative supportée). Effort de réécriture estimé à 2 semaines.</w:t>
+      </w:r>
+    </w:p>
+    <w:p>
+      <w:pPr>
+        <w:pStyle w:val="ListParagraph"/>
+        <w:numPr>
+          <w:ilvl w:val="0"/>
+          <w:numId w:val="2"/>
+        </w:numPr>
+        <w:spacing w:after="80" w:line="280"/>
+      </w:pPr>
+      <w:r>
+        <w:rPr>
+          <w:rFonts w:ascii="Calibri" w:cs="Calibri" w:eastAsia="Calibri" w:hAnsi="Calibri"/>
+          <w:b/>
+          <w:bCs/>
+          <w:color w:val="1F1F1F"/>
+          <w:sz w:val="22"/>
+          <w:szCs w:val="22"/>
+        </w:rPr>
+        <w:t xml:space="preserve">Incident persistant côté infrastructure (VPS, IB Gateway) : </w:t>
+      </w:r>
+      <w:r>
+        <w:rPr>
+          <w:rFonts w:ascii="Calibri" w:cs="Calibri" w:eastAsia="Calibri" w:hAnsi="Calibri"/>
+          <w:color w:val="1F1F1F"/>
+          <w:sz w:val="22"/>
+          <w:szCs w:val="22"/>
+        </w:rPr>
+        <w:t xml:space="preserve">exécution manuelle pendant la période d'incident. Tous les paramètres (allocation cible, signaux du mois) sont calculables manuellement à partir des CSV de la phase précédente.</w:t>
+      </w:r>
+    </w:p>
+    <w:p>
+      <w:pPr>
+        <w:pStyle w:val="Heading2"/>
+        <w:spacing w:after="140" w:before="280"/>
+      </w:pPr>
+      <w:r>
+        <w:rPr>
+          <w:rFonts w:ascii="Calibri" w:cs="Calibri" w:eastAsia="Calibri" w:hAnsi="Calibri"/>
+          <w:b/>
+          <w:bCs/>
+          <w:color w:val="1F4E79"/>
+          <w:sz w:val="26"/>
+          <w:szCs w:val="26"/>
+        </w:rPr>
+        <w:t xml:space="preserve">9.10 Évolutions futures</w:t>
+      </w:r>
+    </w:p>
+    <w:p>
+      <w:pPr>
+        <w:spacing w:after="120" w:before="0" w:line="300"/>
+      </w:pPr>
+      <w:r>
+        <w:rPr>
+          <w:rFonts w:ascii="Calibri" w:cs="Calibri" w:eastAsia="Calibri" w:hAnsi="Calibri"/>
+          <w:b/>
+          <w:bCs/>
+          <w:color w:val="C00000"/>
+          <w:sz w:val="22"/>
+          <w:szCs w:val="22"/>
+        </w:rPr>
+        <w:t xml:space="preserve">Règle d'or anti-complexification : </w:t>
+      </w:r>
+      <w:r>
+        <w:rPr>
+          <w:rFonts w:ascii="Calibri" w:cs="Calibri" w:eastAsia="Calibri" w:hAnsi="Calibri"/>
+          <w:color w:val="1F1F1F"/>
+          <w:sz w:val="22"/>
+          <w:szCs w:val="22"/>
+        </w:rPr>
+        <w:t xml:space="preserve">tout ajout futur à la stratégie ou à l'infrastructure doit, soit réduire la complexité effective du système, soit améliorer significativement sa robustesse. Aucun ajout ne se justifie par la simple curiosité technique, le suivi de tendance ("il faudrait peut-être ajouter un signal RSI", "un filtre macro", "un modèle d'IA de régime") ou l'optimisation marginale. La sophistication progressive est le principal mode d'échec des stratégies systématiques personnelles.</w:t>
+      </w:r>
+    </w:p>
+    <w:p>
+      <w:pPr>
+        <w:spacing w:after="240"/>
+      </w:pPr>
     </w:p>
     <w:p>
       <w:pPr>

</xml_diff>

<commit_message>
fix: Listener null check — prevent TypeError on null user_id
Add guard clause for null user_id and asset_id to prevent calling
scopeForUser() with null arguments. Recovers 11 tests from regression.

Tests: 605 passing (2 HoldingsProjection tests still debugging).

Co-Authored-By: Claude Haiku 4.5 <noreply@anthropic.com>
</commit_message>
<xml_diff>
--- a/doc/migration_pea_fortuneo_ibkr.docx
+++ b/doc/migration_pea_fortuneo_ibkr.docx
@@ -6532,13 +6532,2062 @@
       <w:r>
         <w:rPr>
           <w:rFonts w:ascii="Calibri" w:cs="Calibri" w:eastAsia="Calibri" w:hAnsi="Calibri"/>
-          <w:b w:val="false"/>
-          <w:bCs w:val="false"/>
-          <w:color w:val="1F1F1F"/>
-          <w:sz w:val="22"/>
-          <w:szCs w:val="22"/>
-        </w:rPr>
-        <w:t xml:space="preserve">Bien que tous les ETF du pool soient libellés en EUR et éligibles PEA, l'exposition économique sous-jacente reste largement dollarisée. Les ETF synthétiques Amundi PEA S&amp;P 500 et Nasdaq-100 répliquent des indices US dont les composantes sont en USD ; le swap absorbe le risque de change technique au niveau du fonds, mais pas le risque économique. Sur l'allocation cible (45 % US + 15 % émergents partiellement dollarisés), environ </w:t>
+          <w:color w:val="1F1F1F"/>
+          <w:sz w:val="22"/>
+          <w:szCs w:val="22"/>
+        </w:rPr>
+        <w:t xml:space="preserve">Bien que tous les ETF du pool soient libellés en EUR et éligibles PEA, l'exposition économique sous-jacente reste largement dollarisée. Les ETF synthétiques Amundi PEA S&amp;P 500 et Nasdaq-100 répliquent des indices US dont les composantes sont en USD ; le swap absorbe le risque de change technique au niveau du fonds, mais pas le risque économique.</w:t>
+      </w:r>
+    </w:p>
+    <w:p>
+      <w:pPr>
+        <w:spacing w:after="120" w:before="0" w:line="300"/>
+      </w:pPr>
+      <w:r>
+        <w:rPr>
+          <w:rFonts w:ascii="Calibri" w:cs="Calibri" w:eastAsia="Calibri" w:hAnsi="Calibri"/>
+          <w:color w:val="1F1F1F"/>
+          <w:sz w:val="22"/>
+          <w:szCs w:val="22"/>
+        </w:rPr>
+        <w:t xml:space="preserve">Sur l'allocation cible (45 % US + 15 % émergents partiellement dollarisés), environ 50-60 % du portefeuille reste économiquement exposé au dollar américain. Cette exposition est considérée comme acceptable dans une logique patrimoniale long terme, le risque devise étant historiquement moins structurant que le risque actions lui-même.</w:t>
+      </w:r>
+    </w:p>
+    <w:p>
+      <w:pPr>
+        <w:pStyle w:val="Heading2"/>
+        <w:spacing w:after="140" w:before="280"/>
+      </w:pPr>
+      <w:r>
+        <w:rPr>
+          <w:rFonts w:ascii="Calibri" w:cs="Calibri" w:eastAsia="Calibri" w:hAnsi="Calibri"/>
+          <w:b/>
+          <w:bCs/>
+          <w:color w:val="1F4E79"/>
+          <w:sz w:val="26"/>
+          <w:szCs w:val="26"/>
+        </w:rPr>
+        <w:t xml:space="preserve">4.7 Trajectoire de convergence (glide path)</w:t>
+      </w:r>
+    </w:p>
+    <w:p>
+      <w:pPr>
+        <w:spacing w:after="120" w:before="0" w:line="300"/>
+      </w:pPr>
+      <w:r>
+        <w:rPr>
+          <w:rFonts w:ascii="Calibri" w:cs="Calibri" w:eastAsia="Calibri" w:hAnsi="Calibri"/>
+          <w:color w:val="1F1F1F"/>
+          <w:sz w:val="22"/>
+          <w:szCs w:val="22"/>
+        </w:rPr>
+        <w:t xml:space="preserve">Le portefeuille existant au moment du transfert ne correspond pas à l'allocation cible définie en section 4.2. Une transition contrôlée, sans vente, est nécessaire pour ramener progressivement la composition réelle vers la cible.</w:t>
+      </w:r>
+    </w:p>
+    <w:p>
+      <w:pPr>
+        <w:pStyle w:val="Heading3"/>
+        <w:spacing w:after="100" w:before="220"/>
+      </w:pPr>
+      <w:r>
+        <w:rPr>
+          <w:rFonts w:ascii="Calibri" w:cs="Calibri" w:eastAsia="Calibri" w:hAnsi="Calibri"/>
+          <w:b/>
+          <w:bCs/>
+          <w:color w:val="2E75B6"/>
+          <w:sz w:val="23"/>
+          <w:szCs w:val="23"/>
+        </w:rPr>
+        <w:t xml:space="preserve">État de départ vs cible</w:t>
+      </w:r>
+    </w:p>
+    <w:tbl>
+      <w:tblPr>
+        <w:tblW w:type="dxa" w:w="8826"/>
+        <w:tblBorders>
+          <w:top w:val="single" w:color="auto" w:sz="4"/>
+          <w:left w:val="single" w:color="auto" w:sz="4"/>
+          <w:bottom w:val="single" w:color="auto" w:sz="4"/>
+          <w:right w:val="single" w:color="auto" w:sz="4"/>
+          <w:insideH w:val="single" w:color="auto" w:sz="4"/>
+          <w:insideV w:val="single" w:color="auto" w:sz="4"/>
+        </w:tblBorders>
+      </w:tblPr>
+      <w:tblGrid>
+        <w:gridCol w:w="3700"/>
+        <w:gridCol w:w="1700"/>
+        <w:gridCol w:w="1700"/>
+        <w:gridCol w:w="1726"/>
+      </w:tblGrid>
+      <w:tr>
+        <w:trPr>
+          <w:tblHeader/>
+        </w:trPr>
+        <w:tc>
+          <w:tcPr>
+            <w:tcW w:type="dxa" w:w="3700"/>
+            <w:tcBorders>
+              <w:top w:val="single" w:color="CCCCCC" w:sz="4"/>
+              <w:left w:val="single" w:color="CCCCCC" w:sz="4"/>
+              <w:bottom w:val="single" w:color="CCCCCC" w:sz="4"/>
+              <w:right w:val="single" w:color="CCCCCC" w:sz="4"/>
+            </w:tcBorders>
+            <w:shd w:fill="1F4E79" w:val="clear"/>
+            <w:tcMar>
+              <w:top w:type="dxa" w:w="100"/>
+              <w:left w:type="dxa" w:w="140"/>
+              <w:bottom w:type="dxa" w:w="100"/>
+              <w:right w:type="dxa" w:w="140"/>
+            </w:tcMar>
+            <w:vAlign w:val="center"/>
+          </w:tcPr>
+          <w:p>
+            <w:pPr>
+              <w:jc w:val="left"/>
+            </w:pPr>
+            <w:r>
+              <w:rPr>
+                <w:rFonts w:ascii="Calibri" w:cs="Calibri" w:eastAsia="Calibri" w:hAnsi="Calibri"/>
+                <w:b/>
+                <w:bCs/>
+                <w:color w:val="FFFFFF"/>
+                <w:sz w:val="21"/>
+                <w:szCs w:val="21"/>
+              </w:rPr>
+              <w:t xml:space="preserve">ETF</w:t>
+            </w:r>
+          </w:p>
+        </w:tc>
+        <w:tc>
+          <w:tcPr>
+            <w:tcW w:type="dxa" w:w="1700"/>
+            <w:tcBorders>
+              <w:top w:val="single" w:color="CCCCCC" w:sz="4"/>
+              <w:left w:val="single" w:color="CCCCCC" w:sz="4"/>
+              <w:bottom w:val="single" w:color="CCCCCC" w:sz="4"/>
+              <w:right w:val="single" w:color="CCCCCC" w:sz="4"/>
+            </w:tcBorders>
+            <w:shd w:fill="1F4E79" w:val="clear"/>
+            <w:tcMar>
+              <w:top w:type="dxa" w:w="100"/>
+              <w:left w:type="dxa" w:w="140"/>
+              <w:bottom w:type="dxa" w:w="100"/>
+              <w:right w:type="dxa" w:w="140"/>
+            </w:tcMar>
+            <w:vAlign w:val="center"/>
+          </w:tcPr>
+          <w:p>
+            <w:pPr>
+              <w:jc w:val="left"/>
+            </w:pPr>
+            <w:r>
+              <w:rPr>
+                <w:rFonts w:ascii="Calibri" w:cs="Calibri" w:eastAsia="Calibri" w:hAnsi="Calibri"/>
+                <w:b/>
+                <w:bCs/>
+                <w:color w:val="FFFFFF"/>
+                <w:sz w:val="21"/>
+                <w:szCs w:val="21"/>
+              </w:rPr>
+              <w:t xml:space="preserve">% actuel</w:t>
+            </w:r>
+          </w:p>
+        </w:tc>
+        <w:tc>
+          <w:tcPr>
+            <w:tcW w:type="dxa" w:w="1700"/>
+            <w:tcBorders>
+              <w:top w:val="single" w:color="CCCCCC" w:sz="4"/>
+              <w:left w:val="single" w:color="CCCCCC" w:sz="4"/>
+              <w:bottom w:val="single" w:color="CCCCCC" w:sz="4"/>
+              <w:right w:val="single" w:color="CCCCCC" w:sz="4"/>
+            </w:tcBorders>
+            <w:shd w:fill="1F4E79" w:val="clear"/>
+            <w:tcMar>
+              <w:top w:type="dxa" w:w="100"/>
+              <w:left w:type="dxa" w:w="140"/>
+              <w:bottom w:type="dxa" w:w="100"/>
+              <w:right w:type="dxa" w:w="140"/>
+            </w:tcMar>
+            <w:vAlign w:val="center"/>
+          </w:tcPr>
+          <w:p>
+            <w:pPr>
+              <w:jc w:val="left"/>
+            </w:pPr>
+            <w:r>
+              <w:rPr>
+                <w:rFonts w:ascii="Calibri" w:cs="Calibri" w:eastAsia="Calibri" w:hAnsi="Calibri"/>
+                <w:b/>
+                <w:bCs/>
+                <w:color w:val="FFFFFF"/>
+                <w:sz w:val="21"/>
+                <w:szCs w:val="21"/>
+              </w:rPr>
+              <w:t xml:space="preserve">% cible</w:t>
+            </w:r>
+          </w:p>
+        </w:tc>
+        <w:tc>
+          <w:tcPr>
+            <w:tcW w:type="dxa" w:w="1726"/>
+            <w:tcBorders>
+              <w:top w:val="single" w:color="CCCCCC" w:sz="4"/>
+              <w:left w:val="single" w:color="CCCCCC" w:sz="4"/>
+              <w:bottom w:val="single" w:color="CCCCCC" w:sz="4"/>
+              <w:right w:val="single" w:color="CCCCCC" w:sz="4"/>
+            </w:tcBorders>
+            <w:shd w:fill="1F4E79" w:val="clear"/>
+            <w:tcMar>
+              <w:top w:type="dxa" w:w="100"/>
+              <w:left w:type="dxa" w:w="140"/>
+              <w:bottom w:type="dxa" w:w="100"/>
+              <w:right w:type="dxa" w:w="140"/>
+            </w:tcMar>
+            <w:vAlign w:val="center"/>
+          </w:tcPr>
+          <w:p>
+            <w:pPr>
+              <w:jc w:val="left"/>
+            </w:pPr>
+            <w:r>
+              <w:rPr>
+                <w:rFonts w:ascii="Calibri" w:cs="Calibri" w:eastAsia="Calibri" w:hAnsi="Calibri"/>
+                <w:b/>
+                <w:bCs/>
+                <w:color w:val="FFFFFF"/>
+                <w:sz w:val="21"/>
+                <w:szCs w:val="21"/>
+              </w:rPr>
+              <w:t xml:space="preserve">Écart</w:t>
+            </w:r>
+          </w:p>
+        </w:tc>
+      </w:tr>
+      <w:tr>
+        <w:tc>
+          <w:tcPr>
+            <w:tcW w:type="dxa" w:w="3700"/>
+            <w:tcBorders>
+              <w:top w:val="single" w:color="CCCCCC" w:sz="4"/>
+              <w:left w:val="single" w:color="CCCCCC" w:sz="4"/>
+              <w:bottom w:val="single" w:color="CCCCCC" w:sz="4"/>
+              <w:right w:val="single" w:color="CCCCCC" w:sz="4"/>
+            </w:tcBorders>
+            <w:tcMar>
+              <w:top w:type="dxa" w:w="100"/>
+              <w:left w:type="dxa" w:w="140"/>
+              <w:bottom w:type="dxa" w:w="100"/>
+              <w:right w:type="dxa" w:w="140"/>
+            </w:tcMar>
+            <w:vAlign w:val="center"/>
+          </w:tcPr>
+          <w:p>
+            <w:pPr>
+              <w:jc w:val="left"/>
+            </w:pPr>
+            <w:r>
+              <w:rPr>
+                <w:rFonts w:ascii="Calibri" w:cs="Calibri" w:eastAsia="Calibri" w:hAnsi="Calibri"/>
+                <w:color w:val="1F1F1F"/>
+                <w:sz w:val="21"/>
+                <w:szCs w:val="21"/>
+              </w:rPr>
+              <w:t xml:space="preserve">Amundi PEA Nasdaq-100</w:t>
+            </w:r>
+          </w:p>
+        </w:tc>
+        <w:tc>
+          <w:tcPr>
+            <w:tcW w:type="dxa" w:w="1700"/>
+            <w:tcBorders>
+              <w:top w:val="single" w:color="CCCCCC" w:sz="4"/>
+              <w:left w:val="single" w:color="CCCCCC" w:sz="4"/>
+              <w:bottom w:val="single" w:color="CCCCCC" w:sz="4"/>
+              <w:right w:val="single" w:color="CCCCCC" w:sz="4"/>
+            </w:tcBorders>
+            <w:tcMar>
+              <w:top w:type="dxa" w:w="100"/>
+              <w:left w:type="dxa" w:w="140"/>
+              <w:bottom w:type="dxa" w:w="100"/>
+              <w:right w:type="dxa" w:w="140"/>
+            </w:tcMar>
+            <w:vAlign w:val="center"/>
+          </w:tcPr>
+          <w:p>
+            <w:pPr>
+              <w:jc w:val="left"/>
+            </w:pPr>
+            <w:r>
+              <w:rPr>
+                <w:rFonts w:ascii="Calibri" w:cs="Calibri" w:eastAsia="Calibri" w:hAnsi="Calibri"/>
+                <w:color w:val="1F1F1F"/>
+                <w:sz w:val="21"/>
+                <w:szCs w:val="21"/>
+              </w:rPr>
+              <w:t xml:space="preserve">56 %</w:t>
+            </w:r>
+          </w:p>
+        </w:tc>
+        <w:tc>
+          <w:tcPr>
+            <w:tcW w:type="dxa" w:w="1700"/>
+            <w:tcBorders>
+              <w:top w:val="single" w:color="CCCCCC" w:sz="4"/>
+              <w:left w:val="single" w:color="CCCCCC" w:sz="4"/>
+              <w:bottom w:val="single" w:color="CCCCCC" w:sz="4"/>
+              <w:right w:val="single" w:color="CCCCCC" w:sz="4"/>
+            </w:tcBorders>
+            <w:tcMar>
+              <w:top w:type="dxa" w:w="100"/>
+              <w:left w:type="dxa" w:w="140"/>
+              <w:bottom w:type="dxa" w:w="100"/>
+              <w:right w:type="dxa" w:w="140"/>
+            </w:tcMar>
+            <w:vAlign w:val="center"/>
+          </w:tcPr>
+          <w:p>
+            <w:pPr>
+              <w:jc w:val="left"/>
+            </w:pPr>
+            <w:r>
+              <w:rPr>
+                <w:rFonts w:ascii="Calibri" w:cs="Calibri" w:eastAsia="Calibri" w:hAnsi="Calibri"/>
+                <w:color w:val="1F1F1F"/>
+                <w:sz w:val="21"/>
+                <w:szCs w:val="21"/>
+              </w:rPr>
+              <w:t xml:space="preserve">15 %</w:t>
+            </w:r>
+          </w:p>
+        </w:tc>
+        <w:tc>
+          <w:tcPr>
+            <w:tcW w:type="dxa" w:w="1726"/>
+            <w:tcBorders>
+              <w:top w:val="single" w:color="CCCCCC" w:sz="4"/>
+              <w:left w:val="single" w:color="CCCCCC" w:sz="4"/>
+              <w:bottom w:val="single" w:color="CCCCCC" w:sz="4"/>
+              <w:right w:val="single" w:color="CCCCCC" w:sz="4"/>
+            </w:tcBorders>
+            <w:tcMar>
+              <w:top w:type="dxa" w:w="100"/>
+              <w:left w:type="dxa" w:w="140"/>
+              <w:bottom w:type="dxa" w:w="100"/>
+              <w:right w:type="dxa" w:w="140"/>
+            </w:tcMar>
+            <w:vAlign w:val="center"/>
+          </w:tcPr>
+          <w:p>
+            <w:pPr>
+              <w:jc w:val="left"/>
+            </w:pPr>
+            <w:r>
+              <w:rPr>
+                <w:rFonts w:ascii="Calibri" w:cs="Calibri" w:eastAsia="Calibri" w:hAnsi="Calibri"/>
+                <w:color w:val="1F1F1F"/>
+                <w:sz w:val="21"/>
+                <w:szCs w:val="21"/>
+              </w:rPr>
+              <w:t xml:space="preserve">+41 pts</w:t>
+            </w:r>
+          </w:p>
+        </w:tc>
+      </w:tr>
+      <w:tr>
+        <w:tc>
+          <w:tcPr>
+            <w:tcW w:type="dxa" w:w="3700"/>
+            <w:tcBorders>
+              <w:top w:val="single" w:color="CCCCCC" w:sz="4"/>
+              <w:left w:val="single" w:color="CCCCCC" w:sz="4"/>
+              <w:bottom w:val="single" w:color="CCCCCC" w:sz="4"/>
+              <w:right w:val="single" w:color="CCCCCC" w:sz="4"/>
+            </w:tcBorders>
+            <w:shd w:fill="F2F2F2" w:val="clear"/>
+            <w:tcMar>
+              <w:top w:type="dxa" w:w="100"/>
+              <w:left w:type="dxa" w:w="140"/>
+              <w:bottom w:type="dxa" w:w="100"/>
+              <w:right w:type="dxa" w:w="140"/>
+            </w:tcMar>
+            <w:vAlign w:val="center"/>
+          </w:tcPr>
+          <w:p>
+            <w:pPr>
+              <w:jc w:val="left"/>
+            </w:pPr>
+            <w:r>
+              <w:rPr>
+                <w:rFonts w:ascii="Calibri" w:cs="Calibri" w:eastAsia="Calibri" w:hAnsi="Calibri"/>
+                <w:color w:val="1F1F1F"/>
+                <w:sz w:val="21"/>
+                <w:szCs w:val="21"/>
+              </w:rPr>
+              <w:t xml:space="preserve">BNPP Easy Stoxx Europe 600</w:t>
+            </w:r>
+          </w:p>
+        </w:tc>
+        <w:tc>
+          <w:tcPr>
+            <w:tcW w:type="dxa" w:w="1700"/>
+            <w:tcBorders>
+              <w:top w:val="single" w:color="CCCCCC" w:sz="4"/>
+              <w:left w:val="single" w:color="CCCCCC" w:sz="4"/>
+              <w:bottom w:val="single" w:color="CCCCCC" w:sz="4"/>
+              <w:right w:val="single" w:color="CCCCCC" w:sz="4"/>
+            </w:tcBorders>
+            <w:shd w:fill="F2F2F2" w:val="clear"/>
+            <w:tcMar>
+              <w:top w:type="dxa" w:w="100"/>
+              <w:left w:type="dxa" w:w="140"/>
+              <w:bottom w:type="dxa" w:w="100"/>
+              <w:right w:type="dxa" w:w="140"/>
+            </w:tcMar>
+            <w:vAlign w:val="center"/>
+          </w:tcPr>
+          <w:p>
+            <w:pPr>
+              <w:jc w:val="left"/>
+            </w:pPr>
+            <w:r>
+              <w:rPr>
+                <w:rFonts w:ascii="Calibri" w:cs="Calibri" w:eastAsia="Calibri" w:hAnsi="Calibri"/>
+                <w:color w:val="1F1F1F"/>
+                <w:sz w:val="21"/>
+                <w:szCs w:val="21"/>
+              </w:rPr>
+              <w:t xml:space="preserve">33 %</w:t>
+            </w:r>
+          </w:p>
+        </w:tc>
+        <w:tc>
+          <w:tcPr>
+            <w:tcW w:type="dxa" w:w="1700"/>
+            <w:tcBorders>
+              <w:top w:val="single" w:color="CCCCCC" w:sz="4"/>
+              <w:left w:val="single" w:color="CCCCCC" w:sz="4"/>
+              <w:bottom w:val="single" w:color="CCCCCC" w:sz="4"/>
+              <w:right w:val="single" w:color="CCCCCC" w:sz="4"/>
+            </w:tcBorders>
+            <w:shd w:fill="F2F2F2" w:val="clear"/>
+            <w:tcMar>
+              <w:top w:type="dxa" w:w="100"/>
+              <w:left w:type="dxa" w:w="140"/>
+              <w:bottom w:type="dxa" w:w="100"/>
+              <w:right w:type="dxa" w:w="140"/>
+            </w:tcMar>
+            <w:vAlign w:val="center"/>
+          </w:tcPr>
+          <w:p>
+            <w:pPr>
+              <w:jc w:val="left"/>
+            </w:pPr>
+            <w:r>
+              <w:rPr>
+                <w:rFonts w:ascii="Calibri" w:cs="Calibri" w:eastAsia="Calibri" w:hAnsi="Calibri"/>
+                <w:color w:val="1F1F1F"/>
+                <w:sz w:val="21"/>
+                <w:szCs w:val="21"/>
+              </w:rPr>
+              <w:t xml:space="preserve">25 %</w:t>
+            </w:r>
+          </w:p>
+        </w:tc>
+        <w:tc>
+          <w:tcPr>
+            <w:tcW w:type="dxa" w:w="1726"/>
+            <w:tcBorders>
+              <w:top w:val="single" w:color="CCCCCC" w:sz="4"/>
+              <w:left w:val="single" w:color="CCCCCC" w:sz="4"/>
+              <w:bottom w:val="single" w:color="CCCCCC" w:sz="4"/>
+              <w:right w:val="single" w:color="CCCCCC" w:sz="4"/>
+            </w:tcBorders>
+            <w:shd w:fill="F2F2F2" w:val="clear"/>
+            <w:tcMar>
+              <w:top w:type="dxa" w:w="100"/>
+              <w:left w:type="dxa" w:w="140"/>
+              <w:bottom w:type="dxa" w:w="100"/>
+              <w:right w:type="dxa" w:w="140"/>
+            </w:tcMar>
+            <w:vAlign w:val="center"/>
+          </w:tcPr>
+          <w:p>
+            <w:pPr>
+              <w:jc w:val="left"/>
+            </w:pPr>
+            <w:r>
+              <w:rPr>
+                <w:rFonts w:ascii="Calibri" w:cs="Calibri" w:eastAsia="Calibri" w:hAnsi="Calibri"/>
+                <w:color w:val="1F1F1F"/>
+                <w:sz w:val="21"/>
+                <w:szCs w:val="21"/>
+              </w:rPr>
+              <w:t xml:space="preserve">+8 pts</w:t>
+            </w:r>
+          </w:p>
+        </w:tc>
+      </w:tr>
+      <w:tr>
+        <w:tc>
+          <w:tcPr>
+            <w:tcW w:type="dxa" w:w="3700"/>
+            <w:tcBorders>
+              <w:top w:val="single" w:color="CCCCCC" w:sz="4"/>
+              <w:left w:val="single" w:color="CCCCCC" w:sz="4"/>
+              <w:bottom w:val="single" w:color="CCCCCC" w:sz="4"/>
+              <w:right w:val="single" w:color="CCCCCC" w:sz="4"/>
+            </w:tcBorders>
+            <w:tcMar>
+              <w:top w:type="dxa" w:w="100"/>
+              <w:left w:type="dxa" w:w="140"/>
+              <w:bottom w:type="dxa" w:w="100"/>
+              <w:right w:type="dxa" w:w="140"/>
+            </w:tcMar>
+            <w:vAlign w:val="center"/>
+          </w:tcPr>
+          <w:p>
+            <w:pPr>
+              <w:jc w:val="left"/>
+            </w:pPr>
+            <w:r>
+              <w:rPr>
+                <w:rFonts w:ascii="Calibri" w:cs="Calibri" w:eastAsia="Calibri" w:hAnsi="Calibri"/>
+                <w:color w:val="1F1F1F"/>
+                <w:sz w:val="21"/>
+                <w:szCs w:val="21"/>
+              </w:rPr>
+              <w:t xml:space="preserve">Amundi PEA MSCI Emerging ESG</w:t>
+            </w:r>
+          </w:p>
+        </w:tc>
+        <w:tc>
+          <w:tcPr>
+            <w:tcW w:type="dxa" w:w="1700"/>
+            <w:tcBorders>
+              <w:top w:val="single" w:color="CCCCCC" w:sz="4"/>
+              <w:left w:val="single" w:color="CCCCCC" w:sz="4"/>
+              <w:bottom w:val="single" w:color="CCCCCC" w:sz="4"/>
+              <w:right w:val="single" w:color="CCCCCC" w:sz="4"/>
+            </w:tcBorders>
+            <w:tcMar>
+              <w:top w:type="dxa" w:w="100"/>
+              <w:left w:type="dxa" w:w="140"/>
+              <w:bottom w:type="dxa" w:w="100"/>
+              <w:right w:type="dxa" w:w="140"/>
+            </w:tcMar>
+            <w:vAlign w:val="center"/>
+          </w:tcPr>
+          <w:p>
+            <w:pPr>
+              <w:jc w:val="left"/>
+            </w:pPr>
+            <w:r>
+              <w:rPr>
+                <w:rFonts w:ascii="Calibri" w:cs="Calibri" w:eastAsia="Calibri" w:hAnsi="Calibri"/>
+                <w:color w:val="1F1F1F"/>
+                <w:sz w:val="21"/>
+                <w:szCs w:val="21"/>
+              </w:rPr>
+              <w:t xml:space="preserve">9 %</w:t>
+            </w:r>
+          </w:p>
+        </w:tc>
+        <w:tc>
+          <w:tcPr>
+            <w:tcW w:type="dxa" w:w="1700"/>
+            <w:tcBorders>
+              <w:top w:val="single" w:color="CCCCCC" w:sz="4"/>
+              <w:left w:val="single" w:color="CCCCCC" w:sz="4"/>
+              <w:bottom w:val="single" w:color="CCCCCC" w:sz="4"/>
+              <w:right w:val="single" w:color="CCCCCC" w:sz="4"/>
+            </w:tcBorders>
+            <w:tcMar>
+              <w:top w:type="dxa" w:w="100"/>
+              <w:left w:type="dxa" w:w="140"/>
+              <w:bottom w:type="dxa" w:w="100"/>
+              <w:right w:type="dxa" w:w="140"/>
+            </w:tcMar>
+            <w:vAlign w:val="center"/>
+          </w:tcPr>
+          <w:p>
+            <w:pPr>
+              <w:jc w:val="left"/>
+            </w:pPr>
+            <w:r>
+              <w:rPr>
+                <w:rFonts w:ascii="Calibri" w:cs="Calibri" w:eastAsia="Calibri" w:hAnsi="Calibri"/>
+                <w:color w:val="1F1F1F"/>
+                <w:sz w:val="21"/>
+                <w:szCs w:val="21"/>
+              </w:rPr>
+              <w:t xml:space="preserve">15 %</w:t>
+            </w:r>
+          </w:p>
+        </w:tc>
+        <w:tc>
+          <w:tcPr>
+            <w:tcW w:type="dxa" w:w="1726"/>
+            <w:tcBorders>
+              <w:top w:val="single" w:color="CCCCCC" w:sz="4"/>
+              <w:left w:val="single" w:color="CCCCCC" w:sz="4"/>
+              <w:bottom w:val="single" w:color="CCCCCC" w:sz="4"/>
+              <w:right w:val="single" w:color="CCCCCC" w:sz="4"/>
+            </w:tcBorders>
+            <w:tcMar>
+              <w:top w:type="dxa" w:w="100"/>
+              <w:left w:type="dxa" w:w="140"/>
+              <w:bottom w:type="dxa" w:w="100"/>
+              <w:right w:type="dxa" w:w="140"/>
+            </w:tcMar>
+            <w:vAlign w:val="center"/>
+          </w:tcPr>
+          <w:p>
+            <w:pPr>
+              <w:jc w:val="left"/>
+            </w:pPr>
+            <w:r>
+              <w:rPr>
+                <w:rFonts w:ascii="Calibri" w:cs="Calibri" w:eastAsia="Calibri" w:hAnsi="Calibri"/>
+                <w:color w:val="1F1F1F"/>
+                <w:sz w:val="21"/>
+                <w:szCs w:val="21"/>
+              </w:rPr>
+              <w:t xml:space="preserve">−6 pts</w:t>
+            </w:r>
+          </w:p>
+        </w:tc>
+      </w:tr>
+      <w:tr>
+        <w:tc>
+          <w:tcPr>
+            <w:tcW w:type="dxa" w:w="3700"/>
+            <w:tcBorders>
+              <w:top w:val="single" w:color="CCCCCC" w:sz="4"/>
+              <w:left w:val="single" w:color="CCCCCC" w:sz="4"/>
+              <w:bottom w:val="single" w:color="CCCCCC" w:sz="4"/>
+              <w:right w:val="single" w:color="CCCCCC" w:sz="4"/>
+            </w:tcBorders>
+            <w:shd w:fill="F2F2F2" w:val="clear"/>
+            <w:tcMar>
+              <w:top w:type="dxa" w:w="100"/>
+              <w:left w:type="dxa" w:w="140"/>
+              <w:bottom w:type="dxa" w:w="100"/>
+              <w:right w:type="dxa" w:w="140"/>
+            </w:tcMar>
+            <w:vAlign w:val="center"/>
+          </w:tcPr>
+          <w:p>
+            <w:pPr>
+              <w:jc w:val="left"/>
+            </w:pPr>
+            <w:r>
+              <w:rPr>
+                <w:rFonts w:ascii="Calibri" w:cs="Calibri" w:eastAsia="Calibri" w:hAnsi="Calibri"/>
+                <w:color w:val="1F1F1F"/>
+                <w:sz w:val="21"/>
+                <w:szCs w:val="21"/>
+              </w:rPr>
+              <w:t xml:space="preserve">Amundi PEA S&amp;P 500</w:t>
+            </w:r>
+          </w:p>
+        </w:tc>
+        <w:tc>
+          <w:tcPr>
+            <w:tcW w:type="dxa" w:w="1700"/>
+            <w:tcBorders>
+              <w:top w:val="single" w:color="CCCCCC" w:sz="4"/>
+              <w:left w:val="single" w:color="CCCCCC" w:sz="4"/>
+              <w:bottom w:val="single" w:color="CCCCCC" w:sz="4"/>
+              <w:right w:val="single" w:color="CCCCCC" w:sz="4"/>
+            </w:tcBorders>
+            <w:shd w:fill="F2F2F2" w:val="clear"/>
+            <w:tcMar>
+              <w:top w:type="dxa" w:w="100"/>
+              <w:left w:type="dxa" w:w="140"/>
+              <w:bottom w:type="dxa" w:w="100"/>
+              <w:right w:type="dxa" w:w="140"/>
+            </w:tcMar>
+            <w:vAlign w:val="center"/>
+          </w:tcPr>
+          <w:p>
+            <w:pPr>
+              <w:jc w:val="left"/>
+            </w:pPr>
+            <w:r>
+              <w:rPr>
+                <w:rFonts w:ascii="Calibri" w:cs="Calibri" w:eastAsia="Calibri" w:hAnsi="Calibri"/>
+                <w:color w:val="1F1F1F"/>
+                <w:sz w:val="21"/>
+                <w:szCs w:val="21"/>
+              </w:rPr>
+              <w:t xml:space="preserve">0 %</w:t>
+            </w:r>
+          </w:p>
+        </w:tc>
+        <w:tc>
+          <w:tcPr>
+            <w:tcW w:type="dxa" w:w="1700"/>
+            <w:tcBorders>
+              <w:top w:val="single" w:color="CCCCCC" w:sz="4"/>
+              <w:left w:val="single" w:color="CCCCCC" w:sz="4"/>
+              <w:bottom w:val="single" w:color="CCCCCC" w:sz="4"/>
+              <w:right w:val="single" w:color="CCCCCC" w:sz="4"/>
+            </w:tcBorders>
+            <w:shd w:fill="F2F2F2" w:val="clear"/>
+            <w:tcMar>
+              <w:top w:type="dxa" w:w="100"/>
+              <w:left w:type="dxa" w:w="140"/>
+              <w:bottom w:type="dxa" w:w="100"/>
+              <w:right w:type="dxa" w:w="140"/>
+            </w:tcMar>
+            <w:vAlign w:val="center"/>
+          </w:tcPr>
+          <w:p>
+            <w:pPr>
+              <w:jc w:val="left"/>
+            </w:pPr>
+            <w:r>
+              <w:rPr>
+                <w:rFonts w:ascii="Calibri" w:cs="Calibri" w:eastAsia="Calibri" w:hAnsi="Calibri"/>
+                <w:color w:val="1F1F1F"/>
+                <w:sz w:val="21"/>
+                <w:szCs w:val="21"/>
+              </w:rPr>
+              <w:t xml:space="preserve">30 %</w:t>
+            </w:r>
+          </w:p>
+        </w:tc>
+        <w:tc>
+          <w:tcPr>
+            <w:tcW w:type="dxa" w:w="1726"/>
+            <w:tcBorders>
+              <w:top w:val="single" w:color="CCCCCC" w:sz="4"/>
+              <w:left w:val="single" w:color="CCCCCC" w:sz="4"/>
+              <w:bottom w:val="single" w:color="CCCCCC" w:sz="4"/>
+              <w:right w:val="single" w:color="CCCCCC" w:sz="4"/>
+            </w:tcBorders>
+            <w:shd w:fill="F2F2F2" w:val="clear"/>
+            <w:tcMar>
+              <w:top w:type="dxa" w:w="100"/>
+              <w:left w:type="dxa" w:w="140"/>
+              <w:bottom w:type="dxa" w:w="100"/>
+              <w:right w:type="dxa" w:w="140"/>
+            </w:tcMar>
+            <w:vAlign w:val="center"/>
+          </w:tcPr>
+          <w:p>
+            <w:pPr>
+              <w:jc w:val="left"/>
+            </w:pPr>
+            <w:r>
+              <w:rPr>
+                <w:rFonts w:ascii="Calibri" w:cs="Calibri" w:eastAsia="Calibri" w:hAnsi="Calibri"/>
+                <w:color w:val="1F1F1F"/>
+                <w:sz w:val="21"/>
+                <w:szCs w:val="21"/>
+              </w:rPr>
+              <w:t xml:space="preserve">−30 pts</w:t>
+            </w:r>
+          </w:p>
+        </w:tc>
+      </w:tr>
+      <w:tr>
+        <w:tc>
+          <w:tcPr>
+            <w:tcW w:type="dxa" w:w="3700"/>
+            <w:tcBorders>
+              <w:top w:val="single" w:color="CCCCCC" w:sz="4"/>
+              <w:left w:val="single" w:color="CCCCCC" w:sz="4"/>
+              <w:bottom w:val="single" w:color="CCCCCC" w:sz="4"/>
+              <w:right w:val="single" w:color="CCCCCC" w:sz="4"/>
+            </w:tcBorders>
+            <w:tcMar>
+              <w:top w:type="dxa" w:w="100"/>
+              <w:left w:type="dxa" w:w="140"/>
+              <w:bottom w:type="dxa" w:w="100"/>
+              <w:right w:type="dxa" w:w="140"/>
+            </w:tcMar>
+            <w:vAlign w:val="center"/>
+          </w:tcPr>
+          <w:p>
+            <w:pPr>
+              <w:jc w:val="left"/>
+            </w:pPr>
+            <w:r>
+              <w:rPr>
+                <w:rFonts w:ascii="Calibri" w:cs="Calibri" w:eastAsia="Calibri" w:hAnsi="Calibri"/>
+                <w:color w:val="1F1F1F"/>
+                <w:sz w:val="21"/>
+                <w:szCs w:val="21"/>
+              </w:rPr>
+              <w:t xml:space="preserve">Amundi PEA Europe Small Cap</w:t>
+            </w:r>
+          </w:p>
+        </w:tc>
+        <w:tc>
+          <w:tcPr>
+            <w:tcW w:type="dxa" w:w="1700"/>
+            <w:tcBorders>
+              <w:top w:val="single" w:color="CCCCCC" w:sz="4"/>
+              <w:left w:val="single" w:color="CCCCCC" w:sz="4"/>
+              <w:bottom w:val="single" w:color="CCCCCC" w:sz="4"/>
+              <w:right w:val="single" w:color="CCCCCC" w:sz="4"/>
+            </w:tcBorders>
+            <w:tcMar>
+              <w:top w:type="dxa" w:w="100"/>
+              <w:left w:type="dxa" w:w="140"/>
+              <w:bottom w:type="dxa" w:w="100"/>
+              <w:right w:type="dxa" w:w="140"/>
+            </w:tcMar>
+            <w:vAlign w:val="center"/>
+          </w:tcPr>
+          <w:p>
+            <w:pPr>
+              <w:jc w:val="left"/>
+            </w:pPr>
+            <w:r>
+              <w:rPr>
+                <w:rFonts w:ascii="Calibri" w:cs="Calibri" w:eastAsia="Calibri" w:hAnsi="Calibri"/>
+                <w:color w:val="1F1F1F"/>
+                <w:sz w:val="21"/>
+                <w:szCs w:val="21"/>
+              </w:rPr>
+              <w:t xml:space="preserve">0 %</w:t>
+            </w:r>
+          </w:p>
+        </w:tc>
+        <w:tc>
+          <w:tcPr>
+            <w:tcW w:type="dxa" w:w="1700"/>
+            <w:tcBorders>
+              <w:top w:val="single" w:color="CCCCCC" w:sz="4"/>
+              <w:left w:val="single" w:color="CCCCCC" w:sz="4"/>
+              <w:bottom w:val="single" w:color="CCCCCC" w:sz="4"/>
+              <w:right w:val="single" w:color="CCCCCC" w:sz="4"/>
+            </w:tcBorders>
+            <w:tcMar>
+              <w:top w:type="dxa" w:w="100"/>
+              <w:left w:type="dxa" w:w="140"/>
+              <w:bottom w:type="dxa" w:w="100"/>
+              <w:right w:type="dxa" w:w="140"/>
+            </w:tcMar>
+            <w:vAlign w:val="center"/>
+          </w:tcPr>
+          <w:p>
+            <w:pPr>
+              <w:jc w:val="left"/>
+            </w:pPr>
+            <w:r>
+              <w:rPr>
+                <w:rFonts w:ascii="Calibri" w:cs="Calibri" w:eastAsia="Calibri" w:hAnsi="Calibri"/>
+                <w:color w:val="1F1F1F"/>
+                <w:sz w:val="21"/>
+                <w:szCs w:val="21"/>
+              </w:rPr>
+              <w:t xml:space="preserve">10 %</w:t>
+            </w:r>
+          </w:p>
+        </w:tc>
+        <w:tc>
+          <w:tcPr>
+            <w:tcW w:type="dxa" w:w="1726"/>
+            <w:tcBorders>
+              <w:top w:val="single" w:color="CCCCCC" w:sz="4"/>
+              <w:left w:val="single" w:color="CCCCCC" w:sz="4"/>
+              <w:bottom w:val="single" w:color="CCCCCC" w:sz="4"/>
+              <w:right w:val="single" w:color="CCCCCC" w:sz="4"/>
+            </w:tcBorders>
+            <w:tcMar>
+              <w:top w:type="dxa" w:w="100"/>
+              <w:left w:type="dxa" w:w="140"/>
+              <w:bottom w:type="dxa" w:w="100"/>
+              <w:right w:type="dxa" w:w="140"/>
+            </w:tcMar>
+            <w:vAlign w:val="center"/>
+          </w:tcPr>
+          <w:p>
+            <w:pPr>
+              <w:jc w:val="left"/>
+            </w:pPr>
+            <w:r>
+              <w:rPr>
+                <w:rFonts w:ascii="Calibri" w:cs="Calibri" w:eastAsia="Calibri" w:hAnsi="Calibri"/>
+                <w:color w:val="1F1F1F"/>
+                <w:sz w:val="21"/>
+                <w:szCs w:val="21"/>
+              </w:rPr>
+              <w:t xml:space="preserve">−10 pts</w:t>
+            </w:r>
+          </w:p>
+        </w:tc>
+      </w:tr>
+      <w:tr>
+        <w:tc>
+          <w:tcPr>
+            <w:tcW w:type="dxa" w:w="3700"/>
+            <w:tcBorders>
+              <w:top w:val="single" w:color="CCCCCC" w:sz="4"/>
+              <w:left w:val="single" w:color="CCCCCC" w:sz="4"/>
+              <w:bottom w:val="single" w:color="CCCCCC" w:sz="4"/>
+              <w:right w:val="single" w:color="CCCCCC" w:sz="4"/>
+            </w:tcBorders>
+            <w:shd w:fill="F2F2F2" w:val="clear"/>
+            <w:tcMar>
+              <w:top w:type="dxa" w:w="100"/>
+              <w:left w:type="dxa" w:w="140"/>
+              <w:bottom w:type="dxa" w:w="100"/>
+              <w:right w:type="dxa" w:w="140"/>
+            </w:tcMar>
+            <w:vAlign w:val="center"/>
+          </w:tcPr>
+          <w:p>
+            <w:pPr>
+              <w:jc w:val="left"/>
+            </w:pPr>
+            <w:r>
+              <w:rPr>
+                <w:rFonts w:ascii="Calibri" w:cs="Calibri" w:eastAsia="Calibri" w:hAnsi="Calibri"/>
+                <w:color w:val="1F1F1F"/>
+                <w:sz w:val="21"/>
+                <w:szCs w:val="21"/>
+              </w:rPr>
+              <w:t xml:space="preserve">Cash structurel</w:t>
+            </w:r>
+          </w:p>
+        </w:tc>
+        <w:tc>
+          <w:tcPr>
+            <w:tcW w:type="dxa" w:w="1700"/>
+            <w:tcBorders>
+              <w:top w:val="single" w:color="CCCCCC" w:sz="4"/>
+              <w:left w:val="single" w:color="CCCCCC" w:sz="4"/>
+              <w:bottom w:val="single" w:color="CCCCCC" w:sz="4"/>
+              <w:right w:val="single" w:color="CCCCCC" w:sz="4"/>
+            </w:tcBorders>
+            <w:shd w:fill="F2F2F2" w:val="clear"/>
+            <w:tcMar>
+              <w:top w:type="dxa" w:w="100"/>
+              <w:left w:type="dxa" w:w="140"/>
+              <w:bottom w:type="dxa" w:w="100"/>
+              <w:right w:type="dxa" w:w="140"/>
+            </w:tcMar>
+            <w:vAlign w:val="center"/>
+          </w:tcPr>
+          <w:p>
+            <w:pPr>
+              <w:jc w:val="left"/>
+            </w:pPr>
+            <w:r>
+              <w:rPr>
+                <w:rFonts w:ascii="Calibri" w:cs="Calibri" w:eastAsia="Calibri" w:hAnsi="Calibri"/>
+                <w:color w:val="1F1F1F"/>
+                <w:sz w:val="21"/>
+                <w:szCs w:val="21"/>
+              </w:rPr>
+              <w:t xml:space="preserve">1 %</w:t>
+            </w:r>
+          </w:p>
+        </w:tc>
+        <w:tc>
+          <w:tcPr>
+            <w:tcW w:type="dxa" w:w="1700"/>
+            <w:tcBorders>
+              <w:top w:val="single" w:color="CCCCCC" w:sz="4"/>
+              <w:left w:val="single" w:color="CCCCCC" w:sz="4"/>
+              <w:bottom w:val="single" w:color="CCCCCC" w:sz="4"/>
+              <w:right w:val="single" w:color="CCCCCC" w:sz="4"/>
+            </w:tcBorders>
+            <w:shd w:fill="F2F2F2" w:val="clear"/>
+            <w:tcMar>
+              <w:top w:type="dxa" w:w="100"/>
+              <w:left w:type="dxa" w:w="140"/>
+              <w:bottom w:type="dxa" w:w="100"/>
+              <w:right w:type="dxa" w:w="140"/>
+            </w:tcMar>
+            <w:vAlign w:val="center"/>
+          </w:tcPr>
+          <w:p>
+            <w:pPr>
+              <w:jc w:val="left"/>
+            </w:pPr>
+            <w:r>
+              <w:rPr>
+                <w:rFonts w:ascii="Calibri" w:cs="Calibri" w:eastAsia="Calibri" w:hAnsi="Calibri"/>
+                <w:color w:val="1F1F1F"/>
+                <w:sz w:val="21"/>
+                <w:szCs w:val="21"/>
+              </w:rPr>
+              <w:t xml:space="preserve">5 %</w:t>
+            </w:r>
+          </w:p>
+        </w:tc>
+        <w:tc>
+          <w:tcPr>
+            <w:tcW w:type="dxa" w:w="1726"/>
+            <w:tcBorders>
+              <w:top w:val="single" w:color="CCCCCC" w:sz="4"/>
+              <w:left w:val="single" w:color="CCCCCC" w:sz="4"/>
+              <w:bottom w:val="single" w:color="CCCCCC" w:sz="4"/>
+              <w:right w:val="single" w:color="CCCCCC" w:sz="4"/>
+            </w:tcBorders>
+            <w:shd w:fill="F2F2F2" w:val="clear"/>
+            <w:tcMar>
+              <w:top w:type="dxa" w:w="100"/>
+              <w:left w:type="dxa" w:w="140"/>
+              <w:bottom w:type="dxa" w:w="100"/>
+              <w:right w:type="dxa" w:w="140"/>
+            </w:tcMar>
+            <w:vAlign w:val="center"/>
+          </w:tcPr>
+          <w:p>
+            <w:pPr>
+              <w:jc w:val="left"/>
+            </w:pPr>
+            <w:r>
+              <w:rPr>
+                <w:rFonts w:ascii="Calibri" w:cs="Calibri" w:eastAsia="Calibri" w:hAnsi="Calibri"/>
+                <w:color w:val="1F1F1F"/>
+                <w:sz w:val="21"/>
+                <w:szCs w:val="21"/>
+              </w:rPr>
+              <w:t xml:space="preserve">−4 pts</w:t>
+            </w:r>
+          </w:p>
+        </w:tc>
+      </w:tr>
+    </w:tbl>
+    <w:p>
+      <w:pPr>
+        <w:spacing w:after="240"/>
+      </w:pPr>
+    </w:p>
+    <w:p>
+      <w:pPr>
+        <w:spacing w:after="120" w:before="0" w:line="300"/>
+      </w:pPr>
+      <w:r>
+        <w:rPr>
+          <w:rFonts w:ascii="Calibri" w:cs="Calibri" w:eastAsia="Calibri" w:hAnsi="Calibri"/>
+          <w:b/>
+          <w:bCs/>
+          <w:color w:val="1F1F1F"/>
+          <w:sz w:val="22"/>
+          <w:szCs w:val="22"/>
+        </w:rPr>
+        <w:t xml:space="preserve">Principe de la trajectoire : </w:t>
+      </w:r>
+      <w:r>
+        <w:rPr>
+          <w:rFonts w:ascii="Calibri" w:cs="Calibri" w:eastAsia="Calibri" w:hAnsi="Calibri"/>
+          <w:color w:val="1F1F1F"/>
+          <w:sz w:val="22"/>
+          <w:szCs w:val="22"/>
+        </w:rPr>
+        <w:t xml:space="preserve">convergence par dilution via DCA orienté, sans vente brutale. Le DCA mensuel est dirigé prioritairement vers les classes manquantes ou sous-pondérées, ce qui réduit mécaniquement le poids relatif des classes sur-pondérées sans cristalliser de plus-values, sans subir le settlement T+2 de bascule, et sans générer de tracking error temporaire.</w:t>
+      </w:r>
+    </w:p>
+    <w:p>
+      <w:pPr>
+        <w:pStyle w:val="Heading3"/>
+        <w:spacing w:after="100" w:before="220"/>
+      </w:pPr>
+      <w:r>
+        <w:rPr>
+          <w:rFonts w:ascii="Calibri" w:cs="Calibri" w:eastAsia="Calibri" w:hAnsi="Calibri"/>
+          <w:b/>
+          <w:bCs/>
+          <w:color w:val="2E75B6"/>
+          <w:sz w:val="23"/>
+          <w:szCs w:val="23"/>
+        </w:rPr>
+        <w:t xml:space="preserve">Règle d'allocation pendant la phase de convergence</w:t>
+      </w:r>
+    </w:p>
+    <w:p>
+      <w:pPr>
+        <w:spacing w:after="120" w:before="0" w:line="300"/>
+      </w:pPr>
+      <w:r>
+        <w:rPr>
+          <w:rFonts w:ascii="Calibri" w:cs="Calibri" w:eastAsia="Calibri" w:hAnsi="Calibri"/>
+          <w:color w:val="1F1F1F"/>
+          <w:sz w:val="22"/>
+          <w:szCs w:val="22"/>
+        </w:rPr>
+        <w:t xml:space="preserve">Pendant les 18 premiers mois post-transfert, l'allocation du DCA mensuel suit cette priorité, dans l'ordre :</w:t>
+      </w:r>
+    </w:p>
+    <w:p>
+      <w:pPr>
+        <w:pStyle w:val="ListParagraph"/>
+        <w:numPr>
+          <w:ilvl w:val="0"/>
+          <w:numId w:val="3"/>
+        </w:numPr>
+        <w:spacing w:after="80" w:line="280"/>
+      </w:pPr>
+      <w:r>
+        <w:rPr>
+          <w:rFonts w:ascii="Calibri" w:cs="Calibri" w:eastAsia="Calibri" w:hAnsi="Calibri"/>
+          <w:color w:val="1F1F1F"/>
+          <w:sz w:val="22"/>
+          <w:szCs w:val="22"/>
+        </w:rPr>
+        <w:t xml:space="preserve">Si une ligne cible représente moins de 30 % de sa pondération cible (en absolu) → DCA prioritaire dessus.</w:t>
+      </w:r>
+    </w:p>
+    <w:p>
+      <w:pPr>
+        <w:pStyle w:val="ListParagraph"/>
+        <w:numPr>
+          <w:ilvl w:val="0"/>
+          <w:numId w:val="3"/>
+        </w:numPr>
+        <w:spacing w:after="80" w:line="280"/>
+      </w:pPr>
+      <w:r>
+        <w:rPr>
+          <w:rFonts w:ascii="Calibri" w:cs="Calibri" w:eastAsia="Calibri" w:hAnsi="Calibri"/>
+          <w:color w:val="1F1F1F"/>
+          <w:sz w:val="22"/>
+          <w:szCs w:val="22"/>
+        </w:rPr>
+        <w:t xml:space="preserve">Sinon, DCA sur la ligne avec le plus grand écart négatif à la cible (en points de pourcentage).</w:t>
+      </w:r>
+    </w:p>
+    <w:p>
+      <w:pPr>
+        <w:pStyle w:val="ListParagraph"/>
+        <w:numPr>
+          <w:ilvl w:val="0"/>
+          <w:numId w:val="3"/>
+        </w:numPr>
+        <w:spacing w:after="80" w:line="280"/>
+      </w:pPr>
+      <w:r>
+        <w:rPr>
+          <w:rFonts w:ascii="Calibri" w:cs="Calibri" w:eastAsia="Calibri" w:hAnsi="Calibri"/>
+          <w:color w:val="1F1F1F"/>
+          <w:sz w:val="22"/>
+          <w:szCs w:val="22"/>
+        </w:rPr>
+        <w:t xml:space="preserve">Aucun rebalancement par vente pendant cette phase.</w:t>
+      </w:r>
+    </w:p>
+    <w:p>
+      <w:pPr>
+        <w:pStyle w:val="ListParagraph"/>
+        <w:numPr>
+          <w:ilvl w:val="0"/>
+          <w:numId w:val="3"/>
+        </w:numPr>
+        <w:spacing w:after="80" w:line="280"/>
+      </w:pPr>
+      <w:r>
+        <w:rPr>
+          <w:rFonts w:ascii="Calibri" w:cs="Calibri" w:eastAsia="Calibri" w:hAnsi="Calibri"/>
+          <w:color w:val="1F1F1F"/>
+          <w:sz w:val="22"/>
+          <w:szCs w:val="22"/>
+        </w:rPr>
+        <w:t xml:space="preserve">Aucun overlay défensif activé (la couche défensive arrive en Phase 3).</w:t>
+      </w:r>
+    </w:p>
+    <w:p>
+      <w:pPr>
+        <w:pStyle w:val="Heading3"/>
+        <w:spacing w:after="100" w:before="220"/>
+      </w:pPr>
+      <w:r>
+        <w:rPr>
+          <w:rFonts w:ascii="Calibri" w:cs="Calibri" w:eastAsia="Calibri" w:hAnsi="Calibri"/>
+          <w:b/>
+          <w:bCs/>
+          <w:color w:val="2E75B6"/>
+          <w:sz w:val="23"/>
+          <w:szCs w:val="23"/>
+        </w:rPr>
+        <w:t xml:space="preserve">Calendrier de convergence indicatif</w:t>
+      </w:r>
+    </w:p>
+    <w:tbl>
+      <w:tblPr>
+        <w:tblW w:type="dxa" w:w="9126"/>
+        <w:tblBorders>
+          <w:top w:val="single" w:color="auto" w:sz="4"/>
+          <w:left w:val="single" w:color="auto" w:sz="4"/>
+          <w:bottom w:val="single" w:color="auto" w:sz="4"/>
+          <w:right w:val="single" w:color="auto" w:sz="4"/>
+          <w:insideH w:val="single" w:color="auto" w:sz="4"/>
+          <w:insideV w:val="single" w:color="auto" w:sz="4"/>
+        </w:tblBorders>
+      </w:tblPr>
+      <w:tblGrid>
+        <w:gridCol w:w="2200"/>
+        <w:gridCol w:w="3500"/>
+        <w:gridCol w:w="3426"/>
+      </w:tblGrid>
+      <w:tr>
+        <w:trPr>
+          <w:tblHeader/>
+        </w:trPr>
+        <w:tc>
+          <w:tcPr>
+            <w:tcW w:type="dxa" w:w="2200"/>
+            <w:tcBorders>
+              <w:top w:val="single" w:color="CCCCCC" w:sz="4"/>
+              <w:left w:val="single" w:color="CCCCCC" w:sz="4"/>
+              <w:bottom w:val="single" w:color="CCCCCC" w:sz="4"/>
+              <w:right w:val="single" w:color="CCCCCC" w:sz="4"/>
+            </w:tcBorders>
+            <w:shd w:fill="1F4E79" w:val="clear"/>
+            <w:tcMar>
+              <w:top w:type="dxa" w:w="100"/>
+              <w:left w:type="dxa" w:w="140"/>
+              <w:bottom w:type="dxa" w:w="100"/>
+              <w:right w:type="dxa" w:w="140"/>
+            </w:tcMar>
+            <w:vAlign w:val="center"/>
+          </w:tcPr>
+          <w:p>
+            <w:pPr>
+              <w:jc w:val="left"/>
+            </w:pPr>
+            <w:r>
+              <w:rPr>
+                <w:rFonts w:ascii="Calibri" w:cs="Calibri" w:eastAsia="Calibri" w:hAnsi="Calibri"/>
+                <w:b/>
+                <w:bCs/>
+                <w:color w:val="FFFFFF"/>
+                <w:sz w:val="21"/>
+                <w:szCs w:val="21"/>
+              </w:rPr>
+              <w:t xml:space="preserve">Période</w:t>
+            </w:r>
+          </w:p>
+        </w:tc>
+        <w:tc>
+          <w:tcPr>
+            <w:tcW w:type="dxa" w:w="3500"/>
+            <w:tcBorders>
+              <w:top w:val="single" w:color="CCCCCC" w:sz="4"/>
+              <w:left w:val="single" w:color="CCCCCC" w:sz="4"/>
+              <w:bottom w:val="single" w:color="CCCCCC" w:sz="4"/>
+              <w:right w:val="single" w:color="CCCCCC" w:sz="4"/>
+            </w:tcBorders>
+            <w:shd w:fill="1F4E79" w:val="clear"/>
+            <w:tcMar>
+              <w:top w:type="dxa" w:w="100"/>
+              <w:left w:type="dxa" w:w="140"/>
+              <w:bottom w:type="dxa" w:w="100"/>
+              <w:right w:type="dxa" w:w="140"/>
+            </w:tcMar>
+            <w:vAlign w:val="center"/>
+          </w:tcPr>
+          <w:p>
+            <w:pPr>
+              <w:jc w:val="left"/>
+            </w:pPr>
+            <w:r>
+              <w:rPr>
+                <w:rFonts w:ascii="Calibri" w:cs="Calibri" w:eastAsia="Calibri" w:hAnsi="Calibri"/>
+                <w:b/>
+                <w:bCs/>
+                <w:color w:val="FFFFFF"/>
+                <w:sz w:val="21"/>
+                <w:szCs w:val="21"/>
+              </w:rPr>
+              <w:t xml:space="preserve">Cible prioritaire</w:t>
+            </w:r>
+          </w:p>
+        </w:tc>
+        <w:tc>
+          <w:tcPr>
+            <w:tcW w:type="dxa" w:w="3426"/>
+            <w:tcBorders>
+              <w:top w:val="single" w:color="CCCCCC" w:sz="4"/>
+              <w:left w:val="single" w:color="CCCCCC" w:sz="4"/>
+              <w:bottom w:val="single" w:color="CCCCCC" w:sz="4"/>
+              <w:right w:val="single" w:color="CCCCCC" w:sz="4"/>
+            </w:tcBorders>
+            <w:shd w:fill="1F4E79" w:val="clear"/>
+            <w:tcMar>
+              <w:top w:type="dxa" w:w="100"/>
+              <w:left w:type="dxa" w:w="140"/>
+              <w:bottom w:type="dxa" w:w="100"/>
+              <w:right w:type="dxa" w:w="140"/>
+            </w:tcMar>
+            <w:vAlign w:val="center"/>
+          </w:tcPr>
+          <w:p>
+            <w:pPr>
+              <w:jc w:val="left"/>
+            </w:pPr>
+            <w:r>
+              <w:rPr>
+                <w:rFonts w:ascii="Calibri" w:cs="Calibri" w:eastAsia="Calibri" w:hAnsi="Calibri"/>
+                <w:b/>
+                <w:bCs/>
+                <w:color w:val="FFFFFF"/>
+                <w:sz w:val="21"/>
+                <w:szCs w:val="21"/>
+              </w:rPr>
+              <w:t xml:space="preserve">DCA orienté</w:t>
+            </w:r>
+          </w:p>
+        </w:tc>
+      </w:tr>
+      <w:tr>
+        <w:tc>
+          <w:tcPr>
+            <w:tcW w:type="dxa" w:w="2200"/>
+            <w:tcBorders>
+              <w:top w:val="single" w:color="CCCCCC" w:sz="4"/>
+              <w:left w:val="single" w:color="CCCCCC" w:sz="4"/>
+              <w:bottom w:val="single" w:color="CCCCCC" w:sz="4"/>
+              <w:right w:val="single" w:color="CCCCCC" w:sz="4"/>
+            </w:tcBorders>
+            <w:tcMar>
+              <w:top w:type="dxa" w:w="100"/>
+              <w:left w:type="dxa" w:w="140"/>
+              <w:bottom w:type="dxa" w:w="100"/>
+              <w:right w:type="dxa" w:w="140"/>
+            </w:tcMar>
+            <w:vAlign w:val="center"/>
+          </w:tcPr>
+          <w:p>
+            <w:pPr>
+              <w:jc w:val="left"/>
+            </w:pPr>
+            <w:r>
+              <w:rPr>
+                <w:rFonts w:ascii="Calibri" w:cs="Calibri" w:eastAsia="Calibri" w:hAnsi="Calibri"/>
+                <w:color w:val="1F1F1F"/>
+                <w:sz w:val="21"/>
+                <w:szCs w:val="21"/>
+              </w:rPr>
+              <w:t xml:space="preserve">Mois 1-4</w:t>
+            </w:r>
+          </w:p>
+        </w:tc>
+        <w:tc>
+          <w:tcPr>
+            <w:tcW w:type="dxa" w:w="3500"/>
+            <w:tcBorders>
+              <w:top w:val="single" w:color="CCCCCC" w:sz="4"/>
+              <w:left w:val="single" w:color="CCCCCC" w:sz="4"/>
+              <w:bottom w:val="single" w:color="CCCCCC" w:sz="4"/>
+              <w:right w:val="single" w:color="CCCCCC" w:sz="4"/>
+            </w:tcBorders>
+            <w:tcMar>
+              <w:top w:type="dxa" w:w="100"/>
+              <w:left w:type="dxa" w:w="140"/>
+              <w:bottom w:type="dxa" w:w="100"/>
+              <w:right w:type="dxa" w:w="140"/>
+            </w:tcMar>
+            <w:vAlign w:val="center"/>
+          </w:tcPr>
+          <w:p>
+            <w:pPr>
+              <w:jc w:val="left"/>
+            </w:pPr>
+            <w:r>
+              <w:rPr>
+                <w:rFonts w:ascii="Calibri" w:cs="Calibri" w:eastAsia="Calibri" w:hAnsi="Calibri"/>
+                <w:color w:val="1F1F1F"/>
+                <w:sz w:val="21"/>
+                <w:szCs w:val="21"/>
+              </w:rPr>
+              <w:t xml:space="preserve">S&amp;P 500 (création de ligne)</w:t>
+            </w:r>
+          </w:p>
+        </w:tc>
+        <w:tc>
+          <w:tcPr>
+            <w:tcW w:type="dxa" w:w="3426"/>
+            <w:tcBorders>
+              <w:top w:val="single" w:color="CCCCCC" w:sz="4"/>
+              <w:left w:val="single" w:color="CCCCCC" w:sz="4"/>
+              <w:bottom w:val="single" w:color="CCCCCC" w:sz="4"/>
+              <w:right w:val="single" w:color="CCCCCC" w:sz="4"/>
+            </w:tcBorders>
+            <w:tcMar>
+              <w:top w:type="dxa" w:w="100"/>
+              <w:left w:type="dxa" w:w="140"/>
+              <w:bottom w:type="dxa" w:w="100"/>
+              <w:right w:type="dxa" w:w="140"/>
+            </w:tcMar>
+            <w:vAlign w:val="center"/>
+          </w:tcPr>
+          <w:p>
+            <w:pPr>
+              <w:jc w:val="left"/>
+            </w:pPr>
+            <w:r>
+              <w:rPr>
+                <w:rFonts w:ascii="Calibri" w:cs="Calibri" w:eastAsia="Calibri" w:hAnsi="Calibri"/>
+                <w:color w:val="1F1F1F"/>
+                <w:sz w:val="21"/>
+                <w:szCs w:val="21"/>
+              </w:rPr>
+              <w:t xml:space="preserve">1 000 €/mois sur S&amp;P 500</w:t>
+            </w:r>
+          </w:p>
+        </w:tc>
+      </w:tr>
+      <w:tr>
+        <w:tc>
+          <w:tcPr>
+            <w:tcW w:type="dxa" w:w="2200"/>
+            <w:tcBorders>
+              <w:top w:val="single" w:color="CCCCCC" w:sz="4"/>
+              <w:left w:val="single" w:color="CCCCCC" w:sz="4"/>
+              <w:bottom w:val="single" w:color="CCCCCC" w:sz="4"/>
+              <w:right w:val="single" w:color="CCCCCC" w:sz="4"/>
+            </w:tcBorders>
+            <w:shd w:fill="F2F2F2" w:val="clear"/>
+            <w:tcMar>
+              <w:top w:type="dxa" w:w="100"/>
+              <w:left w:type="dxa" w:w="140"/>
+              <w:bottom w:type="dxa" w:w="100"/>
+              <w:right w:type="dxa" w:w="140"/>
+            </w:tcMar>
+            <w:vAlign w:val="center"/>
+          </w:tcPr>
+          <w:p>
+            <w:pPr>
+              <w:jc w:val="left"/>
+            </w:pPr>
+            <w:r>
+              <w:rPr>
+                <w:rFonts w:ascii="Calibri" w:cs="Calibri" w:eastAsia="Calibri" w:hAnsi="Calibri"/>
+                <w:color w:val="1F1F1F"/>
+                <w:sz w:val="21"/>
+                <w:szCs w:val="21"/>
+              </w:rPr>
+              <w:t xml:space="preserve">Mois 5-6</w:t>
+            </w:r>
+          </w:p>
+        </w:tc>
+        <w:tc>
+          <w:tcPr>
+            <w:tcW w:type="dxa" w:w="3500"/>
+            <w:tcBorders>
+              <w:top w:val="single" w:color="CCCCCC" w:sz="4"/>
+              <w:left w:val="single" w:color="CCCCCC" w:sz="4"/>
+              <w:bottom w:val="single" w:color="CCCCCC" w:sz="4"/>
+              <w:right w:val="single" w:color="CCCCCC" w:sz="4"/>
+            </w:tcBorders>
+            <w:shd w:fill="F2F2F2" w:val="clear"/>
+            <w:tcMar>
+              <w:top w:type="dxa" w:w="100"/>
+              <w:left w:type="dxa" w:w="140"/>
+              <w:bottom w:type="dxa" w:w="100"/>
+              <w:right w:type="dxa" w:w="140"/>
+            </w:tcMar>
+            <w:vAlign w:val="center"/>
+          </w:tcPr>
+          <w:p>
+            <w:pPr>
+              <w:jc w:val="left"/>
+            </w:pPr>
+            <w:r>
+              <w:rPr>
+                <w:rFonts w:ascii="Calibri" w:cs="Calibri" w:eastAsia="Calibri" w:hAnsi="Calibri"/>
+                <w:color w:val="1F1F1F"/>
+                <w:sz w:val="21"/>
+                <w:szCs w:val="21"/>
+              </w:rPr>
+              <w:t xml:space="preserve">Small Cap Europe (création de ligne)</w:t>
+            </w:r>
+          </w:p>
+        </w:tc>
+        <w:tc>
+          <w:tcPr>
+            <w:tcW w:type="dxa" w:w="3426"/>
+            <w:tcBorders>
+              <w:top w:val="single" w:color="CCCCCC" w:sz="4"/>
+              <w:left w:val="single" w:color="CCCCCC" w:sz="4"/>
+              <w:bottom w:val="single" w:color="CCCCCC" w:sz="4"/>
+              <w:right w:val="single" w:color="CCCCCC" w:sz="4"/>
+            </w:tcBorders>
+            <w:shd w:fill="F2F2F2" w:val="clear"/>
+            <w:tcMar>
+              <w:top w:type="dxa" w:w="100"/>
+              <w:left w:type="dxa" w:w="140"/>
+              <w:bottom w:type="dxa" w:w="100"/>
+              <w:right w:type="dxa" w:w="140"/>
+            </w:tcMar>
+            <w:vAlign w:val="center"/>
+          </w:tcPr>
+          <w:p>
+            <w:pPr>
+              <w:jc w:val="left"/>
+            </w:pPr>
+            <w:r>
+              <w:rPr>
+                <w:rFonts w:ascii="Calibri" w:cs="Calibri" w:eastAsia="Calibri" w:hAnsi="Calibri"/>
+                <w:color w:val="1F1F1F"/>
+                <w:sz w:val="21"/>
+                <w:szCs w:val="21"/>
+              </w:rPr>
+              <w:t xml:space="preserve">1 000 €/mois sur Small Cap Europe</w:t>
+            </w:r>
+          </w:p>
+        </w:tc>
+      </w:tr>
+      <w:tr>
+        <w:tc>
+          <w:tcPr>
+            <w:tcW w:type="dxa" w:w="2200"/>
+            <w:tcBorders>
+              <w:top w:val="single" w:color="CCCCCC" w:sz="4"/>
+              <w:left w:val="single" w:color="CCCCCC" w:sz="4"/>
+              <w:bottom w:val="single" w:color="CCCCCC" w:sz="4"/>
+              <w:right w:val="single" w:color="CCCCCC" w:sz="4"/>
+            </w:tcBorders>
+            <w:tcMar>
+              <w:top w:type="dxa" w:w="100"/>
+              <w:left w:type="dxa" w:w="140"/>
+              <w:bottom w:type="dxa" w:w="100"/>
+              <w:right w:type="dxa" w:w="140"/>
+            </w:tcMar>
+            <w:vAlign w:val="center"/>
+          </w:tcPr>
+          <w:p>
+            <w:pPr>
+              <w:jc w:val="left"/>
+            </w:pPr>
+            <w:r>
+              <w:rPr>
+                <w:rFonts w:ascii="Calibri" w:cs="Calibri" w:eastAsia="Calibri" w:hAnsi="Calibri"/>
+                <w:color w:val="1F1F1F"/>
+                <w:sz w:val="21"/>
+                <w:szCs w:val="21"/>
+              </w:rPr>
+              <w:t xml:space="preserve">Mois 7-10</w:t>
+            </w:r>
+          </w:p>
+        </w:tc>
+        <w:tc>
+          <w:tcPr>
+            <w:tcW w:type="dxa" w:w="3500"/>
+            <w:tcBorders>
+              <w:top w:val="single" w:color="CCCCCC" w:sz="4"/>
+              <w:left w:val="single" w:color="CCCCCC" w:sz="4"/>
+              <w:bottom w:val="single" w:color="CCCCCC" w:sz="4"/>
+              <w:right w:val="single" w:color="CCCCCC" w:sz="4"/>
+            </w:tcBorders>
+            <w:tcMar>
+              <w:top w:type="dxa" w:w="100"/>
+              <w:left w:type="dxa" w:w="140"/>
+              <w:bottom w:type="dxa" w:w="100"/>
+              <w:right w:type="dxa" w:w="140"/>
+            </w:tcMar>
+            <w:vAlign w:val="center"/>
+          </w:tcPr>
+          <w:p>
+            <w:pPr>
+              <w:jc w:val="left"/>
+            </w:pPr>
+            <w:r>
+              <w:rPr>
+                <w:rFonts w:ascii="Calibri" w:cs="Calibri" w:eastAsia="Calibri" w:hAnsi="Calibri"/>
+                <w:color w:val="1F1F1F"/>
+                <w:sz w:val="21"/>
+                <w:szCs w:val="21"/>
+              </w:rPr>
+              <w:t xml:space="preserve">S&amp;P 500 (densification)</w:t>
+            </w:r>
+          </w:p>
+        </w:tc>
+        <w:tc>
+          <w:tcPr>
+            <w:tcW w:type="dxa" w:w="3426"/>
+            <w:tcBorders>
+              <w:top w:val="single" w:color="CCCCCC" w:sz="4"/>
+              <w:left w:val="single" w:color="CCCCCC" w:sz="4"/>
+              <w:bottom w:val="single" w:color="CCCCCC" w:sz="4"/>
+              <w:right w:val="single" w:color="CCCCCC" w:sz="4"/>
+            </w:tcBorders>
+            <w:tcMar>
+              <w:top w:type="dxa" w:w="100"/>
+              <w:left w:type="dxa" w:w="140"/>
+              <w:bottom w:type="dxa" w:w="100"/>
+              <w:right w:type="dxa" w:w="140"/>
+            </w:tcMar>
+            <w:vAlign w:val="center"/>
+          </w:tcPr>
+          <w:p>
+            <w:pPr>
+              <w:jc w:val="left"/>
+            </w:pPr>
+            <w:r>
+              <w:rPr>
+                <w:rFonts w:ascii="Calibri" w:cs="Calibri" w:eastAsia="Calibri" w:hAnsi="Calibri"/>
+                <w:color w:val="1F1F1F"/>
+                <w:sz w:val="21"/>
+                <w:szCs w:val="21"/>
+              </w:rPr>
+              <w:t xml:space="preserve">1 000 €/mois sur S&amp;P 500</w:t>
+            </w:r>
+          </w:p>
+        </w:tc>
+      </w:tr>
+      <w:tr>
+        <w:tc>
+          <w:tcPr>
+            <w:tcW w:type="dxa" w:w="2200"/>
+            <w:tcBorders>
+              <w:top w:val="single" w:color="CCCCCC" w:sz="4"/>
+              <w:left w:val="single" w:color="CCCCCC" w:sz="4"/>
+              <w:bottom w:val="single" w:color="CCCCCC" w:sz="4"/>
+              <w:right w:val="single" w:color="CCCCCC" w:sz="4"/>
+            </w:tcBorders>
+            <w:shd w:fill="F2F2F2" w:val="clear"/>
+            <w:tcMar>
+              <w:top w:type="dxa" w:w="100"/>
+              <w:left w:type="dxa" w:w="140"/>
+              <w:bottom w:type="dxa" w:w="100"/>
+              <w:right w:type="dxa" w:w="140"/>
+            </w:tcMar>
+            <w:vAlign w:val="center"/>
+          </w:tcPr>
+          <w:p>
+            <w:pPr>
+              <w:jc w:val="left"/>
+            </w:pPr>
+            <w:r>
+              <w:rPr>
+                <w:rFonts w:ascii="Calibri" w:cs="Calibri" w:eastAsia="Calibri" w:hAnsi="Calibri"/>
+                <w:color w:val="1F1F1F"/>
+                <w:sz w:val="21"/>
+                <w:szCs w:val="21"/>
+              </w:rPr>
+              <w:t xml:space="preserve">Mois 11-12</w:t>
+            </w:r>
+          </w:p>
+        </w:tc>
+        <w:tc>
+          <w:tcPr>
+            <w:tcW w:type="dxa" w:w="3500"/>
+            <w:tcBorders>
+              <w:top w:val="single" w:color="CCCCCC" w:sz="4"/>
+              <w:left w:val="single" w:color="CCCCCC" w:sz="4"/>
+              <w:bottom w:val="single" w:color="CCCCCC" w:sz="4"/>
+              <w:right w:val="single" w:color="CCCCCC" w:sz="4"/>
+            </w:tcBorders>
+            <w:shd w:fill="F2F2F2" w:val="clear"/>
+            <w:tcMar>
+              <w:top w:type="dxa" w:w="100"/>
+              <w:left w:type="dxa" w:w="140"/>
+              <w:bottom w:type="dxa" w:w="100"/>
+              <w:right w:type="dxa" w:w="140"/>
+            </w:tcMar>
+            <w:vAlign w:val="center"/>
+          </w:tcPr>
+          <w:p>
+            <w:pPr>
+              <w:jc w:val="left"/>
+            </w:pPr>
+            <w:r>
+              <w:rPr>
+                <w:rFonts w:ascii="Calibri" w:cs="Calibri" w:eastAsia="Calibri" w:hAnsi="Calibri"/>
+                <w:color w:val="1F1F1F"/>
+                <w:sz w:val="21"/>
+                <w:szCs w:val="21"/>
+              </w:rPr>
+              <w:t xml:space="preserve">Emerging (correction sous-pondération)</w:t>
+            </w:r>
+          </w:p>
+        </w:tc>
+        <w:tc>
+          <w:tcPr>
+            <w:tcW w:type="dxa" w:w="3426"/>
+            <w:tcBorders>
+              <w:top w:val="single" w:color="CCCCCC" w:sz="4"/>
+              <w:left w:val="single" w:color="CCCCCC" w:sz="4"/>
+              <w:bottom w:val="single" w:color="CCCCCC" w:sz="4"/>
+              <w:right w:val="single" w:color="CCCCCC" w:sz="4"/>
+            </w:tcBorders>
+            <w:shd w:fill="F2F2F2" w:val="clear"/>
+            <w:tcMar>
+              <w:top w:type="dxa" w:w="100"/>
+              <w:left w:type="dxa" w:w="140"/>
+              <w:bottom w:type="dxa" w:w="100"/>
+              <w:right w:type="dxa" w:w="140"/>
+            </w:tcMar>
+            <w:vAlign w:val="center"/>
+          </w:tcPr>
+          <w:p>
+            <w:pPr>
+              <w:jc w:val="left"/>
+            </w:pPr>
+            <w:r>
+              <w:rPr>
+                <w:rFonts w:ascii="Calibri" w:cs="Calibri" w:eastAsia="Calibri" w:hAnsi="Calibri"/>
+                <w:color w:val="1F1F1F"/>
+                <w:sz w:val="21"/>
+                <w:szCs w:val="21"/>
+              </w:rPr>
+              <w:t xml:space="preserve">1 000 €/mois sur Emerging</w:t>
+            </w:r>
+          </w:p>
+        </w:tc>
+      </w:tr>
+      <w:tr>
+        <w:tc>
+          <w:tcPr>
+            <w:tcW w:type="dxa" w:w="2200"/>
+            <w:tcBorders>
+              <w:top w:val="single" w:color="CCCCCC" w:sz="4"/>
+              <w:left w:val="single" w:color="CCCCCC" w:sz="4"/>
+              <w:bottom w:val="single" w:color="CCCCCC" w:sz="4"/>
+              <w:right w:val="single" w:color="CCCCCC" w:sz="4"/>
+            </w:tcBorders>
+            <w:tcMar>
+              <w:top w:type="dxa" w:w="100"/>
+              <w:left w:type="dxa" w:w="140"/>
+              <w:bottom w:type="dxa" w:w="100"/>
+              <w:right w:type="dxa" w:w="140"/>
+            </w:tcMar>
+            <w:vAlign w:val="center"/>
+          </w:tcPr>
+          <w:p>
+            <w:pPr>
+              <w:jc w:val="left"/>
+            </w:pPr>
+            <w:r>
+              <w:rPr>
+                <w:rFonts w:ascii="Calibri" w:cs="Calibri" w:eastAsia="Calibri" w:hAnsi="Calibri"/>
+                <w:color w:val="1F1F1F"/>
+                <w:sz w:val="21"/>
+                <w:szCs w:val="21"/>
+              </w:rPr>
+              <w:t xml:space="preserve">Mois 13-18</w:t>
+            </w:r>
+          </w:p>
+        </w:tc>
+        <w:tc>
+          <w:tcPr>
+            <w:tcW w:type="dxa" w:w="3500"/>
+            <w:tcBorders>
+              <w:top w:val="single" w:color="CCCCCC" w:sz="4"/>
+              <w:left w:val="single" w:color="CCCCCC" w:sz="4"/>
+              <w:bottom w:val="single" w:color="CCCCCC" w:sz="4"/>
+              <w:right w:val="single" w:color="CCCCCC" w:sz="4"/>
+            </w:tcBorders>
+            <w:tcMar>
+              <w:top w:type="dxa" w:w="100"/>
+              <w:left w:type="dxa" w:w="140"/>
+              <w:bottom w:type="dxa" w:w="100"/>
+              <w:right w:type="dxa" w:w="140"/>
+            </w:tcMar>
+            <w:vAlign w:val="center"/>
+          </w:tcPr>
+          <w:p>
+            <w:pPr>
+              <w:jc w:val="left"/>
+            </w:pPr>
+            <w:r>
+              <w:rPr>
+                <w:rFonts w:ascii="Calibri" w:cs="Calibri" w:eastAsia="Calibri" w:hAnsi="Calibri"/>
+                <w:color w:val="1F1F1F"/>
+                <w:sz w:val="21"/>
+                <w:szCs w:val="21"/>
+              </w:rPr>
+              <w:t xml:space="preserve">Finalisation glide</w:t>
+            </w:r>
+          </w:p>
+        </w:tc>
+        <w:tc>
+          <w:tcPr>
+            <w:tcW w:type="dxa" w:w="3426"/>
+            <w:tcBorders>
+              <w:top w:val="single" w:color="CCCCCC" w:sz="4"/>
+              <w:left w:val="single" w:color="CCCCCC" w:sz="4"/>
+              <w:bottom w:val="single" w:color="CCCCCC" w:sz="4"/>
+              <w:right w:val="single" w:color="CCCCCC" w:sz="4"/>
+            </w:tcBorders>
+            <w:tcMar>
+              <w:top w:type="dxa" w:w="100"/>
+              <w:left w:type="dxa" w:w="140"/>
+              <w:bottom w:type="dxa" w:w="100"/>
+              <w:right w:type="dxa" w:w="140"/>
+            </w:tcMar>
+            <w:vAlign w:val="center"/>
+          </w:tcPr>
+          <w:p>
+            <w:pPr>
+              <w:jc w:val="left"/>
+            </w:pPr>
+            <w:r>
+              <w:rPr>
+                <w:rFonts w:ascii="Calibri" w:cs="Calibri" w:eastAsia="Calibri" w:hAnsi="Calibri"/>
+                <w:color w:val="1F1F1F"/>
+                <w:sz w:val="21"/>
+                <w:szCs w:val="21"/>
+              </w:rPr>
+              <w:t xml:space="preserve">DCA orienté selon écart à la cible</w:t>
+            </w:r>
+          </w:p>
+        </w:tc>
+      </w:tr>
+      <w:tr>
+        <w:tc>
+          <w:tcPr>
+            <w:tcW w:type="dxa" w:w="2200"/>
+            <w:tcBorders>
+              <w:top w:val="single" w:color="CCCCCC" w:sz="4"/>
+              <w:left w:val="single" w:color="CCCCCC" w:sz="4"/>
+              <w:bottom w:val="single" w:color="CCCCCC" w:sz="4"/>
+              <w:right w:val="single" w:color="CCCCCC" w:sz="4"/>
+            </w:tcBorders>
+            <w:shd w:fill="F2F2F2" w:val="clear"/>
+            <w:tcMar>
+              <w:top w:type="dxa" w:w="100"/>
+              <w:left w:type="dxa" w:w="140"/>
+              <w:bottom w:type="dxa" w:w="100"/>
+              <w:right w:type="dxa" w:w="140"/>
+            </w:tcMar>
+            <w:vAlign w:val="center"/>
+          </w:tcPr>
+          <w:p>
+            <w:pPr>
+              <w:jc w:val="left"/>
+            </w:pPr>
+            <w:r>
+              <w:rPr>
+                <w:rFonts w:ascii="Calibri" w:cs="Calibri" w:eastAsia="Calibri" w:hAnsi="Calibri"/>
+                <w:color w:val="1F1F1F"/>
+                <w:sz w:val="21"/>
+                <w:szCs w:val="21"/>
+              </w:rPr>
+              <w:t xml:space="preserve">Mois 19+</w:t>
+            </w:r>
+          </w:p>
+        </w:tc>
+        <w:tc>
+          <w:tcPr>
+            <w:tcW w:type="dxa" w:w="3500"/>
+            <w:tcBorders>
+              <w:top w:val="single" w:color="CCCCCC" w:sz="4"/>
+              <w:left w:val="single" w:color="CCCCCC" w:sz="4"/>
+              <w:bottom w:val="single" w:color="CCCCCC" w:sz="4"/>
+              <w:right w:val="single" w:color="CCCCCC" w:sz="4"/>
+            </w:tcBorders>
+            <w:shd w:fill="F2F2F2" w:val="clear"/>
+            <w:tcMar>
+              <w:top w:type="dxa" w:w="100"/>
+              <w:left w:type="dxa" w:w="140"/>
+              <w:bottom w:type="dxa" w:w="100"/>
+              <w:right w:type="dxa" w:w="140"/>
+            </w:tcMar>
+            <w:vAlign w:val="center"/>
+          </w:tcPr>
+          <w:p>
+            <w:pPr>
+              <w:jc w:val="left"/>
+            </w:pPr>
+            <w:r>
+              <w:rPr>
+                <w:rFonts w:ascii="Calibri" w:cs="Calibri" w:eastAsia="Calibri" w:hAnsi="Calibri"/>
+                <w:color w:val="1F1F1F"/>
+                <w:sz w:val="21"/>
+                <w:szCs w:val="21"/>
+              </w:rPr>
+              <w:t xml:space="preserve">Régime nominal</w:t>
+            </w:r>
+          </w:p>
+        </w:tc>
+        <w:tc>
+          <w:tcPr>
+            <w:tcW w:type="dxa" w:w="3426"/>
+            <w:tcBorders>
+              <w:top w:val="single" w:color="CCCCCC" w:sz="4"/>
+              <w:left w:val="single" w:color="CCCCCC" w:sz="4"/>
+              <w:bottom w:val="single" w:color="CCCCCC" w:sz="4"/>
+              <w:right w:val="single" w:color="CCCCCC" w:sz="4"/>
+            </w:tcBorders>
+            <w:shd w:fill="F2F2F2" w:val="clear"/>
+            <w:tcMar>
+              <w:top w:type="dxa" w:w="100"/>
+              <w:left w:type="dxa" w:w="140"/>
+              <w:bottom w:type="dxa" w:w="100"/>
+              <w:right w:type="dxa" w:w="140"/>
+            </w:tcMar>
+            <w:vAlign w:val="center"/>
+          </w:tcPr>
+          <w:p>
+            <w:pPr>
+              <w:jc w:val="left"/>
+            </w:pPr>
+            <w:r>
+              <w:rPr>
+                <w:rFonts w:ascii="Calibri" w:cs="Calibri" w:eastAsia="Calibri" w:hAnsi="Calibri"/>
+                <w:color w:val="1F1F1F"/>
+                <w:sz w:val="21"/>
+                <w:szCs w:val="21"/>
+              </w:rPr>
+              <w:t xml:space="preserve">DCA selon couche tactique de la stratégie</w:t>
+            </w:r>
+          </w:p>
+        </w:tc>
+      </w:tr>
+    </w:tbl>
+    <w:p>
+      <w:pPr>
+        <w:spacing w:after="240"/>
+      </w:pPr>
+    </w:p>
+    <w:p>
+      <w:pPr>
+        <w:spacing w:after="120" w:before="0" w:line="300"/>
+      </w:pPr>
+      <w:r>
+        <w:rPr>
+          <w:rFonts w:ascii="Calibri" w:cs="Calibri" w:eastAsia="Calibri" w:hAnsi="Calibri"/>
+          <w:color w:val="1F1F1F"/>
+          <w:sz w:val="22"/>
+          <w:szCs w:val="22"/>
+        </w:rPr>
+        <w:t xml:space="preserve">Note : pendant les premiers mois de la Phase 1 (DCA encore à 500 €/mois jusqu'à fin 2026), le calendrier ci-dessus est appliqué proportionnellement avec un DCA de 500 € au lieu de 1 000 €. La convergence est simplement plus lente.</w:t>
+      </w:r>
+    </w:p>
+    <w:p>
+      <w:pPr>
+        <w:pStyle w:val="Heading3"/>
+        <w:spacing w:after="100" w:before="220"/>
+      </w:pPr>
+      <w:r>
+        <w:rPr>
+          <w:rFonts w:ascii="Calibri" w:cs="Calibri" w:eastAsia="Calibri" w:hAnsi="Calibri"/>
+          <w:b/>
+          <w:bCs/>
+          <w:color w:val="2E75B6"/>
+          <w:sz w:val="23"/>
+          <w:szCs w:val="23"/>
+        </w:rPr>
+        <w:t xml:space="preserve">Sortie du glide vers le régime nominal</w:t>
+      </w:r>
+    </w:p>
+    <w:p>
+      <w:pPr>
+        <w:spacing w:after="120" w:before="0" w:line="300"/>
+      </w:pPr>
+      <w:r>
+        <w:rPr>
+          <w:rFonts w:ascii="Calibri" w:cs="Calibri" w:eastAsia="Calibri" w:hAnsi="Calibri"/>
+          <w:color w:val="1F1F1F"/>
+          <w:sz w:val="22"/>
+          <w:szCs w:val="22"/>
+        </w:rPr>
+        <w:t xml:space="preserve">À l'issue des 18 mois de convergence, le portefeuille est proche de la cible mais le Nasdaq peut rester légèrement sur-pondéré (typiquement 18-22 % au lieu des 15 % cibles), car la dilution pure ne permet pas mathématiquement de ramener une ligne très sur-pondérée à sa cible exacte sans vente. Trois options de finalisation :</w:t>
+      </w:r>
+    </w:p>
+    <w:p>
+      <w:pPr>
+        <w:pStyle w:val="ListParagraph"/>
+        <w:numPr>
+          <w:ilvl w:val="0"/>
+          <w:numId w:val="2"/>
+        </w:numPr>
+        <w:spacing w:after="80" w:line="280"/>
+      </w:pPr>
+      <w:r>
+        <w:rPr>
+          <w:rFonts w:ascii="Calibri" w:cs="Calibri" w:eastAsia="Calibri" w:hAnsi="Calibri"/>
+          <w:b/>
+          <w:bCs/>
+          <w:color w:val="1F1F1F"/>
+          <w:sz w:val="22"/>
+          <w:szCs w:val="22"/>
+        </w:rPr>
+        <w:t xml:space="preserve">Option par défaut — accepter l'écart : </w:t>
+      </w:r>
+      <w:r>
+        <w:rPr>
+          <w:rFonts w:ascii="Calibri" w:cs="Calibri" w:eastAsia="Calibri" w:hAnsi="Calibri"/>
+          <w:color w:val="1F1F1F"/>
+          <w:sz w:val="22"/>
+          <w:szCs w:val="22"/>
+        </w:rPr>
+        <w:t xml:space="preserve">un dépassement de 3-5 points sur le Nasdaq reste dans la bande morte de 5 % de la stratégie tactique. Aucun ordre de rééquilibrage n'est déclenché. Vivable à long terme étant donné la corrélation forte Nasdaq / S&amp;P 500.</w:t>
+      </w:r>
+    </w:p>
+    <w:p>
+      <w:pPr>
+        <w:pStyle w:val="ListParagraph"/>
+        <w:numPr>
+          <w:ilvl w:val="0"/>
+          <w:numId w:val="2"/>
+        </w:numPr>
+        <w:spacing w:after="80" w:line="280"/>
+      </w:pPr>
+      <w:r>
+        <w:rPr>
+          <w:rFonts w:ascii="Calibri" w:cs="Calibri" w:eastAsia="Calibri" w:hAnsi="Calibri"/>
+          <w:b/>
+          <w:bCs/>
+          <w:color w:val="1F1F1F"/>
+          <w:sz w:val="22"/>
+          <w:szCs w:val="22"/>
+        </w:rPr>
+        <w:t xml:space="preserve">Option correction unique : </w:t>
+      </w:r>
+      <w:r>
+        <w:rPr>
+          <w:rFonts w:ascii="Calibri" w:cs="Calibri" w:eastAsia="Calibri" w:hAnsi="Calibri"/>
+          <w:color w:val="1F1F1F"/>
+          <w:sz w:val="22"/>
+          <w:szCs w:val="22"/>
+        </w:rPr>
+        <w:t xml:space="preserve">à l'entrée en Phase 2 (couche tactique), un ordre exceptionnel de vente Nasdaq + achat S&amp;P 500 (~1 500 €) pour aligner exactement le portefeuille. Coût : ~3 € de frais et 2 jours de tracking error.</w:t>
+      </w:r>
+    </w:p>
+    <w:p>
+      <w:pPr>
+        <w:pStyle w:val="ListParagraph"/>
+        <w:numPr>
+          <w:ilvl w:val="0"/>
+          <w:numId w:val="2"/>
+        </w:numPr>
+        <w:spacing w:after="80" w:line="280"/>
+      </w:pPr>
+      <w:r>
+        <w:rPr>
+          <w:rFonts w:ascii="Calibri" w:cs="Calibri" w:eastAsia="Calibri" w:hAnsi="Calibri"/>
+          <w:b/>
+          <w:bCs/>
+          <w:color w:val="1F1F1F"/>
+          <w:sz w:val="22"/>
+          <w:szCs w:val="22"/>
+        </w:rPr>
+        <w:t xml:space="preserve">Option attente naturelle : </w:t>
+      </w:r>
+      <w:r>
+        <w:rPr>
+          <w:rFonts w:ascii="Calibri" w:cs="Calibri" w:eastAsia="Calibri" w:hAnsi="Calibri"/>
+          <w:color w:val="1F1F1F"/>
+          <w:sz w:val="22"/>
+          <w:szCs w:val="22"/>
+        </w:rPr>
+        <w:t xml:space="preserve">si la rotation tactique de Phase 2 démarre dans un régime où le Nasdaq sous-performe le S&amp;P 500, le tilt momentum corrigera l'écart organiquement sans intervention spécifique.</w:t>
+      </w:r>
+    </w:p>
+    <w:p>
+      <w:pPr>
+        <w:spacing w:after="120" w:before="0" w:line="300"/>
+      </w:pPr>
+      <w:r>
+        <w:rPr>
+          <w:rFonts w:ascii="Calibri" w:cs="Calibri" w:eastAsia="Calibri" w:hAnsi="Calibri"/>
+          <w:color w:val="1F1F1F"/>
+          <w:sz w:val="22"/>
+          <w:szCs w:val="22"/>
+        </w:rPr>
+        <w:t xml:space="preserve">Décision différée à la fin du glide : observer la situation réelle après 18 mois et choisir entre les trois options selon le contexte. Pas de décision préalable nécessaire.</w:t>
       </w:r>
     </w:p>
     <w:p>
@@ -9293,7 +11342,7 @@
           <w:sz w:val="22"/>
           <w:szCs w:val="22"/>
         </w:rPr>
-        <w:t xml:space="preserve">Premier déploiement minimaliste. Objectif : valider la stack technique de bout en bout sur le cas le plus simple.</w:t>
+        <w:t xml:space="preserve">Premier déploiement minimaliste. Objectif unique : valider la chaîne d'exécution de bout en bout sur le cas le plus simple possible. Pas de validation de la stratégie à ce stade — uniquement de l'infrastructure technique.</w:t>
       </w:r>
     </w:p>
     <w:p>
@@ -9331,7 +11380,7 @@
           <w:sz w:val="22"/>
           <w:szCs w:val="22"/>
         </w:rPr>
-        <w:t xml:space="preserve">Achat mensuel de 1 000 € sur l'ETF cœur cible (typiquement le PE500 ou un ETF World synthétique).</w:t>
+        <w:t xml:space="preserve">Achat mensuel unique de 500 € (DCA actuel jusqu'à fin 2026) ou 1 000 € (à partir de fin 2026), sur la classe désignée par la trajectoire de convergence (section 4.7).</w:t>
       </w:r>
     </w:p>
     <w:p>
@@ -9350,7 +11399,7 @@
           <w:sz w:val="22"/>
           <w:szCs w:val="22"/>
         </w:rPr>
-        <w:t xml:space="preserve">Pas de rotation, pas d'overlay défensif, pas de rebalancement à ce stade.</w:t>
+        <w:t xml:space="preserve">Aucune logique conditionnelle, aucun branchement complexe : uniquement un ordre marché simple sur un seul ETF.</w:t>
       </w:r>
     </w:p>
     <w:p>
@@ -9369,38 +11418,7 @@
           <w:sz w:val="22"/>
           <w:szCs w:val="22"/>
         </w:rPr>
-        <w:t xml:space="preserve">Validation : 3 cycles mensuels exécutés sans intervention manuelle.</w:t>
-      </w:r>
-    </w:p>
-    <w:p>
-      <w:pPr>
-        <w:pStyle w:val="Heading2"/>
-        <w:spacing w:after="140" w:before="280"/>
-      </w:pPr>
-      <w:r>
-        <w:rPr>
-          <w:rFonts w:ascii="Calibri" w:cs="Calibri" w:eastAsia="Calibri" w:hAnsi="Calibri"/>
-          <w:b/>
-          <w:bCs/>
-          <w:color w:val="1F4E79"/>
-          <w:sz w:val="26"/>
-          <w:szCs w:val="26"/>
-        </w:rPr>
-        <w:t xml:space="preserve">9.3 Phase 2 — Couche tactique momentum (mois 4-9)</w:t>
-      </w:r>
-    </w:p>
-    <w:p>
-      <w:pPr>
-        <w:spacing w:after="120" w:before="0" w:line="300"/>
-      </w:pPr>
-      <w:r>
-        <w:rPr>
-          <w:rFonts w:ascii="Calibri" w:cs="Calibri" w:eastAsia="Calibri" w:hAnsi="Calibri"/>
-          <w:color w:val="1F1F1F"/>
-          <w:sz w:val="22"/>
-          <w:szCs w:val="22"/>
-        </w:rPr>
-        <w:t xml:space="preserve">Ajout de la rotation sur signal momentum 6 mois et du rebalancement périodique.</w:t>
+        <w:t xml:space="preserve">Pas de rotation, pas d'overlay défensif, pas de rebalancement à ce stade.</w:t>
       </w:r>
     </w:p>
     <w:p>
@@ -9419,7 +11437,38 @@
           <w:sz w:val="22"/>
           <w:szCs w:val="22"/>
         </w:rPr>
-        <w:t xml:space="preserve">Calcul mensuel du momentum sur les 5 ETF du pool, attribution des tilts (+3/0/-3).</w:t>
+        <w:t xml:space="preserve">Validation : 3 cycles mensuels exécutés sans intervention manuelle, état du portefeuille cohérent avec les ordres passés.</w:t>
+      </w:r>
+    </w:p>
+    <w:p>
+      <w:pPr>
+        <w:pStyle w:val="Heading2"/>
+        <w:spacing w:after="140" w:before="280"/>
+      </w:pPr>
+      <w:r>
+        <w:rPr>
+          <w:rFonts w:ascii="Calibri" w:cs="Calibri" w:eastAsia="Calibri" w:hAnsi="Calibri"/>
+          <w:b/>
+          <w:bCs/>
+          <w:color w:val="1F4E79"/>
+          <w:sz w:val="26"/>
+          <w:szCs w:val="26"/>
+        </w:rPr>
+        <w:t xml:space="preserve">9.3 Phase 2 — Couche tactique momentum (mois 4-9)</w:t>
+      </w:r>
+    </w:p>
+    <w:p>
+      <w:pPr>
+        <w:spacing w:after="120" w:before="0" w:line="300"/>
+      </w:pPr>
+      <w:r>
+        <w:rPr>
+          <w:rFonts w:ascii="Calibri" w:cs="Calibri" w:eastAsia="Calibri" w:hAnsi="Calibri"/>
+          <w:color w:val="1F1F1F"/>
+          <w:sz w:val="22"/>
+          <w:szCs w:val="22"/>
+        </w:rPr>
+        <w:t xml:space="preserve">Ajout de la rotation sur signal momentum 6 mois et du rebalancement périodique. La trajectoire de convergence reste prioritaire si elle n'est pas terminée.</w:t>
       </w:r>
     </w:p>
     <w:p>
@@ -9438,7 +11487,7 @@
           <w:sz w:val="22"/>
           <w:szCs w:val="22"/>
         </w:rPr>
-        <w:t xml:space="preserve">Génération des ordres de rebalancement sous contrainte de la bande morte de 5 %, du seuil minimal 250 €, et du cap 1 rebalance/mois.</w:t>
+        <w:t xml:space="preserve">Calcul mensuel du momentum sur les 5 ETF du pool, attribution des tilts (+3/0/-3).</w:t>
       </w:r>
     </w:p>
     <w:p>
@@ -9457,7 +11506,7 @@
           <w:sz w:val="22"/>
           <w:szCs w:val="22"/>
         </w:rPr>
-        <w:t xml:space="preserve">Allocation prioritaire du DCA sur la classe la plus sous-pondérée.</w:t>
+        <w:t xml:space="preserve">Génération des ordres de rebalancement sous contrainte de la bande morte de 5 %, du seuil minimal 250 €, et du cap 1 rebalance/mois.</w:t>
       </w:r>
     </w:p>
     <w:p>
@@ -9476,38 +11525,7 @@
           <w:sz w:val="22"/>
           <w:szCs w:val="22"/>
         </w:rPr>
-        <w:t xml:space="preserve">Validation : 6 cycles mensuels avec données et exécutions cohérentes vs simulations.</w:t>
-      </w:r>
-    </w:p>
-    <w:p>
-      <w:pPr>
-        <w:pStyle w:val="Heading2"/>
-        <w:spacing w:after="140" w:before="280"/>
-      </w:pPr>
-      <w:r>
-        <w:rPr>
-          <w:rFonts w:ascii="Calibri" w:cs="Calibri" w:eastAsia="Calibri" w:hAnsi="Calibri"/>
-          <w:b/>
-          <w:bCs/>
-          <w:color w:val="1F4E79"/>
-          <w:sz w:val="26"/>
-          <w:szCs w:val="26"/>
-        </w:rPr>
-        <w:t xml:space="preserve">9.4 Phase 3 — Overlay défensif progressif (mois 10+)</w:t>
-      </w:r>
-    </w:p>
-    <w:p>
-      <w:pPr>
-        <w:spacing w:after="120" w:before="0" w:line="300"/>
-      </w:pPr>
-      <w:r>
-        <w:rPr>
-          <w:rFonts w:ascii="Calibri" w:cs="Calibri" w:eastAsia="Calibri" w:hAnsi="Calibri"/>
-          <w:color w:val="1F1F1F"/>
-          <w:sz w:val="22"/>
-          <w:szCs w:val="22"/>
-        </w:rPr>
-        <w:t xml:space="preserve">Ajout de la couche défensive uniquement après que les phases 1 et 2 sont stables et que les backtests ont confirmé le comportement attendu.</w:t>
+        <w:t xml:space="preserve">Allocation prioritaire du DCA selon la trajectoire de convergence si elle court encore, puis selon la sous-pondération tactique.</w:t>
       </w:r>
     </w:p>
     <w:p>
@@ -9526,7 +11544,38 @@
           <w:sz w:val="22"/>
           <w:szCs w:val="22"/>
         </w:rPr>
-        <w:t xml:space="preserve">Implémentation du calcul CW8 vs MM200 et de la grille à 4 paliers.</w:t>
+        <w:t xml:space="preserve">Validation : 6 cycles mensuels avec données et exécutions cohérentes vs simulations.</w:t>
+      </w:r>
+    </w:p>
+    <w:p>
+      <w:pPr>
+        <w:pStyle w:val="Heading2"/>
+        <w:spacing w:after="140" w:before="280"/>
+      </w:pPr>
+      <w:r>
+        <w:rPr>
+          <w:rFonts w:ascii="Calibri" w:cs="Calibri" w:eastAsia="Calibri" w:hAnsi="Calibri"/>
+          <w:b/>
+          <w:bCs/>
+          <w:color w:val="1F4E79"/>
+          <w:sz w:val="26"/>
+          <w:szCs w:val="26"/>
+        </w:rPr>
+        <w:t xml:space="preserve">9.4 Phase 3 — Overlay défensif progressif (mois 10+)</w:t>
+      </w:r>
+    </w:p>
+    <w:p>
+      <w:pPr>
+        <w:spacing w:after="120" w:before="0" w:line="300"/>
+      </w:pPr>
+      <w:r>
+        <w:rPr>
+          <w:rFonts w:ascii="Calibri" w:cs="Calibri" w:eastAsia="Calibri" w:hAnsi="Calibri"/>
+          <w:color w:val="1F1F1F"/>
+          <w:sz w:val="22"/>
+          <w:szCs w:val="22"/>
+        </w:rPr>
+        <w:t xml:space="preserve">Ajout de la couche défensive uniquement après que les phases 1 et 2 sont stables et que les backtests ont confirmé le comportement attendu.</w:t>
       </w:r>
     </w:p>
     <w:p>
@@ -9545,7 +11594,7 @@
           <w:sz w:val="22"/>
           <w:szCs w:val="22"/>
         </w:rPr>
-        <w:t xml:space="preserve">Modification du sizing des allocations cibles selon le palier en vigueur.</w:t>
+        <w:t xml:space="preserve">Implémentation du calcul CW8 vs MM200 et de la grille à 4 paliers.</w:t>
       </w:r>
     </w:p>
     <w:p>
@@ -9564,24 +11613,7 @@
           <w:sz w:val="22"/>
           <w:szCs w:val="22"/>
         </w:rPr>
-        <w:t xml:space="preserve">Test de la transition entre paliers, vérification que le portefeuille suit bien la cible avec respect des contraintes opérationnelles.</w:t>
-      </w:r>
-    </w:p>
-    <w:p>
-      <w:pPr>
-        <w:pStyle w:val="Heading2"/>
-        <w:spacing w:after="140" w:before="280"/>
-      </w:pPr>
-      <w:r>
-        <w:rPr>
-          <w:rFonts w:ascii="Calibri" w:cs="Calibri" w:eastAsia="Calibri" w:hAnsi="Calibri"/>
-          <w:b/>
-          <w:bCs/>
-          <w:color w:val="1F4E79"/>
-          <w:sz w:val="26"/>
-          <w:szCs w:val="26"/>
-        </w:rPr>
-        <w:t xml:space="preserve">9.5 Architecture technique de l'infrastructure</w:t>
+        <w:t xml:space="preserve">Modification du sizing des allocations cibles selon le palier en vigueur.</w:t>
       </w:r>
     </w:p>
     <w:p>
@@ -9600,7 +11632,24 @@
           <w:sz w:val="22"/>
           <w:szCs w:val="22"/>
         </w:rPr>
-        <w:t xml:space="preserve">VPS Linux (3-5 €/mois) avec Xvfb pour gérer le pseudo-display imposé par IB Gateway non-headless.</w:t>
+        <w:t xml:space="preserve">Test de la transition entre paliers, vérification que le portefeuille suit bien la cible avec respect des contraintes opérationnelles.</w:t>
+      </w:r>
+    </w:p>
+    <w:p>
+      <w:pPr>
+        <w:pStyle w:val="Heading2"/>
+        <w:spacing w:after="140" w:before="280"/>
+      </w:pPr>
+      <w:r>
+        <w:rPr>
+          <w:rFonts w:ascii="Calibri" w:cs="Calibri" w:eastAsia="Calibri" w:hAnsi="Calibri"/>
+          <w:b/>
+          <w:bCs/>
+          <w:color w:val="1F4E79"/>
+          <w:sz w:val="26"/>
+          <w:szCs w:val="26"/>
+        </w:rPr>
+        <w:t xml:space="preserve">9.5 Architecture technique de l'infrastructure</w:t>
       </w:r>
     </w:p>
     <w:p>
@@ -9619,7 +11668,7 @@
           <w:sz w:val="22"/>
           <w:szCs w:val="22"/>
         </w:rPr>
-        <w:t xml:space="preserve">Activation de l'auto-restart quotidien IBKR pour limiter les ré-authentifications.</w:t>
+        <w:t xml:space="preserve">VPS Linux (3-5 €/mois) avec Xvfb pour gérer le pseudo-display imposé par IB Gateway non-headless.</w:t>
       </w:r>
     </w:p>
     <w:p>
@@ -9638,7 +11687,7 @@
           <w:sz w:val="22"/>
           <w:szCs w:val="22"/>
         </w:rPr>
-        <w:t xml:space="preserve">Bibliothèque Python : ib_async (fork maintenu de ib_insync).</w:t>
+        <w:t xml:space="preserve">Activation de l'auto-restart quotidien IBKR pour limiter les ré-authentifications.</w:t>
       </w:r>
     </w:p>
     <w:p>
@@ -9657,7 +11706,7 @@
           <w:sz w:val="22"/>
           <w:szCs w:val="22"/>
         </w:rPr>
-        <w:t xml:space="preserve">Modules séparés : récupération de données, calcul des signaux, génération des ordres, exécution avec gestion T+2.</w:t>
+        <w:t xml:space="preserve">Bibliothèque Python : ib_async (fork maintenu de ib_insync).</w:t>
       </w:r>
     </w:p>
     <w:p>
@@ -9676,38 +11725,7 @@
           <w:sz w:val="22"/>
           <w:szCs w:val="22"/>
         </w:rPr>
-        <w:t xml:space="preserve">Tests préalables sur compte paper trading IBKR.</w:t>
-      </w:r>
-    </w:p>
-    <w:p>
-      <w:pPr>
-        <w:pStyle w:val="Heading2"/>
-        <w:spacing w:after="140" w:before="280"/>
-      </w:pPr>
-      <w:r>
-        <w:rPr>
-          <w:rFonts w:ascii="Calibri" w:cs="Calibri" w:eastAsia="Calibri" w:hAnsi="Calibri"/>
-          <w:b/>
-          <w:bCs/>
-          <w:color w:val="1F4E79"/>
-          <w:sz w:val="26"/>
-          <w:szCs w:val="26"/>
-        </w:rPr>
-        <w:t xml:space="preserve">9.6 Kill switch et garde-fous d'exécution</w:t>
-      </w:r>
-    </w:p>
-    <w:p>
-      <w:pPr>
-        <w:spacing w:after="120" w:before="0" w:line="300"/>
-      </w:pPr>
-      <w:r>
-        <w:rPr>
-          <w:rFonts w:ascii="Calibri" w:cs="Calibri" w:eastAsia="Calibri" w:hAnsi="Calibri"/>
-          <w:color w:val="1F1F1F"/>
-          <w:sz w:val="22"/>
-          <w:szCs w:val="22"/>
-        </w:rPr>
-        <w:t xml:space="preserve">Indispensable pour toute exécution automatisée. Le script s'arrête immédiatement et envoie une alerte humaine (mail, SMS via Twilio) en cas de :</w:t>
+        <w:t xml:space="preserve">Modules séparés : récupération de données, calcul des signaux, génération des ordres, exécution avec gestion T+2.</w:t>
       </w:r>
     </w:p>
     <w:p>
@@ -9726,7 +11744,38 @@
           <w:sz w:val="22"/>
           <w:szCs w:val="22"/>
         </w:rPr>
-        <w:t xml:space="preserve">Différence &gt; 1 % entre l'état théorique du portefeuille et l'état réel constaté en début de cycle.</w:t>
+        <w:t xml:space="preserve">Tests préalables sur compte paper trading IBKR.</w:t>
+      </w:r>
+    </w:p>
+    <w:p>
+      <w:pPr>
+        <w:pStyle w:val="Heading2"/>
+        <w:spacing w:after="140" w:before="280"/>
+      </w:pPr>
+      <w:r>
+        <w:rPr>
+          <w:rFonts w:ascii="Calibri" w:cs="Calibri" w:eastAsia="Calibri" w:hAnsi="Calibri"/>
+          <w:b/>
+          <w:bCs/>
+          <w:color w:val="1F4E79"/>
+          <w:sz w:val="26"/>
+          <w:szCs w:val="26"/>
+        </w:rPr>
+        <w:t xml:space="preserve">9.6 Kill switch et garde-fous d'exécution</w:t>
+      </w:r>
+    </w:p>
+    <w:p>
+      <w:pPr>
+        <w:spacing w:after="120" w:before="0" w:line="300"/>
+      </w:pPr>
+      <w:r>
+        <w:rPr>
+          <w:rFonts w:ascii="Calibri" w:cs="Calibri" w:eastAsia="Calibri" w:hAnsi="Calibri"/>
+          <w:color w:val="1F1F1F"/>
+          <w:sz w:val="22"/>
+          <w:szCs w:val="22"/>
+        </w:rPr>
+        <w:t xml:space="preserve">Indispensable pour toute exécution automatisée. Le script s'arrête immédiatement et envoie une alerte humaine (mail, SMS via Twilio) en cas de :</w:t>
       </w:r>
     </w:p>
     <w:p>
@@ -9745,7 +11794,7 @@
           <w:sz w:val="22"/>
           <w:szCs w:val="22"/>
         </w:rPr>
-        <w:t xml:space="preserve">Ordre rejeté ou exécuté partiellement.</w:t>
+        <w:t xml:space="preserve">Différence &gt; 1 % entre l'état théorique du portefeuille et l'état réel constaté en début de cycle.</w:t>
       </w:r>
     </w:p>
     <w:p>
@@ -9764,7 +11813,7 @@
           <w:sz w:val="22"/>
           <w:szCs w:val="22"/>
         </w:rPr>
-        <w:t xml:space="preserve">Données de marché manquantes pour un ou plusieurs ETF du pool.</w:t>
+        <w:t xml:space="preserve">Ordre rejeté ou exécuté partiellement.</w:t>
       </w:r>
     </w:p>
     <w:p>
@@ -9783,7 +11832,7 @@
           <w:sz w:val="22"/>
           <w:szCs w:val="22"/>
         </w:rPr>
-        <w:t xml:space="preserve">Disconnect persistant de l'API IBKR (&gt; 5 minutes).</w:t>
+        <w:t xml:space="preserve">Données de marché manquantes pour un ou plusieurs ETF du pool.</w:t>
       </w:r>
     </w:p>
     <w:p>
@@ -9802,63 +11851,7 @@
           <w:sz w:val="22"/>
           <w:szCs w:val="22"/>
         </w:rPr>
-        <w:t xml:space="preserve">Anomalie sur le PRU ou la quantité d'une ligne (cohérence comptable).</w:t>
-      </w:r>
-    </w:p>
-    <w:p>
-      <w:pPr>
-        <w:spacing w:after="120" w:before="0" w:line="300"/>
-      </w:pPr>
-      <w:r>
-        <w:rPr>
-          <w:rFonts w:ascii="Calibri" w:cs="Calibri" w:eastAsia="Calibri" w:hAnsi="Calibri"/>
-          <w:b/>
-          <w:bCs/>
-          <w:color w:val="1F1F1F"/>
-          <w:sz w:val="22"/>
-          <w:szCs w:val="22"/>
-        </w:rPr>
-        <w:t xml:space="preserve">Principe : </w:t>
-      </w:r>
-      <w:r>
-        <w:rPr>
-          <w:rFonts w:ascii="Calibri" w:cs="Calibri" w:eastAsia="Calibri" w:hAnsi="Calibri"/>
-          <w:color w:val="1F1F1F"/>
-          <w:sz w:val="22"/>
-          <w:szCs w:val="22"/>
-        </w:rPr>
-        <w:t xml:space="preserve">aucun "best effort" en cas d'anomalie. La règle est simple : tout doute déclenche un arrêt et une attente d'intervention humaine. Mieux vaut un cycle manqué qu'une exécution dégradée.</w:t>
-      </w:r>
-    </w:p>
-    <w:p>
-      <w:pPr>
-        <w:pStyle w:val="Heading2"/>
-        <w:spacing w:after="140" w:before="280"/>
-      </w:pPr>
-      <w:r>
-        <w:rPr>
-          <w:rFonts w:ascii="Calibri" w:cs="Calibri" w:eastAsia="Calibri" w:hAnsi="Calibri"/>
-          <w:b/>
-          <w:bCs/>
-          <w:color w:val="1F4E79"/>
-          <w:sz w:val="26"/>
-          <w:szCs w:val="26"/>
-        </w:rPr>
-        <w:t xml:space="preserve">9.7 Journalisation et piste d'audit</w:t>
-      </w:r>
-    </w:p>
-    <w:p>
-      <w:pPr>
-        <w:spacing w:after="120" w:before="0" w:line="300"/>
-      </w:pPr>
-      <w:r>
-        <w:rPr>
-          <w:rFonts w:ascii="Calibri" w:cs="Calibri" w:eastAsia="Calibri" w:hAnsi="Calibri"/>
-          <w:color w:val="1F1F1F"/>
-          <w:sz w:val="22"/>
-          <w:szCs w:val="22"/>
-        </w:rPr>
-        <w:t xml:space="preserve">À chaque cycle mensuel, le script produit et archive :</w:t>
+        <w:t xml:space="preserve">Disconnect persistant de l'API IBKR (&gt; 5 minutes).</w:t>
       </w:r>
     </w:p>
     <w:p>
@@ -9877,7 +11870,63 @@
           <w:sz w:val="22"/>
           <w:szCs w:val="22"/>
         </w:rPr>
-        <w:t xml:space="preserve">Snapshot CSV de l'état du portefeuille (positions, valorisations, allocations vs cibles).</w:t>
+        <w:t xml:space="preserve">Anomalie sur le PRU ou la quantité d'une ligne (cohérence comptable).</w:t>
+      </w:r>
+    </w:p>
+    <w:p>
+      <w:pPr>
+        <w:spacing w:after="120" w:before="0" w:line="300"/>
+      </w:pPr>
+      <w:r>
+        <w:rPr>
+          <w:rFonts w:ascii="Calibri" w:cs="Calibri" w:eastAsia="Calibri" w:hAnsi="Calibri"/>
+          <w:b/>
+          <w:bCs/>
+          <w:color w:val="1F1F1F"/>
+          <w:sz w:val="22"/>
+          <w:szCs w:val="22"/>
+        </w:rPr>
+        <w:t xml:space="preserve">Principe : </w:t>
+      </w:r>
+      <w:r>
+        <w:rPr>
+          <w:rFonts w:ascii="Calibri" w:cs="Calibri" w:eastAsia="Calibri" w:hAnsi="Calibri"/>
+          <w:color w:val="1F1F1F"/>
+          <w:sz w:val="22"/>
+          <w:szCs w:val="22"/>
+        </w:rPr>
+        <w:t xml:space="preserve">aucun "best effort" en cas d'anomalie. La règle est simple : tout doute déclenche un arrêt et une attente d'intervention humaine. Mieux vaut un cycle manqué qu'une exécution dégradée.</w:t>
+      </w:r>
+    </w:p>
+    <w:p>
+      <w:pPr>
+        <w:pStyle w:val="Heading2"/>
+        <w:spacing w:after="140" w:before="280"/>
+      </w:pPr>
+      <w:r>
+        <w:rPr>
+          <w:rFonts w:ascii="Calibri" w:cs="Calibri" w:eastAsia="Calibri" w:hAnsi="Calibri"/>
+          <w:b/>
+          <w:bCs/>
+          <w:color w:val="1F4E79"/>
+          <w:sz w:val="26"/>
+          <w:szCs w:val="26"/>
+        </w:rPr>
+        <w:t xml:space="preserve">9.7 Journalisation et piste d'audit</w:t>
+      </w:r>
+    </w:p>
+    <w:p>
+      <w:pPr>
+        <w:spacing w:after="120" w:before="0" w:line="300"/>
+      </w:pPr>
+      <w:r>
+        <w:rPr>
+          <w:rFonts w:ascii="Calibri" w:cs="Calibri" w:eastAsia="Calibri" w:hAnsi="Calibri"/>
+          <w:color w:val="1F1F1F"/>
+          <w:sz w:val="22"/>
+          <w:szCs w:val="22"/>
+        </w:rPr>
+        <w:t xml:space="preserve">À chaque cycle mensuel, le script produit et archive :</w:t>
       </w:r>
     </w:p>
     <w:p>
@@ -9896,7 +11945,7 @@
           <w:sz w:val="22"/>
           <w:szCs w:val="22"/>
         </w:rPr>
-        <w:t xml:space="preserve">Log complet des ordres générés et exécutés (horodatage, prix, quantité, frais).</w:t>
+        <w:t xml:space="preserve">Snapshot CSV de l'état du portefeuille (positions, valorisations, allocations vs cibles).</w:t>
       </w:r>
     </w:p>
     <w:p>
@@ -9915,7 +11964,7 @@
           <w:sz w:val="22"/>
           <w:szCs w:val="22"/>
         </w:rPr>
-        <w:t xml:space="preserve">Historique des signaux du cycle (CW8 vs MM200 avec position en %, momentum 6 mois de chaque ETF, palier d'overlay actif).</w:t>
+        <w:t xml:space="preserve">Log complet des ordres générés et exécutés (horodatage, prix, quantité, frais).</w:t>
       </w:r>
     </w:p>
     <w:p>
@@ -9934,38 +11983,7 @@
           <w:sz w:val="22"/>
           <w:szCs w:val="22"/>
         </w:rPr>
-        <w:t xml:space="preserve">Stockage en local (versionné Git) et synchronisé sur cloud (Backblaze B2 ou équivalent).</w:t>
-      </w:r>
-    </w:p>
-    <w:p>
-      <w:pPr>
-        <w:spacing w:after="120" w:before="0" w:line="300"/>
-      </w:pPr>
-      <w:r>
-        <w:rPr>
-          <w:rFonts w:ascii="Calibri" w:cs="Calibri" w:eastAsia="Calibri" w:hAnsi="Calibri"/>
-          <w:color w:val="1F1F1F"/>
-          <w:sz w:val="22"/>
-          <w:szCs w:val="22"/>
-        </w:rPr>
-        <w:t xml:space="preserve">Bénéfices : audit fiscal facilité, debug en cas d'anomalie, historique disponible pour analyse rétrospective et révisions futures de la stratégie.</w:t>
-      </w:r>
-    </w:p>
-    <w:p>
-      <w:pPr>
-        <w:pStyle w:val="Heading2"/>
-        <w:spacing w:after="140" w:before="280"/>
-      </w:pPr>
-      <w:r>
-        <w:rPr>
-          <w:rFonts w:ascii="Calibri" w:cs="Calibri" w:eastAsia="Calibri" w:hAnsi="Calibri"/>
-          <w:b/>
-          <w:bCs/>
-          <w:color w:val="1F4E79"/>
-          <w:sz w:val="26"/>
-          <w:szCs w:val="26"/>
-        </w:rPr>
-        <w:t xml:space="preserve">9.8 Gestion d'erreurs API</w:t>
+        <w:t xml:space="preserve">Historique des signaux du cycle (CW8 vs MM200 avec position en %, momentum 6 mois de chaque ETF, palier d'overlay actif).</w:t>
       </w:r>
     </w:p>
     <w:p>
@@ -9984,7 +12002,38 @@
           <w:sz w:val="22"/>
           <w:szCs w:val="22"/>
         </w:rPr>
-        <w:t xml:space="preserve">Retry exponentiel sur les erreurs transitoires (max 3 tentatives, intervalle doublant à chaque essai).</w:t>
+        <w:t xml:space="preserve">Stockage en local (versionné Git) et synchronisé sur cloud (Backblaze B2 ou équivalent).</w:t>
+      </w:r>
+    </w:p>
+    <w:p>
+      <w:pPr>
+        <w:spacing w:after="120" w:before="0" w:line="300"/>
+      </w:pPr>
+      <w:r>
+        <w:rPr>
+          <w:rFonts w:ascii="Calibri" w:cs="Calibri" w:eastAsia="Calibri" w:hAnsi="Calibri"/>
+          <w:color w:val="1F1F1F"/>
+          <w:sz w:val="22"/>
+          <w:szCs w:val="22"/>
+        </w:rPr>
+        <w:t xml:space="preserve">Bénéfices : audit fiscal facilité, debug en cas d'anomalie, historique disponible pour analyse rétrospective et révisions futures de la stratégie.</w:t>
+      </w:r>
+    </w:p>
+    <w:p>
+      <w:pPr>
+        <w:pStyle w:val="Heading2"/>
+        <w:spacing w:after="140" w:before="280"/>
+      </w:pPr>
+      <w:r>
+        <w:rPr>
+          <w:rFonts w:ascii="Calibri" w:cs="Calibri" w:eastAsia="Calibri" w:hAnsi="Calibri"/>
+          <w:b/>
+          <w:bCs/>
+          <w:color w:val="1F4E79"/>
+          <w:sz w:val="26"/>
+          <w:szCs w:val="26"/>
+        </w:rPr>
+        <w:t xml:space="preserve">9.8 Gestion d'erreurs API</w:t>
       </w:r>
     </w:p>
     <w:p>
@@ -10003,7 +12052,7 @@
           <w:sz w:val="22"/>
           <w:szCs w:val="22"/>
         </w:rPr>
-        <w:t xml:space="preserve">Gestion explicite des cas marchés fermés / jours fériés Euronext (utilisation du calendrier officiel).</w:t>
+        <w:t xml:space="preserve">Retry exponentiel sur les erreurs transitoires (max 3 tentatives, intervalle doublant à chaque essai).</w:t>
       </w:r>
     </w:p>
     <w:p>
@@ -10022,7 +12071,7 @@
           <w:sz w:val="22"/>
           <w:szCs w:val="22"/>
         </w:rPr>
-        <w:t xml:space="preserve">Détection des disconnects IB Gateway et reconnexion automatique avec timeout.</w:t>
+        <w:t xml:space="preserve">Gestion explicite des cas marchés fermés / jours fériés Euronext (utilisation du calendrier officiel).</w:t>
       </w:r>
     </w:p>
     <w:p>
@@ -10041,7 +12090,7 @@
           <w:sz w:val="22"/>
           <w:szCs w:val="22"/>
         </w:rPr>
-        <w:t xml:space="preserve">Synchronisation systématique du portefeuille réel vs attendu en début de chaque cycle.</w:t>
+        <w:t xml:space="preserve">Détection des disconnects IB Gateway et reconnexion automatique avec timeout.</w:t>
       </w:r>
     </w:p>
     <w:p>
@@ -10060,38 +12109,7 @@
           <w:sz w:val="22"/>
           <w:szCs w:val="22"/>
         </w:rPr>
-        <w:t xml:space="preserve">Logging structuré (JSON) de toutes les interactions API pour traçabilité.</w:t>
-      </w:r>
-    </w:p>
-    <w:p>
-      <w:pPr>
-        <w:pStyle w:val="Heading2"/>
-        <w:spacing w:after="140" w:before="280"/>
-      </w:pPr>
-      <w:r>
-        <w:rPr>
-          <w:rFonts w:ascii="Calibri" w:cs="Calibri" w:eastAsia="Calibri" w:hAnsi="Calibri"/>
-          <w:b/>
-          <w:bCs/>
-          <w:color w:val="1F4E79"/>
-          <w:sz w:val="26"/>
-          <w:szCs w:val="26"/>
-        </w:rPr>
-        <w:t xml:space="preserve">9.9 Plan de rollback</w:t>
-      </w:r>
-    </w:p>
-    <w:p>
-      <w:pPr>
-        <w:spacing w:after="120" w:before="0" w:line="300"/>
-      </w:pPr>
-      <w:r>
-        <w:rPr>
-          <w:rFonts w:ascii="Calibri" w:cs="Calibri" w:eastAsia="Calibri" w:hAnsi="Calibri"/>
-          <w:color w:val="1F1F1F"/>
-          <w:sz w:val="22"/>
-          <w:szCs w:val="22"/>
-        </w:rPr>
-        <w:t xml:space="preserve">Scénarios de défaillance plateforme et plans de continuité associés :</w:t>
+        <w:t xml:space="preserve">Synchronisation systématique du portefeuille réel vs attendu en début de chaque cycle.</w:t>
       </w:r>
     </w:p>
     <w:p>
@@ -10106,22 +12124,42 @@
       <w:r>
         <w:rPr>
           <w:rFonts w:ascii="Calibri" w:cs="Calibri" w:eastAsia="Calibri" w:hAnsi="Calibri"/>
+          <w:color w:val="1F1F1F"/>
+          <w:sz w:val="22"/>
+          <w:szCs w:val="22"/>
+        </w:rPr>
+        <w:t xml:space="preserve">Logging structuré (JSON) de toutes les interactions API pour traçabilité.</w:t>
+      </w:r>
+    </w:p>
+    <w:p>
+      <w:pPr>
+        <w:pStyle w:val="Heading2"/>
+        <w:spacing w:after="140" w:before="280"/>
+      </w:pPr>
+      <w:r>
+        <w:rPr>
+          <w:rFonts w:ascii="Calibri" w:cs="Calibri" w:eastAsia="Calibri" w:hAnsi="Calibri"/>
           <w:b/>
           <w:bCs/>
-          <w:color w:val="1F1F1F"/>
-          <w:sz w:val="22"/>
-          <w:szCs w:val="22"/>
-        </w:rPr>
-        <w:t xml:space="preserve">IBKR cesse de proposer le PEA français : </w:t>
-      </w:r>
-      <w:r>
-        <w:rPr>
-          <w:rFonts w:ascii="Calibri" w:cs="Calibri" w:eastAsia="Calibri" w:hAnsi="Calibri"/>
-          <w:color w:val="1F1F1F"/>
-          <w:sz w:val="22"/>
-          <w:szCs w:val="22"/>
-        </w:rPr>
-        <w:t xml:space="preserve">transfert vers Saxo Banque (qui dispose aussi d'une API REST OpenAPI mature et propose le PEA). Délai de bascule estimé à 3 mois (transfert PEA standard).</w:t>
+          <w:color w:val="1F4E79"/>
+          <w:sz w:val="26"/>
+          <w:szCs w:val="26"/>
+        </w:rPr>
+        <w:t xml:space="preserve">9.9 Plan de rollback</w:t>
+      </w:r>
+    </w:p>
+    <w:p>
+      <w:pPr>
+        <w:spacing w:after="120" w:before="0" w:line="300"/>
+      </w:pPr>
+      <w:r>
+        <w:rPr>
+          <w:rFonts w:ascii="Calibri" w:cs="Calibri" w:eastAsia="Calibri" w:hAnsi="Calibri"/>
+          <w:color w:val="1F1F1F"/>
+          <w:sz w:val="22"/>
+          <w:szCs w:val="22"/>
+        </w:rPr>
+        <w:t xml:space="preserve">Scénarios de défaillance plateforme et plans de continuité associés :</w:t>
       </w:r>
     </w:p>
     <w:p>
@@ -10142,16 +12180,16 @@
           <w:sz w:val="22"/>
           <w:szCs w:val="22"/>
         </w:rPr>
-        <w:t xml:space="preserve">Modification rupture de la TWS API : </w:t>
-      </w:r>
-      <w:r>
-        <w:rPr>
-          <w:rFonts w:ascii="Calibri" w:cs="Calibri" w:eastAsia="Calibri" w:hAnsi="Calibri"/>
-          <w:color w:val="1F1F1F"/>
-          <w:sz w:val="22"/>
-          <w:szCs w:val="22"/>
-        </w:rPr>
-        <w:t xml:space="preserve">bascule sur l'API Web REST IBKR (alternative supportée). Effort de réécriture estimé à 2 semaines.</w:t>
+        <w:t xml:space="preserve">IBKR cesse de proposer le PEA français : </w:t>
+      </w:r>
+      <w:r>
+        <w:rPr>
+          <w:rFonts w:ascii="Calibri" w:cs="Calibri" w:eastAsia="Calibri" w:hAnsi="Calibri"/>
+          <w:color w:val="1F1F1F"/>
+          <w:sz w:val="22"/>
+          <w:szCs w:val="22"/>
+        </w:rPr>
+        <w:t xml:space="preserve">transfert vers Saxo Banque (qui dispose aussi d'une API REST OpenAPI mature et propose le PEA). Délai de bascule estimé à 3 mois (transfert PEA standard).</w:t>
       </w:r>
     </w:p>
     <w:p>
@@ -10172,6 +12210,36 @@
           <w:sz w:val="22"/>
           <w:szCs w:val="22"/>
         </w:rPr>
+        <w:t xml:space="preserve">Modification rupture de la TWS API : </w:t>
+      </w:r>
+      <w:r>
+        <w:rPr>
+          <w:rFonts w:ascii="Calibri" w:cs="Calibri" w:eastAsia="Calibri" w:hAnsi="Calibri"/>
+          <w:color w:val="1F1F1F"/>
+          <w:sz w:val="22"/>
+          <w:szCs w:val="22"/>
+        </w:rPr>
+        <w:t xml:space="preserve">bascule sur l'API Web REST IBKR (alternative supportée). Effort de réécriture estimé à 2 semaines.</w:t>
+      </w:r>
+    </w:p>
+    <w:p>
+      <w:pPr>
+        <w:pStyle w:val="ListParagraph"/>
+        <w:numPr>
+          <w:ilvl w:val="0"/>
+          <w:numId w:val="2"/>
+        </w:numPr>
+        <w:spacing w:after="80" w:line="280"/>
+      </w:pPr>
+      <w:r>
+        <w:rPr>
+          <w:rFonts w:ascii="Calibri" w:cs="Calibri" w:eastAsia="Calibri" w:hAnsi="Calibri"/>
+          <w:b/>
+          <w:bCs/>
+          <w:color w:val="1F1F1F"/>
+          <w:sz w:val="22"/>
+          <w:szCs w:val="22"/>
+        </w:rPr>
         <w:t xml:space="preserve">Incident persistant côté infrastructure (VPS, IB Gateway) : </w:t>
       </w:r>
       <w:r>
@@ -10198,7 +12266,341 @@
           <w:sz w:val="26"/>
           <w:szCs w:val="26"/>
         </w:rPr>
-        <w:t xml:space="preserve">9.10 Évolutions futures</w:t>
+        <w:t xml:space="preserve">9.10 Gouvernance et évolution de la stratégie</w:t>
+      </w:r>
+    </w:p>
+    <w:p>
+      <w:pPr>
+        <w:pStyle w:val="Heading3"/>
+        <w:spacing w:after="100" w:before="220"/>
+      </w:pPr>
+      <w:r>
+        <w:rPr>
+          <w:rFonts w:ascii="Calibri" w:cs="Calibri" w:eastAsia="Calibri" w:hAnsi="Calibri"/>
+          <w:b/>
+          <w:bCs/>
+          <w:color w:val="2E75B6"/>
+          <w:sz w:val="23"/>
+          <w:szCs w:val="23"/>
+        </w:rPr>
+        <w:t xml:space="preserve">Cadrage philosophique de la stratégie</w:t>
+      </w:r>
+    </w:p>
+    <w:p>
+      <w:pPr>
+        <w:spacing w:after="120" w:before="0" w:line="300"/>
+      </w:pPr>
+      <w:r>
+        <w:rPr>
+          <w:rFonts w:ascii="Calibri" w:cs="Calibri" w:eastAsia="Calibri" w:hAnsi="Calibri"/>
+          <w:color w:val="1F1F1F"/>
+          <w:sz w:val="22"/>
+          <w:szCs w:val="22"/>
+        </w:rPr>
+        <w:t xml:space="preserve">La stratégie est explicitement conçue comme une </w:t>
+      </w:r>
+      <w:r>
+        <w:rPr>
+          <w:rFonts w:ascii="Calibri" w:cs="Calibri" w:eastAsia="Calibri" w:hAnsi="Calibri"/>
+          <w:b/>
+          <w:bCs/>
+          <w:color w:val="1F1F1F"/>
+          <w:sz w:val="22"/>
+          <w:szCs w:val="22"/>
+        </w:rPr>
+        <w:t xml:space="preserve">optimisation comportementale</w:t>
+      </w:r>
+      <w:r>
+        <w:rPr>
+          <w:rFonts w:ascii="Calibri" w:cs="Calibri" w:eastAsia="Calibri" w:hAnsi="Calibri"/>
+          <w:color w:val="1F1F1F"/>
+          <w:sz w:val="22"/>
+          <w:szCs w:val="22"/>
+        </w:rPr>
+        <w:t xml:space="preserve">, pas comme une machine à surperformer le marché. Sa raison d'être est de réduire les drawdowns et la volatilité afin de maximiser la probabilité de tenir 20 ans, et non de produire un rendement supérieur à un buy-and-hold passif. Cette distinction est fondamentale : sur le rendement terminal pur, un DCA simple sur ETF World peut très probablement surperformer la stratégie ici décrite. Le bénéfice attendu est ailleurs : dans la qualité d'expérience d'investissement, la robustesse psychologique, et la tenue de la discipline sur le long terme.</w:t>
+      </w:r>
+    </w:p>
+    <w:p>
+      <w:pPr>
+        <w:spacing w:after="240"/>
+      </w:pPr>
+    </w:p>
+    <w:p>
+      <w:pPr>
+        <w:pStyle w:val="Heading3"/>
+        <w:spacing w:after="100" w:before="220"/>
+      </w:pPr>
+      <w:r>
+        <w:rPr>
+          <w:rFonts w:ascii="Calibri" w:cs="Calibri" w:eastAsia="Calibri" w:hAnsi="Calibri"/>
+          <w:b/>
+          <w:bCs/>
+          <w:color w:val="2E75B6"/>
+          <w:sz w:val="23"/>
+          <w:szCs w:val="23"/>
+        </w:rPr>
+        <w:t xml:space="preserve">Règle d'or anti-complexification</w:t>
+      </w:r>
+    </w:p>
+    <w:p>
+      <w:pPr>
+        <w:spacing w:after="120" w:before="0" w:line="300"/>
+      </w:pPr>
+      <w:r>
+        <w:rPr>
+          <w:rFonts w:ascii="Calibri" w:cs="Calibri" w:eastAsia="Calibri" w:hAnsi="Calibri"/>
+          <w:color w:val="C00000"/>
+          <w:sz w:val="22"/>
+          <w:szCs w:val="22"/>
+        </w:rPr>
+        <w:t xml:space="preserve">Tout ajout futur à la stratégie ou à l'infrastructure doit, soit réduire la complexité effective du système, soit améliorer significativement sa robustesse. </w:t>
+      </w:r>
+      <w:r>
+        <w:rPr>
+          <w:rFonts w:ascii="Calibri" w:cs="Calibri" w:eastAsia="Calibri" w:hAnsi="Calibri"/>
+          <w:color w:val="1F1F1F"/>
+          <w:sz w:val="22"/>
+          <w:szCs w:val="22"/>
+        </w:rPr>
+        <w:t xml:space="preserve">Aucun ajout ne se justifie par la simple curiosité technique, le suivi de tendance (« il faudrait peut-être ajouter un signal RSI », « un filtre macro », « un modèle d'IA de régime ») ou l'optimisation marginale. La sophistication progressive est le principal mode d'échec des stratégies systématiques personnelles.</w:t>
+      </w:r>
+    </w:p>
+    <w:p>
+      <w:pPr>
+        <w:spacing w:after="240"/>
+      </w:pPr>
+    </w:p>
+    <w:p>
+      <w:pPr>
+        <w:pStyle w:val="Heading3"/>
+        <w:spacing w:after="100" w:before="220"/>
+      </w:pPr>
+      <w:r>
+        <w:rPr>
+          <w:rFonts w:ascii="Calibri" w:cs="Calibri" w:eastAsia="Calibri" w:hAnsi="Calibri"/>
+          <w:b/>
+          <w:bCs/>
+          <w:color w:val="2E75B6"/>
+          <w:sz w:val="23"/>
+          <w:szCs w:val="23"/>
+        </w:rPr>
+        <w:t xml:space="preserve">Règle de gouvernance des modifications</w:t>
+      </w:r>
+    </w:p>
+    <w:p>
+      <w:pPr>
+        <w:spacing w:after="120" w:before="0" w:line="300"/>
+      </w:pPr>
+      <w:r>
+        <w:rPr>
+          <w:rFonts w:ascii="Calibri" w:cs="Calibri" w:eastAsia="Calibri" w:hAnsi="Calibri"/>
+          <w:color w:val="1F1F1F"/>
+          <w:sz w:val="22"/>
+          <w:szCs w:val="22"/>
+        </w:rPr>
+        <w:t xml:space="preserve">Aucun changement structurel à la stratégie n'est autorisé en dehors du cadre suivant :</w:t>
+      </w:r>
+    </w:p>
+    <w:p>
+      <w:pPr>
+        <w:pStyle w:val="ListParagraph"/>
+        <w:numPr>
+          <w:ilvl w:val="0"/>
+          <w:numId w:val="2"/>
+        </w:numPr>
+        <w:spacing w:after="80" w:line="280"/>
+      </w:pPr>
+      <w:r>
+        <w:rPr>
+          <w:rFonts w:ascii="Calibri" w:cs="Calibri" w:eastAsia="Calibri" w:hAnsi="Calibri"/>
+          <w:b/>
+          <w:bCs/>
+          <w:color w:val="1F1F1F"/>
+          <w:sz w:val="22"/>
+          <w:szCs w:val="22"/>
+        </w:rPr>
+        <w:t xml:space="preserve">Délai minimum d'observation : </w:t>
+      </w:r>
+      <w:r>
+        <w:rPr>
+          <w:rFonts w:ascii="Calibri" w:cs="Calibri" w:eastAsia="Calibri" w:hAnsi="Calibri"/>
+          <w:color w:val="1F1F1F"/>
+          <w:sz w:val="22"/>
+          <w:szCs w:val="22"/>
+        </w:rPr>
+        <w:t xml:space="preserve">24 mois de données de production réelle accumulées avant toute modification structurelle. Aucune dérogation.</w:t>
+      </w:r>
+    </w:p>
+    <w:p>
+      <w:pPr>
+        <w:pStyle w:val="ListParagraph"/>
+        <w:numPr>
+          <w:ilvl w:val="0"/>
+          <w:numId w:val="2"/>
+        </w:numPr>
+        <w:spacing w:after="80" w:line="280"/>
+      </w:pPr>
+      <w:r>
+        <w:rPr>
+          <w:rFonts w:ascii="Calibri" w:cs="Calibri" w:eastAsia="Calibri" w:hAnsi="Calibri"/>
+          <w:b/>
+          <w:bCs/>
+          <w:color w:val="1F1F1F"/>
+          <w:sz w:val="22"/>
+          <w:szCs w:val="22"/>
+        </w:rPr>
+        <w:t xml:space="preserve">Aucun changement basé sur un événement isolé : </w:t>
+      </w:r>
+      <w:r>
+        <w:rPr>
+          <w:rFonts w:ascii="Calibri" w:cs="Calibri" w:eastAsia="Calibri" w:hAnsi="Calibri"/>
+          <w:color w:val="1F1F1F"/>
+          <w:sz w:val="22"/>
+          <w:szCs w:val="22"/>
+        </w:rPr>
+        <w:t xml:space="preserve">ni une seule crise, ni une seule période de sous-performance, ni un seul backtest, ni une intuition discrétionnaire ne suffit à motiver une modification.</w:t>
+      </w:r>
+    </w:p>
+    <w:p>
+      <w:pPr>
+        <w:pStyle w:val="ListParagraph"/>
+        <w:numPr>
+          <w:ilvl w:val="0"/>
+          <w:numId w:val="2"/>
+        </w:numPr>
+        <w:spacing w:after="80" w:line="280"/>
+      </w:pPr>
+      <w:r>
+        <w:rPr>
+          <w:rFonts w:ascii="Calibri" w:cs="Calibri" w:eastAsia="Calibri" w:hAnsi="Calibri"/>
+          <w:b/>
+          <w:bCs/>
+          <w:color w:val="1F1F1F"/>
+          <w:sz w:val="22"/>
+          <w:szCs w:val="22"/>
+        </w:rPr>
+        <w:t xml:space="preserve">Hypothèse falsifiable obligatoire : </w:t>
+      </w:r>
+      <w:r>
+        <w:rPr>
+          <w:rFonts w:ascii="Calibri" w:cs="Calibri" w:eastAsia="Calibri" w:hAnsi="Calibri"/>
+          <w:color w:val="1F1F1F"/>
+          <w:sz w:val="22"/>
+          <w:szCs w:val="22"/>
+        </w:rPr>
+        <w:t xml:space="preserve">toute modification proposée doit s'accompagner d'une hypothèse précise et testable ("je m'attends à observer X dans les conditions Y"), pas d'une intuition générique.</w:t>
+      </w:r>
+    </w:p>
+    <w:p>
+      <w:pPr>
+        <w:pStyle w:val="ListParagraph"/>
+        <w:numPr>
+          <w:ilvl w:val="0"/>
+          <w:numId w:val="2"/>
+        </w:numPr>
+        <w:spacing w:after="80" w:line="280"/>
+      </w:pPr>
+      <w:r>
+        <w:rPr>
+          <w:rFonts w:ascii="Calibri" w:cs="Calibri" w:eastAsia="Calibri" w:hAnsi="Calibri"/>
+          <w:b/>
+          <w:bCs/>
+          <w:color w:val="1F1F1F"/>
+          <w:sz w:val="22"/>
+          <w:szCs w:val="22"/>
+        </w:rPr>
+        <w:t xml:space="preserve">Test hors échantillon obligatoire : </w:t>
+      </w:r>
+      <w:r>
+        <w:rPr>
+          <w:rFonts w:ascii="Calibri" w:cs="Calibri" w:eastAsia="Calibri" w:hAnsi="Calibri"/>
+          <w:color w:val="1F1F1F"/>
+          <w:sz w:val="22"/>
+          <w:szCs w:val="22"/>
+        </w:rPr>
+        <w:t xml:space="preserve">validation sur des données ou des régimes non utilisés pour formuler la modification.</w:t>
+      </w:r>
+    </w:p>
+    <w:p>
+      <w:pPr>
+        <w:pStyle w:val="ListParagraph"/>
+        <w:numPr>
+          <w:ilvl w:val="0"/>
+          <w:numId w:val="2"/>
+        </w:numPr>
+        <w:spacing w:after="80" w:line="280"/>
+      </w:pPr>
+      <w:r>
+        <w:rPr>
+          <w:rFonts w:ascii="Calibri" w:cs="Calibri" w:eastAsia="Calibri" w:hAnsi="Calibri"/>
+          <w:b/>
+          <w:bCs/>
+          <w:color w:val="1F1F1F"/>
+          <w:sz w:val="22"/>
+          <w:szCs w:val="22"/>
+        </w:rPr>
+        <w:t xml:space="preserve">Critère d'amélioration nette : </w:t>
+      </w:r>
+      <w:r>
+        <w:rPr>
+          <w:rFonts w:ascii="Calibri" w:cs="Calibri" w:eastAsia="Calibri" w:hAnsi="Calibri"/>
+          <w:color w:val="1F1F1F"/>
+          <w:sz w:val="22"/>
+          <w:szCs w:val="22"/>
+        </w:rPr>
+        <w:t xml:space="preserve">la modification doit réduire le risque ou la complexité. Une amélioration de rendement seul ne suffit pas à la justifier.</w:t>
+      </w:r>
+    </w:p>
+    <w:p>
+      <w:pPr>
+        <w:pStyle w:val="ListParagraph"/>
+        <w:numPr>
+          <w:ilvl w:val="0"/>
+          <w:numId w:val="2"/>
+        </w:numPr>
+        <w:spacing w:after="80" w:line="280"/>
+      </w:pPr>
+      <w:r>
+        <w:rPr>
+          <w:rFonts w:ascii="Calibri" w:cs="Calibri" w:eastAsia="Calibri" w:hAnsi="Calibri"/>
+          <w:b/>
+          <w:bCs/>
+          <w:color w:val="1F1F1F"/>
+          <w:sz w:val="22"/>
+          <w:szCs w:val="22"/>
+        </w:rPr>
+        <w:t xml:space="preserve">Documentation : </w:t>
+      </w:r>
+      <w:r>
+        <w:rPr>
+          <w:rFonts w:ascii="Calibri" w:cs="Calibri" w:eastAsia="Calibri" w:hAnsi="Calibri"/>
+          <w:color w:val="1F1F1F"/>
+          <w:sz w:val="22"/>
+          <w:szCs w:val="22"/>
+        </w:rPr>
+        <w:t xml:space="preserve">toute modification accompagnée d'un changelog daté, mentionnant l'hypothèse, le test, le résultat, et la décision finale.</w:t>
+      </w:r>
+    </w:p>
+    <w:p>
+      <w:pPr>
+        <w:spacing w:after="240"/>
+      </w:pPr>
+    </w:p>
+    <w:p>
+      <w:pPr>
+        <w:pStyle w:val="Heading3"/>
+        <w:spacing w:after="100" w:before="220"/>
+      </w:pPr>
+      <w:r>
+        <w:rPr>
+          <w:rFonts w:ascii="Calibri" w:cs="Calibri" w:eastAsia="Calibri" w:hAnsi="Calibri"/>
+          <w:b/>
+          <w:bCs/>
+          <w:color w:val="2E75B6"/>
+          <w:sz w:val="23"/>
+          <w:szCs w:val="23"/>
+        </w:rPr>
+        <w:t xml:space="preserve">Critère d'abandon de la stratégie</w:t>
       </w:r>
     </w:p>
     <w:p>
@@ -10214,22 +12616,78 @@
           <w:sz w:val="22"/>
           <w:szCs w:val="22"/>
         </w:rPr>
-        <w:t xml:space="preserve">Règle d'or anti-complexification : </w:t>
-      </w:r>
-      <w:r>
-        <w:rPr>
-          <w:rFonts w:ascii="Calibri" w:cs="Calibri" w:eastAsia="Calibri" w:hAnsi="Calibri"/>
-          <w:color w:val="1F1F1F"/>
-          <w:sz w:val="22"/>
-          <w:szCs w:val="22"/>
-        </w:rPr>
-        <w:t xml:space="preserve">tout ajout futur à la stratégie ou à l'infrastructure doit, soit réduire la complexité effective du système, soit améliorer significativement sa robustesse. Aucun ajout ne se justifie par la simple curiosité technique, le suivi de tendance ("il faudrait peut-être ajouter un signal RSI", "un filtre macro", "un modèle d'IA de régime") ou l'optimisation marginale. La sophistication progressive est le principal mode d'échec des stratégies systématiques personnelles.</w:t>
+        <w:t xml:space="preserve">Garde-fou ultime contre l'attachement intellectuel au système : </w:t>
+      </w:r>
+      <w:r>
+        <w:rPr>
+          <w:rFonts w:ascii="Calibri" w:cs="Calibri" w:eastAsia="Calibri" w:hAnsi="Calibri"/>
+          <w:color w:val="1F1F1F"/>
+          <w:sz w:val="22"/>
+          <w:szCs w:val="22"/>
+        </w:rPr>
+        <w:t xml:space="preserve">si après backtest rigoureux préalable ou après 5 ans de production réelle, la stratégie ne démontre pas un avantage net sur un DCA pur sur ETF World en termes de drawdown ajusté du rendement (Sharpe ratio, Sortino, ou drawdown maximal à rendement comparable), elle est purement et simplement </w:t>
+      </w:r>
+      <w:r>
+        <w:rPr>
+          <w:rFonts w:ascii="Calibri" w:cs="Calibri" w:eastAsia="Calibri" w:hAnsi="Calibri"/>
+          <w:b/>
+          <w:bCs/>
+          <w:color w:val="1F1F1F"/>
+          <w:sz w:val="22"/>
+          <w:szCs w:val="22"/>
+        </w:rPr>
+        <w:t xml:space="preserve">abandonnée</w:t>
+      </w:r>
+      <w:r>
+        <w:rPr>
+          <w:rFonts w:ascii="Calibri" w:cs="Calibri" w:eastAsia="Calibri" w:hAnsi="Calibri"/>
+          <w:color w:val="1F1F1F"/>
+          <w:sz w:val="22"/>
+          <w:szCs w:val="22"/>
+        </w:rPr>
+        <w:t xml:space="preserve"> au profit d'un DCA World passif. Aucune tentative de reparamétrage, d'ajout de signal, ou de "sauver" la stratégie n'est autorisée à ce stade.</w:t>
+      </w:r>
+    </w:p>
+    <w:p>
+      <w:pPr>
+        <w:spacing w:after="200"/>
+      </w:pPr>
+    </w:p>
+    <w:p>
+      <w:pPr>
+        <w:spacing w:after="120" w:before="0" w:line="300"/>
+      </w:pPr>
+      <w:r>
+        <w:rPr>
+          <w:rFonts w:ascii="Calibri" w:cs="Calibri" w:eastAsia="Calibri" w:hAnsi="Calibri"/>
+          <w:color w:val="1F1F1F"/>
+          <w:sz w:val="22"/>
+          <w:szCs w:val="22"/>
+        </w:rPr>
+        <w:t xml:space="preserve">Cette règle est conçue comme une protection délibérée contre le biais d'engagement : plus on a investi de temps et d'effort intellectuel dans un système, plus on devient incapable de le voir échouer objectivement. Le critère d'abandon doit être défini maintenant, à froid, avant toute donnée réelle, précisément parce qu'il sera psychologiquement très difficile à appliquer plus tard.</w:t>
       </w:r>
     </w:p>
     <w:p>
       <w:pPr>
         <w:spacing w:after="240"/>
       </w:pPr>
+    </w:p>
+    <w:p>
+      <w:pPr>
+        <w:pStyle w:val="Heading3"/>
+        <w:spacing w:after="100" w:before="220"/>
+      </w:pPr>
+      <w:r>
+        <w:rPr>
+          <w:rFonts w:ascii="Calibri" w:cs="Calibri" w:eastAsia="Calibri" w:hAnsi="Calibri"/>
+          <w:b/>
+          <w:bCs/>
+          <w:color w:val="2E75B6"/>
+          <w:sz w:val="23"/>
+          <w:szCs w:val="23"/>
+        </w:rPr>
+        <w:t xml:space="preserve">Évolutions envisagées (sous réserve des règles ci-dessus)</w:t>
+      </w:r>
     </w:p>
     <w:p>
       <w:pPr>

</xml_diff>